<commit_message>
Piece 7 - edit to page 1 and fonts
</commit_message>
<xml_diff>
--- a/Front Matter/Template/7_Front-Matter_Template-v5.docx
+++ b/Front Matter/Template/7_Front-Matter_Template-v5.docx
@@ -274,25 +274,7 @@
           <w:sz w:val="40"/>
           <w:szCs w:val="96"/>
         </w:rPr>
-        <w:t xml:space="preserve">Fung </w:t>
-      </w:r>
-      <w:proofErr w:type="spellStart"/>
-      <w:r>
-        <w:rPr>
-          <w:rFonts w:ascii="Noto Serif" w:eastAsia="Noto Serif SC" w:hAnsi="Noto Serif" w:cs="Noto Serif"/>
-          <w:sz w:val="40"/>
-          <w:szCs w:val="96"/>
-        </w:rPr>
-        <w:t>Dic</w:t>
-      </w:r>
-      <w:proofErr w:type="spellEnd"/>
-      <w:r>
-        <w:rPr>
-          <w:rFonts w:ascii="Noto Serif" w:eastAsia="Noto Serif SC" w:hAnsi="Noto Serif" w:cs="Noto Serif"/>
-          <w:sz w:val="40"/>
-          <w:szCs w:val="96"/>
-        </w:rPr>
-        <w:t>-Lun</w:t>
+        <w:t>Fung Dic-Lun</w:t>
       </w:r>
     </w:p>
     <w:p>
@@ -1023,25 +1005,7 @@
           <w:sz w:val="40"/>
           <w:szCs w:val="96"/>
         </w:rPr>
-        <w:t xml:space="preserve">Fung </w:t>
-      </w:r>
-      <w:proofErr w:type="spellStart"/>
-      <w:r>
-        <w:rPr>
-          <w:rFonts w:ascii="Noto Serif" w:eastAsia="Noto Serif SC" w:hAnsi="Noto Serif" w:cs="Noto Serif"/>
-          <w:sz w:val="40"/>
-          <w:szCs w:val="96"/>
-        </w:rPr>
-        <w:t>Dic</w:t>
-      </w:r>
-      <w:proofErr w:type="spellEnd"/>
-      <w:r>
-        <w:rPr>
-          <w:rFonts w:ascii="Noto Serif" w:eastAsia="Noto Serif SC" w:hAnsi="Noto Serif" w:cs="Noto Serif"/>
-          <w:sz w:val="40"/>
-          <w:szCs w:val="96"/>
-        </w:rPr>
-        <w:t>-Lun</w:t>
+        <w:t>Fung Dic-Lun</w:t>
       </w:r>
     </w:p>
     <w:p>
@@ -2196,19 +2160,8 @@
           <w:szCs w:val="24"/>
           <w:lang w:val="en-US"/>
         </w:rPr>
-        <w:t xml:space="preserve">Ensemble </w:t>
-      </w:r>
-      <w:proofErr w:type="spellStart"/>
-      <w:r>
-        <w:rPr>
-          <w:rFonts w:ascii="Noto Serif" w:eastAsia="Noto Serif SC" w:hAnsi="Noto Serif" w:cs="Noto Serif"/>
-          <w:sz w:val="24"/>
-          <w:szCs w:val="24"/>
-          <w:lang w:val="en-US"/>
-        </w:rPr>
-        <w:t>Gending</w:t>
-      </w:r>
-      <w:proofErr w:type="spellEnd"/>
+        <w:t>Ensemble Gending</w:t>
+      </w:r>
       <w:r>
         <w:rPr>
           <w:rFonts w:ascii="Noto Serif" w:eastAsia="Noto Serif SC" w:hAnsi="Noto Serif" w:cs="Noto Serif" w:hint="eastAsia"/>
@@ -2380,47 +2333,7 @@
           <w:szCs w:val="24"/>
           <w:lang w:val="en-US"/>
         </w:rPr>
-        <w:t xml:space="preserve">Fung </w:t>
-      </w:r>
-      <w:proofErr w:type="spellStart"/>
-      <w:r>
-        <w:rPr>
-          <w:rFonts w:ascii="Noto Serif" w:eastAsia="Noto Serif SC" w:hAnsi="Noto Serif" w:cs="Noto Serif"/>
-          <w:sz w:val="24"/>
-          <w:szCs w:val="24"/>
-          <w:lang w:val="en-US"/>
-        </w:rPr>
-        <w:t>Dic</w:t>
-      </w:r>
-      <w:proofErr w:type="spellEnd"/>
-      <w:r>
-        <w:rPr>
-          <w:rFonts w:ascii="Noto Serif" w:eastAsia="Noto Serif SC" w:hAnsi="Noto Serif" w:cs="Noto Serif"/>
-          <w:sz w:val="24"/>
-          <w:szCs w:val="24"/>
-          <w:lang w:val="en-US"/>
-        </w:rPr>
-        <w:t>-Lun is a PhD student (Music Composition) under the supervision of Prof. CHAN Hing-</w:t>
-      </w:r>
-      <w:proofErr w:type="spellStart"/>
-      <w:r>
-        <w:rPr>
-          <w:rFonts w:ascii="Noto Serif" w:eastAsia="Noto Serif SC" w:hAnsi="Noto Serif" w:cs="Noto Serif"/>
-          <w:sz w:val="24"/>
-          <w:szCs w:val="24"/>
-          <w:lang w:val="en-US"/>
-        </w:rPr>
-        <w:t>yan</w:t>
-      </w:r>
-      <w:proofErr w:type="spellEnd"/>
-      <w:r>
-        <w:rPr>
-          <w:rFonts w:ascii="Noto Serif" w:eastAsia="Noto Serif SC" w:hAnsi="Noto Serif" w:cs="Noto Serif"/>
-          <w:sz w:val="24"/>
-          <w:szCs w:val="24"/>
-          <w:lang w:val="en-US"/>
-        </w:rPr>
-        <w:t xml:space="preserve"> at the University of Hong Kong, where he received his M. Phil., and B. A. degree (Music – First Class Honors).</w:t>
+        <w:t>Fung Dic-Lun is a PhD student (Music Composition) under the supervision of Prof. CHAN Hing-yan at the University of Hong Kong, where he received his M. Phil., and B. A. degree (Music – First Class Honors).</w:t>
       </w:r>
       <w:r>
         <w:rPr>
@@ -2460,27 +2373,7 @@
           <w:szCs w:val="24"/>
           <w:lang w:val="en-US"/>
         </w:rPr>
-        <w:t xml:space="preserve">Fung has exposed to Chinese music since young, and his interest further expands into ethnic music. Being well-known for composing with mixed use of ethnic and Western instruments, and unconventional instrumentations, he has achieved several international awards: 2nd prize in Sayat Nova International Composition Competition (2014), </w:t>
-      </w:r>
-      <w:proofErr w:type="spellStart"/>
-      <w:r>
-        <w:rPr>
-          <w:rFonts w:ascii="Noto Serif" w:eastAsia="Noto Serif SC" w:hAnsi="Noto Serif" w:cs="Noto Serif"/>
-          <w:sz w:val="24"/>
-          <w:szCs w:val="24"/>
-          <w:lang w:val="en-US"/>
-        </w:rPr>
-        <w:t>honourable</w:t>
-      </w:r>
-      <w:proofErr w:type="spellEnd"/>
-      <w:r>
-        <w:rPr>
-          <w:rFonts w:ascii="Noto Serif" w:eastAsia="Noto Serif SC" w:hAnsi="Noto Serif" w:cs="Noto Serif"/>
-          <w:sz w:val="24"/>
-          <w:szCs w:val="24"/>
-          <w:lang w:val="en-US"/>
-        </w:rPr>
-        <w:t xml:space="preserve"> mention in Atlas Ensemble Composition Competition (2014), 3rd runner-up in the 10th Luxembourg Sinfonietta International Composition Prize (2013), etc. His works are heard in both international and local concerts, including Croatia, Germany, the Netherlands, U. S. A., Russia, South Korea, and Indonesia; also, in renowned festivals ISCM – WMD and International Gaudeamus Music Week.</w:t>
+        <w:t>Fung has exposed to Chinese music since young, and his interest further expands into ethnic music. Being well-known for composing with mixed use of ethnic and Western instruments, and unconventional instrumentations, he has achieved several international awards: 2nd prize in Sayat Nova International Composition Competition (2014), honourable mention in Atlas Ensemble Composition Competition (2014), 3rd runner-up in the 10th Luxembourg Sinfonietta International Composition Prize (2013), etc. His works are heard in both international and local concerts, including Croatia, Germany, the Netherlands, U. S. A., Russia, South Korea, and Indonesia; also, in renowned festivals ISCM – WMD and International Gaudeamus Music Week.</w:t>
       </w:r>
       <w:r>
         <w:rPr>
@@ -2520,67 +2413,7 @@
           <w:szCs w:val="24"/>
           <w:lang w:val="en-US"/>
         </w:rPr>
-        <w:t xml:space="preserve">Fung’s works have been performed by </w:t>
-      </w:r>
-      <w:proofErr w:type="spellStart"/>
-      <w:r>
-        <w:rPr>
-          <w:rFonts w:ascii="Noto Serif" w:eastAsia="Noto Serif SC" w:hAnsi="Noto Serif" w:cs="Noto Serif"/>
-          <w:sz w:val="24"/>
-          <w:szCs w:val="24"/>
-          <w:lang w:val="en-US"/>
-        </w:rPr>
-        <w:t>guanzi</w:t>
-      </w:r>
-      <w:proofErr w:type="spellEnd"/>
-      <w:r>
-        <w:rPr>
-          <w:rFonts w:ascii="Noto Serif" w:eastAsia="Noto Serif SC" w:hAnsi="Noto Serif" w:cs="Noto Serif"/>
-          <w:sz w:val="24"/>
-          <w:szCs w:val="24"/>
-          <w:lang w:val="en-US"/>
-        </w:rPr>
-        <w:t xml:space="preserve"> virtuoso Guo Ya-</w:t>
-      </w:r>
-      <w:proofErr w:type="spellStart"/>
-      <w:r>
-        <w:rPr>
-          <w:rFonts w:ascii="Noto Serif" w:eastAsia="Noto Serif SC" w:hAnsi="Noto Serif" w:cs="Noto Serif"/>
-          <w:sz w:val="24"/>
-          <w:szCs w:val="24"/>
-          <w:lang w:val="en-US"/>
-        </w:rPr>
-        <w:t>zhi</w:t>
-      </w:r>
-      <w:proofErr w:type="spellEnd"/>
-      <w:r>
-        <w:rPr>
-          <w:rFonts w:ascii="Noto Serif" w:eastAsia="Noto Serif SC" w:hAnsi="Noto Serif" w:cs="Noto Serif"/>
-          <w:sz w:val="24"/>
-          <w:szCs w:val="24"/>
-          <w:lang w:val="en-US"/>
-        </w:rPr>
-        <w:t xml:space="preserve">, 4 Gig Heads Percussion Group, Ensemble </w:t>
-      </w:r>
-      <w:proofErr w:type="spellStart"/>
-      <w:r>
-        <w:rPr>
-          <w:rFonts w:ascii="Noto Serif" w:eastAsia="Noto Serif SC" w:hAnsi="Noto Serif" w:cs="Noto Serif"/>
-          <w:sz w:val="24"/>
-          <w:szCs w:val="24"/>
-          <w:lang w:val="en-US"/>
-        </w:rPr>
-        <w:t>Gending</w:t>
-      </w:r>
-      <w:proofErr w:type="spellEnd"/>
-      <w:r>
-        <w:rPr>
-          <w:rFonts w:ascii="Noto Serif" w:eastAsia="Noto Serif SC" w:hAnsi="Noto Serif" w:cs="Noto Serif"/>
-          <w:sz w:val="24"/>
-          <w:szCs w:val="24"/>
-          <w:lang w:val="en-US"/>
-        </w:rPr>
-        <w:t>, HRT Tamburitza Orchestra, Atlas Ensemble, International Ensemble Modern Academy, Hong Kong New Music Ensemble, Hong Kong Chinese Orchestra, Luxembourg Sinfonietta, and Ensemble Proton Bern.  As the only composer from Hong Kong, FUNG is invited to write a new work for EXPO Milano 2015’s project “Feeding Music.”</w:t>
+        <w:t>Fung’s works have been performed by guanzi virtuoso Guo Ya-zhi, 4 Gig Heads Percussion Group, Ensemble Gending, HRT Tamburitza Orchestra, Atlas Ensemble, International Ensemble Modern Academy, Hong Kong New Music Ensemble, Hong Kong Chinese Orchestra, Luxembourg Sinfonietta, and Ensemble Proton Bern.  As the only composer from Hong Kong, FUNG is invited to write a new work for EXPO Milano 2015’s project “Feeding Music.”</w:t>
       </w:r>
     </w:p>
     <w:p>
@@ -2888,7 +2721,6 @@
         </w:rPr>
         <w:t xml:space="preserve">The traditional Cantonese lion dance is well known for its sophisticated and technical demanding gestures. This composition draws inspiration from this gorgeous tradition, using musical materials to depict various elements in the lion dance. The melodic materials are derived from the Cantonese tune </w:t>
       </w:r>
-      <w:proofErr w:type="spellStart"/>
       <w:r>
         <w:rPr>
           <w:rFonts w:ascii="Noto Serif" w:eastAsia="Noto Serif SC" w:hAnsi="Noto Serif" w:cs="Noto Serif"/>
@@ -2900,7 +2732,6 @@
         </w:rPr>
         <w:t>Singsi</w:t>
       </w:r>
-      <w:proofErr w:type="spellEnd"/>
       <w:r>
         <w:rPr>
           <w:rFonts w:ascii="Noto Serif" w:eastAsia="Noto Serif SC" w:hAnsi="Noto Serif" w:cs="Noto Serif"/>
@@ -2910,7 +2741,6 @@
         </w:rPr>
         <w:t xml:space="preserve"> (literally “Awakening of the Lion/Lion Dance”). The original melody is segmented. Through the traditional Chinese composing technique “slowing down and adding flowers,” and “melodic decoration,” the new materials are constructed. This composition closely follows the structure of a traditional pipa piece. Apart from having </w:t>
       </w:r>
-      <w:proofErr w:type="spellStart"/>
       <w:r>
         <w:rPr>
           <w:rFonts w:ascii="Noto Serif" w:eastAsia="Noto Serif SC" w:hAnsi="Noto Serif" w:cs="Noto Serif"/>
@@ -2922,7 +2752,6 @@
         </w:rPr>
         <w:t>flavours</w:t>
       </w:r>
-      <w:proofErr w:type="spellEnd"/>
       <w:r>
         <w:rPr>
           <w:rFonts w:ascii="Noto Serif" w:eastAsia="Noto Serif SC" w:hAnsi="Noto Serif" w:cs="Noto Serif"/>
@@ -2932,7 +2761,6 @@
         </w:rPr>
         <w:t xml:space="preserve"> from both </w:t>
       </w:r>
-      <w:proofErr w:type="spellStart"/>
       <w:r>
         <w:rPr>
           <w:rFonts w:ascii="Noto Serif" w:eastAsia="Noto Serif SC" w:hAnsi="Noto Serif" w:cs="Noto Serif"/>
@@ -2944,7 +2772,6 @@
         </w:rPr>
         <w:t>wenqu</w:t>
       </w:r>
-      <w:proofErr w:type="spellEnd"/>
       <w:r>
         <w:rPr>
           <w:rFonts w:ascii="Noto Serif" w:eastAsia="Noto Serif SC" w:hAnsi="Noto Serif" w:cs="Noto Serif"/>
@@ -2954,7 +2781,6 @@
         </w:rPr>
         <w:t xml:space="preserve"> and </w:t>
       </w:r>
-      <w:proofErr w:type="spellStart"/>
       <w:r>
         <w:rPr>
           <w:rFonts w:ascii="Noto Serif" w:eastAsia="Noto Serif SC" w:hAnsi="Noto Serif" w:cs="Noto Serif"/>
@@ -2966,7 +2792,6 @@
         </w:rPr>
         <w:t>wuqu</w:t>
       </w:r>
-      <w:proofErr w:type="spellEnd"/>
       <w:r>
         <w:rPr>
           <w:rFonts w:ascii="Noto Serif" w:eastAsia="Noto Serif SC" w:hAnsi="Noto Serif" w:cs="Noto Serif"/>
@@ -2976,7 +2801,6 @@
         </w:rPr>
         <w:t xml:space="preserve">, the musical flow follows a “qi – </w:t>
       </w:r>
-      <w:proofErr w:type="spellStart"/>
       <w:r>
         <w:rPr>
           <w:rFonts w:ascii="Noto Serif" w:eastAsia="Noto Serif SC" w:hAnsi="Noto Serif" w:cs="Noto Serif"/>
@@ -2988,7 +2812,6 @@
         </w:rPr>
         <w:t>cheng</w:t>
       </w:r>
-      <w:proofErr w:type="spellEnd"/>
       <w:r>
         <w:rPr>
           <w:rFonts w:ascii="Noto Serif" w:eastAsia="Noto Serif SC" w:hAnsi="Noto Serif" w:cs="Noto Serif"/>
@@ -2998,7 +2821,6 @@
         </w:rPr>
         <w:t xml:space="preserve">- </w:t>
       </w:r>
-      <w:proofErr w:type="spellStart"/>
       <w:r>
         <w:rPr>
           <w:rFonts w:ascii="Noto Serif" w:eastAsia="Noto Serif SC" w:hAnsi="Noto Serif" w:cs="Noto Serif"/>
@@ -3010,7 +2832,6 @@
         </w:rPr>
         <w:t>zhuan</w:t>
       </w:r>
-      <w:proofErr w:type="spellEnd"/>
       <w:r>
         <w:rPr>
           <w:rFonts w:ascii="Noto Serif" w:eastAsia="Noto Serif SC" w:hAnsi="Noto Serif" w:cs="Noto Serif"/>
@@ -3095,27 +2916,7 @@
           <w:szCs w:val="24"/>
           <w:lang w:val="en-US"/>
         </w:rPr>
-        <w:t xml:space="preserve"> I (</w:t>
-      </w:r>
-      <w:proofErr w:type="spellStart"/>
-      <w:r>
-        <w:rPr>
-          <w:rFonts w:ascii="Noto Serif" w:eastAsia="Noto Serif SC" w:hAnsi="Noto Serif" w:cs="Noto Serif"/>
-          <w:sz w:val="24"/>
-          <w:szCs w:val="24"/>
-          <w:lang w:val="en-US"/>
-        </w:rPr>
-        <w:t>Bangdi</w:t>
-      </w:r>
-      <w:proofErr w:type="spellEnd"/>
-      <w:r>
-        <w:rPr>
-          <w:rFonts w:ascii="Noto Serif" w:eastAsia="Noto Serif SC" w:hAnsi="Noto Serif" w:cs="Noto Serif"/>
-          <w:sz w:val="24"/>
-          <w:szCs w:val="24"/>
-          <w:lang w:val="en-US"/>
-        </w:rPr>
-        <w:t xml:space="preserve"> I – </w:t>
+        <w:t xml:space="preserve"> I (Bangdi I – </w:t>
       </w:r>
       <w:r>
         <w:rPr>
@@ -3189,27 +2990,7 @@
           <w:szCs w:val="24"/>
           <w:lang w:val="en-US"/>
         </w:rPr>
-        <w:t xml:space="preserve"> II (</w:t>
-      </w:r>
-      <w:proofErr w:type="spellStart"/>
-      <w:r>
-        <w:rPr>
-          <w:rFonts w:ascii="Noto Serif" w:eastAsia="Noto Serif SC" w:hAnsi="Noto Serif" w:cs="Noto Serif"/>
-          <w:sz w:val="24"/>
-          <w:szCs w:val="24"/>
-          <w:lang w:val="en-US"/>
-        </w:rPr>
-        <w:t>Bangdi</w:t>
-      </w:r>
-      <w:proofErr w:type="spellEnd"/>
-      <w:r>
-        <w:rPr>
-          <w:rFonts w:ascii="Noto Serif" w:eastAsia="Noto Serif SC" w:hAnsi="Noto Serif" w:cs="Noto Serif"/>
-          <w:sz w:val="24"/>
-          <w:szCs w:val="24"/>
-          <w:lang w:val="en-US"/>
-        </w:rPr>
-        <w:t xml:space="preserve"> II – G</w:t>
+        <w:t xml:space="preserve"> II (Bangdi II – G</w:t>
       </w:r>
       <w:r>
         <w:rPr>
@@ -3256,27 +3037,7 @@
           <w:szCs w:val="24"/>
           <w:lang w:val="en-US"/>
         </w:rPr>
-        <w:t xml:space="preserve"> (</w:t>
-      </w:r>
-      <w:proofErr w:type="spellStart"/>
-      <w:r>
-        <w:rPr>
-          <w:rFonts w:ascii="Noto Serif" w:eastAsia="Noto Serif SC" w:hAnsi="Noto Serif" w:cs="Noto Serif"/>
-          <w:sz w:val="24"/>
-          <w:szCs w:val="24"/>
-          <w:lang w:val="en-US"/>
-        </w:rPr>
-        <w:t>Qudi</w:t>
-      </w:r>
-      <w:proofErr w:type="spellEnd"/>
-      <w:r>
-        <w:rPr>
-          <w:rFonts w:ascii="Noto Serif" w:eastAsia="Noto Serif SC" w:hAnsi="Noto Serif" w:cs="Noto Serif"/>
-          <w:sz w:val="24"/>
-          <w:szCs w:val="24"/>
-          <w:lang w:val="en-US"/>
-        </w:rPr>
-        <w:t>)</w:t>
+        <w:t xml:space="preserve"> (Qudi)</w:t>
       </w:r>
     </w:p>
     <w:p>
@@ -3305,27 +3066,7 @@
           <w:szCs w:val="24"/>
           <w:lang w:val="en-US"/>
         </w:rPr>
-        <w:t xml:space="preserve"> I, II (</w:t>
-      </w:r>
-      <w:proofErr w:type="spellStart"/>
-      <w:r>
-        <w:rPr>
-          <w:rFonts w:ascii="Noto Serif" w:eastAsia="Noto Serif SC" w:hAnsi="Noto Serif" w:cs="Noto Serif"/>
-          <w:sz w:val="24"/>
-          <w:szCs w:val="24"/>
-          <w:lang w:val="en-US"/>
-        </w:rPr>
-        <w:t>Xindi</w:t>
-      </w:r>
-      <w:proofErr w:type="spellEnd"/>
-      <w:r>
-        <w:rPr>
-          <w:rFonts w:ascii="Noto Serif" w:eastAsia="Noto Serif SC" w:hAnsi="Noto Serif" w:cs="Noto Serif"/>
-          <w:sz w:val="24"/>
-          <w:szCs w:val="24"/>
-          <w:lang w:val="en-US"/>
-        </w:rPr>
-        <w:t xml:space="preserve"> I, II)</w:t>
+        <w:t xml:space="preserve"> I, II (Xindi I, II)</w:t>
       </w:r>
     </w:p>
     <w:p>
@@ -3365,27 +3106,7 @@
           <w:szCs w:val="24"/>
           <w:lang w:val="en-US"/>
         </w:rPr>
-        <w:t xml:space="preserve"> I, II (</w:t>
-      </w:r>
-      <w:proofErr w:type="spellStart"/>
-      <w:r>
-        <w:rPr>
-          <w:rFonts w:ascii="Noto Serif" w:eastAsia="Noto Serif SC" w:hAnsi="Noto Serif" w:cs="Noto Serif"/>
-          <w:sz w:val="24"/>
-          <w:szCs w:val="24"/>
-          <w:lang w:val="en-US"/>
-        </w:rPr>
-        <w:t>Gaoyin</w:t>
-      </w:r>
-      <w:proofErr w:type="spellEnd"/>
-      <w:r>
-        <w:rPr>
-          <w:rFonts w:ascii="Noto Serif" w:eastAsia="Noto Serif SC" w:hAnsi="Noto Serif" w:cs="Noto Serif"/>
-          <w:sz w:val="24"/>
-          <w:szCs w:val="24"/>
-          <w:lang w:val="en-US"/>
-        </w:rPr>
-        <w:t xml:space="preserve"> Sheng I, II)</w:t>
+        <w:t xml:space="preserve"> I, II (Gaoyin Sheng I, II)</w:t>
       </w:r>
     </w:p>
     <w:p>
@@ -3414,27 +3135,7 @@
           <w:szCs w:val="24"/>
           <w:lang w:val="en-US"/>
         </w:rPr>
-        <w:t xml:space="preserve"> I, II (</w:t>
-      </w:r>
-      <w:proofErr w:type="spellStart"/>
-      <w:r>
-        <w:rPr>
-          <w:rFonts w:ascii="Noto Serif" w:eastAsia="Noto Serif SC" w:hAnsi="Noto Serif" w:cs="Noto Serif"/>
-          <w:sz w:val="24"/>
-          <w:szCs w:val="24"/>
-          <w:lang w:val="en-US"/>
-        </w:rPr>
-        <w:t>Zhongyin</w:t>
-      </w:r>
-      <w:proofErr w:type="spellEnd"/>
-      <w:r>
-        <w:rPr>
-          <w:rFonts w:ascii="Noto Serif" w:eastAsia="Noto Serif SC" w:hAnsi="Noto Serif" w:cs="Noto Serif"/>
-          <w:sz w:val="24"/>
-          <w:szCs w:val="24"/>
-          <w:lang w:val="en-US"/>
-        </w:rPr>
-        <w:t xml:space="preserve"> Sheng I, II)</w:t>
+        <w:t xml:space="preserve"> I, II (Zhongyin Sheng I, II)</w:t>
       </w:r>
     </w:p>
     <w:p>
@@ -3503,1435 +3204,1001 @@
           <w:szCs w:val="24"/>
           <w:lang w:val="en-US"/>
         </w:rPr>
-        <w:t xml:space="preserve"> I, II (</w:t>
-      </w:r>
-      <w:proofErr w:type="spellStart"/>
-      <w:r>
-        <w:rPr>
-          <w:rFonts w:ascii="Noto Serif" w:eastAsia="Noto Serif SC" w:hAnsi="Noto Serif" w:cs="Noto Serif"/>
-          <w:sz w:val="24"/>
-          <w:szCs w:val="24"/>
-          <w:lang w:val="en-US"/>
-        </w:rPr>
-        <w:t>Gaoyin</w:t>
-      </w:r>
-      <w:proofErr w:type="spellEnd"/>
-      <w:r>
-        <w:rPr>
-          <w:rFonts w:ascii="Noto Serif" w:eastAsia="Noto Serif SC" w:hAnsi="Noto Serif" w:cs="Noto Serif"/>
-          <w:sz w:val="24"/>
-          <w:szCs w:val="24"/>
-          <w:lang w:val="en-US"/>
+        <w:t xml:space="preserve"> I, II (Gaoyin Suona I, II)</w:t>
+      </w:r>
+    </w:p>
+    <w:p>
+      <w:pPr>
+        <w:jc w:val="right"/>
+        <w:rPr>
+          <w:rFonts w:ascii="Noto Serif" w:eastAsia="Noto Serif SC" w:hAnsi="Noto Serif" w:cs="Noto Serif"/>
+          <w:sz w:val="24"/>
+          <w:szCs w:val="24"/>
+          <w:lang w:val="en-US"/>
+        </w:rPr>
+      </w:pPr>
+      <w:r>
+        <w:rPr>
+          <w:rFonts w:ascii="Noto Serif" w:eastAsia="Noto Serif SC" w:hAnsi="Noto Serif" w:cs="Noto Serif" w:hint="eastAsia"/>
+          <w:sz w:val="24"/>
+          <w:szCs w:val="24"/>
+          <w:lang w:val="en-US"/>
+        </w:rPr>
+        <w:t>中音加键唢吶</w:t>
+      </w:r>
+      <w:r>
+        <w:rPr>
+          <w:rFonts w:ascii="Noto Serif" w:eastAsia="Noto Serif SC" w:hAnsi="Noto Serif" w:cs="Noto Serif"/>
+          <w:sz w:val="24"/>
+          <w:szCs w:val="24"/>
+          <w:lang w:val="en-US"/>
+        </w:rPr>
+        <w:t xml:space="preserve"> I, II (Zhongyin Suona I, II)</w:t>
+      </w:r>
+    </w:p>
+    <w:p>
+      <w:pPr>
+        <w:jc w:val="right"/>
+        <w:rPr>
+          <w:rFonts w:ascii="Noto Serif" w:eastAsia="Noto Serif SC" w:hAnsi="Noto Serif" w:cs="Noto Serif"/>
+          <w:sz w:val="24"/>
+          <w:szCs w:val="24"/>
+          <w:lang w:val="en-US"/>
+        </w:rPr>
+      </w:pPr>
+      <w:r>
+        <w:rPr>
+          <w:rFonts w:ascii="Noto Serif" w:eastAsia="Noto Serif SC" w:hAnsi="Noto Serif" w:cs="Noto Serif" w:hint="eastAsia"/>
+          <w:sz w:val="24"/>
+          <w:szCs w:val="24"/>
+          <w:lang w:val="en-US"/>
+        </w:rPr>
+        <w:t>低音加键唢吶</w:t>
+      </w:r>
+      <w:r>
+        <w:rPr>
+          <w:rFonts w:ascii="Noto Serif" w:eastAsia="Noto Serif SC" w:hAnsi="Noto Serif" w:cs="Noto Serif"/>
+          <w:sz w:val="24"/>
+          <w:szCs w:val="24"/>
+          <w:lang w:val="en-US"/>
+        </w:rPr>
+        <w:t xml:space="preserve"> (Diyin Suona)</w:t>
+      </w:r>
+    </w:p>
+    <w:p>
+      <w:pPr>
+        <w:jc w:val="right"/>
+        <w:rPr>
+          <w:rFonts w:ascii="Noto Serif" w:eastAsia="Noto Serif SC" w:hAnsi="Noto Serif" w:cs="Noto Serif"/>
+          <w:sz w:val="24"/>
+          <w:szCs w:val="24"/>
+          <w:lang w:val="en-US"/>
+        </w:rPr>
+      </w:pPr>
+    </w:p>
+    <w:p>
+      <w:pPr>
+        <w:jc w:val="right"/>
+        <w:rPr>
+          <w:rFonts w:ascii="Noto Serif" w:eastAsia="Noto Serif SC" w:hAnsi="Noto Serif" w:cs="Noto Serif"/>
+          <w:sz w:val="24"/>
+          <w:szCs w:val="24"/>
+          <w:lang w:val="en-GB"/>
+        </w:rPr>
+      </w:pPr>
+      <w:r>
+        <w:rPr>
+          <w:rFonts w:ascii="Noto Serif" w:eastAsia="Noto Serif SC" w:hAnsi="Noto Serif" w:cs="Noto Serif" w:hint="eastAsia"/>
+          <w:sz w:val="24"/>
+          <w:szCs w:val="24"/>
+          <w:lang w:val="en-GB"/>
+        </w:rPr>
+        <w:t>中音加键管</w:t>
+      </w:r>
+      <w:r>
+        <w:rPr>
+          <w:rFonts w:ascii="Noto Serif" w:eastAsia="Noto Serif SC" w:hAnsi="Noto Serif" w:cs="Noto Serif"/>
+          <w:sz w:val="24"/>
+          <w:szCs w:val="24"/>
+          <w:lang w:val="en-GB"/>
+        </w:rPr>
+        <w:t xml:space="preserve"> (Zhongyin Jiajian Guan)</w:t>
+      </w:r>
+    </w:p>
+    <w:p>
+      <w:pPr>
+        <w:jc w:val="right"/>
+        <w:rPr>
+          <w:rFonts w:ascii="Noto Serif" w:eastAsia="Noto Serif SC" w:hAnsi="Noto Serif" w:cs="Noto Serif"/>
+          <w:sz w:val="24"/>
+          <w:szCs w:val="24"/>
+          <w:lang w:val="en-GB"/>
+        </w:rPr>
+      </w:pPr>
+      <w:r>
+        <w:rPr>
+          <w:rFonts w:ascii="Noto Serif" w:eastAsia="Noto Serif SC" w:hAnsi="Noto Serif" w:cs="Noto Serif" w:hint="eastAsia"/>
+          <w:sz w:val="24"/>
+          <w:szCs w:val="24"/>
+          <w:lang w:val="en-GB"/>
+        </w:rPr>
+        <w:t>低音加键管</w:t>
+      </w:r>
+      <w:r>
+        <w:rPr>
+          <w:rFonts w:ascii="Noto Serif" w:eastAsia="Noto Serif SC" w:hAnsi="Noto Serif" w:cs="Noto Serif"/>
+          <w:sz w:val="24"/>
+          <w:szCs w:val="24"/>
+          <w:lang w:val="en-GB"/>
+        </w:rPr>
+        <w:t xml:space="preserve"> (Diyin Jiajian Guan)</w:t>
+      </w:r>
+    </w:p>
+    <w:p>
+      <w:pPr>
+        <w:jc w:val="right"/>
+        <w:rPr>
+          <w:rFonts w:ascii="Noto Serif" w:eastAsia="Noto Serif SC" w:hAnsi="Noto Serif" w:cs="Noto Serif"/>
+          <w:sz w:val="24"/>
+          <w:szCs w:val="24"/>
+          <w:lang w:val="en-US"/>
+        </w:rPr>
+      </w:pPr>
+      <w:r>
+        <w:rPr>
+          <w:rFonts w:ascii="Noto Serif" w:eastAsia="Noto Serif SC" w:hAnsi="Noto Serif" w:cs="Noto Serif" w:hint="eastAsia"/>
+          <w:sz w:val="24"/>
+          <w:szCs w:val="24"/>
+          <w:lang w:val="en-GB"/>
+        </w:rPr>
+        <w:t>倍低音加键管</w:t>
+      </w:r>
+      <w:r>
+        <w:rPr>
+          <w:rFonts w:ascii="Noto Serif" w:eastAsia="Noto Serif SC" w:hAnsi="Noto Serif" w:cs="Noto Serif"/>
+          <w:sz w:val="24"/>
+          <w:szCs w:val="24"/>
+          <w:lang w:val="en-GB"/>
+        </w:rPr>
+        <w:t xml:space="preserve"> (Bei Diyin Jiajian Guan)</w:t>
+      </w:r>
+    </w:p>
+    <w:p>
+      <w:pPr>
+        <w:jc w:val="right"/>
+        <w:rPr>
+          <w:rFonts w:ascii="Noto Serif" w:eastAsia="Noto Serif SC" w:hAnsi="Noto Serif" w:cs="Noto Serif"/>
+          <w:sz w:val="24"/>
+          <w:szCs w:val="24"/>
+          <w:lang w:val="en-US"/>
+        </w:rPr>
+      </w:pPr>
+    </w:p>
+    <w:p>
+      <w:pPr>
+        <w:jc w:val="right"/>
+        <w:rPr>
+          <w:rFonts w:ascii="Noto Serif" w:eastAsia="Noto Serif SC" w:hAnsi="Noto Serif" w:cs="Noto Serif"/>
+          <w:sz w:val="24"/>
+          <w:szCs w:val="24"/>
+          <w:lang w:val="en-US"/>
+        </w:rPr>
+      </w:pPr>
+      <w:r>
+        <w:rPr>
+          <w:rFonts w:ascii="Noto Serif" w:eastAsia="Noto Serif SC" w:hAnsi="Noto Serif" w:cs="Noto Serif" w:hint="eastAsia"/>
+          <w:sz w:val="24"/>
+          <w:szCs w:val="24"/>
+          <w:lang w:val="en-US"/>
+        </w:rPr>
+        <w:t>扬琴</w:t>
+      </w:r>
+      <w:r>
+        <w:rPr>
+          <w:rFonts w:ascii="Noto Serif" w:eastAsia="Noto Serif SC" w:hAnsi="Noto Serif" w:cs="Noto Serif"/>
+          <w:sz w:val="24"/>
+          <w:szCs w:val="24"/>
+          <w:lang w:val="en-US"/>
+        </w:rPr>
+        <w:t xml:space="preserve"> I, II (Yangqin I, II)</w:t>
+      </w:r>
+    </w:p>
+    <w:p>
+      <w:pPr>
+        <w:jc w:val="right"/>
+        <w:rPr>
+          <w:rFonts w:ascii="Noto Serif" w:eastAsia="Noto Serif SC" w:hAnsi="Noto Serif" w:cs="Noto Serif"/>
+          <w:sz w:val="24"/>
+          <w:szCs w:val="24"/>
+          <w:lang w:val="en-US"/>
+        </w:rPr>
+      </w:pPr>
+      <w:r>
+        <w:rPr>
+          <w:rFonts w:ascii="Noto Serif" w:eastAsia="Noto Serif SC" w:hAnsi="Noto Serif" w:cs="Noto Serif" w:hint="eastAsia"/>
+          <w:sz w:val="24"/>
+          <w:szCs w:val="24"/>
+          <w:lang w:val="en-US"/>
+        </w:rPr>
+        <w:t>琵琶</w:t>
+      </w:r>
+      <w:r>
+        <w:rPr>
+          <w:rFonts w:ascii="Noto Serif" w:eastAsia="Noto Serif SC" w:hAnsi="Noto Serif" w:cs="Noto Serif"/>
+          <w:sz w:val="24"/>
+          <w:szCs w:val="24"/>
+          <w:lang w:val="en-US"/>
+        </w:rPr>
+        <w:t xml:space="preserve"> I-IV (Pipa I-IV)</w:t>
+      </w:r>
+    </w:p>
+    <w:p>
+      <w:pPr>
+        <w:jc w:val="right"/>
+        <w:rPr>
+          <w:rFonts w:ascii="Noto Serif" w:eastAsia="Noto Serif SC" w:hAnsi="Noto Serif" w:cs="Noto Serif"/>
+          <w:sz w:val="24"/>
+          <w:szCs w:val="24"/>
+          <w:lang w:val="en-US"/>
+        </w:rPr>
+      </w:pPr>
+      <w:r>
+        <w:rPr>
+          <w:rFonts w:ascii="Noto Serif" w:eastAsia="Noto Serif SC" w:hAnsi="Noto Serif" w:cs="Noto Serif" w:hint="eastAsia"/>
+          <w:sz w:val="24"/>
+          <w:szCs w:val="24"/>
+          <w:lang w:val="en-GB"/>
+        </w:rPr>
+        <w:t>高音阮</w:t>
+      </w:r>
+      <w:r>
+        <w:rPr>
+          <w:rFonts w:ascii="Noto Serif" w:eastAsia="Noto Serif SC" w:hAnsi="Noto Serif" w:cs="Noto Serif"/>
+          <w:sz w:val="24"/>
+          <w:szCs w:val="24"/>
+          <w:lang w:val="en-GB"/>
+        </w:rPr>
+        <w:t xml:space="preserve"> I, II (Gaoyin Ruan I, II)</w:t>
+      </w:r>
+    </w:p>
+    <w:p>
+      <w:pPr>
+        <w:jc w:val="right"/>
+        <w:rPr>
+          <w:rFonts w:ascii="Noto Serif" w:eastAsia="Noto Serif SC" w:hAnsi="Noto Serif" w:cs="Noto Serif"/>
+          <w:sz w:val="24"/>
+          <w:szCs w:val="24"/>
+          <w:lang w:val="en-US"/>
+        </w:rPr>
+      </w:pPr>
+      <w:r>
+        <w:rPr>
+          <w:rFonts w:ascii="Noto Serif" w:eastAsia="Noto Serif SC" w:hAnsi="Noto Serif" w:cs="Noto Serif" w:hint="eastAsia"/>
+          <w:sz w:val="24"/>
+          <w:szCs w:val="24"/>
+          <w:lang w:val="en-US"/>
+        </w:rPr>
+        <w:t>中阮</w:t>
+      </w:r>
+      <w:r>
+        <w:rPr>
+          <w:rFonts w:ascii="Noto Serif" w:eastAsia="Noto Serif SC" w:hAnsi="Noto Serif" w:cs="Noto Serif"/>
+          <w:sz w:val="24"/>
+          <w:szCs w:val="24"/>
+          <w:lang w:val="en-US"/>
+        </w:rPr>
+        <w:t xml:space="preserve"> I-VI (Zhongruan I-VI)</w:t>
+      </w:r>
+    </w:p>
+    <w:p>
+      <w:pPr>
+        <w:jc w:val="right"/>
+        <w:rPr>
+          <w:rFonts w:ascii="Noto Serif" w:eastAsia="Noto Serif SC" w:hAnsi="Noto Serif" w:cs="Noto Serif"/>
+          <w:sz w:val="24"/>
+          <w:szCs w:val="24"/>
+          <w:lang w:val="en-US"/>
+        </w:rPr>
+      </w:pPr>
+      <w:r>
+        <w:rPr>
+          <w:rFonts w:ascii="Noto Serif" w:eastAsia="Noto Serif SC" w:hAnsi="Noto Serif" w:cs="Noto Serif" w:hint="eastAsia"/>
+          <w:sz w:val="24"/>
+          <w:szCs w:val="24"/>
+          <w:lang w:val="en-US"/>
+        </w:rPr>
+        <w:t>大阮</w:t>
+      </w:r>
+      <w:r>
+        <w:rPr>
+          <w:rFonts w:ascii="Noto Serif" w:eastAsia="Noto Serif SC" w:hAnsi="Noto Serif" w:cs="Noto Serif"/>
+          <w:sz w:val="24"/>
+          <w:szCs w:val="24"/>
+          <w:lang w:val="en-US"/>
+        </w:rPr>
+        <w:t xml:space="preserve"> I, II (Daruan I, II)</w:t>
+      </w:r>
+    </w:p>
+    <w:p>
+      <w:pPr>
+        <w:jc w:val="right"/>
+        <w:rPr>
+          <w:rFonts w:ascii="Noto Serif" w:eastAsia="Noto Serif SC" w:hAnsi="Noto Serif" w:cs="Noto Serif"/>
+          <w:sz w:val="24"/>
+          <w:szCs w:val="24"/>
+          <w:lang w:val="en-US"/>
+        </w:rPr>
+      </w:pPr>
+      <w:r>
+        <w:rPr>
+          <w:rFonts w:ascii="Noto Serif" w:eastAsia="Noto Serif SC" w:hAnsi="Noto Serif" w:cs="Noto Serif" w:hint="eastAsia"/>
+          <w:sz w:val="24"/>
+          <w:szCs w:val="24"/>
+          <w:lang w:val="en-US"/>
+        </w:rPr>
+        <w:t>古筝</w:t>
+      </w:r>
+      <w:r>
+        <w:rPr>
+          <w:rFonts w:ascii="Noto Serif" w:eastAsia="Noto Serif SC" w:hAnsi="Noto Serif" w:cs="Noto Serif"/>
+          <w:sz w:val="24"/>
+          <w:szCs w:val="24"/>
+          <w:lang w:val="en-US"/>
+        </w:rPr>
+        <w:t xml:space="preserve"> (Guzheng)</w:t>
+      </w:r>
+    </w:p>
+    <w:p>
+      <w:pPr>
+        <w:jc w:val="right"/>
+        <w:rPr>
+          <w:rFonts w:ascii="Noto Serif" w:eastAsia="Noto Serif SC" w:hAnsi="Noto Serif" w:cs="Noto Serif"/>
+          <w:sz w:val="24"/>
+          <w:szCs w:val="24"/>
+          <w:lang w:val="en-US"/>
+        </w:rPr>
+      </w:pPr>
+    </w:p>
+    <w:p>
+      <w:pPr>
+        <w:jc w:val="right"/>
+        <w:rPr>
+          <w:rFonts w:ascii="Noto Serif" w:eastAsia="Noto Serif SC" w:hAnsi="Noto Serif" w:cs="Noto Serif"/>
+          <w:sz w:val="24"/>
+          <w:szCs w:val="24"/>
+          <w:lang w:val="en-US"/>
+        </w:rPr>
+      </w:pPr>
+      <w:r>
+        <w:rPr>
+          <w:rFonts w:ascii="Noto Serif" w:eastAsia="Noto Serif SC" w:hAnsi="Noto Serif" w:cs="Noto Serif" w:hint="eastAsia"/>
+          <w:sz w:val="24"/>
+          <w:szCs w:val="24"/>
+          <w:lang w:val="en-US"/>
+        </w:rPr>
+        <w:t>定音鼓</w:t>
+      </w:r>
+      <w:r>
+        <w:rPr>
+          <w:rFonts w:ascii="Noto Serif" w:eastAsia="Noto Serif SC" w:hAnsi="Noto Serif" w:cs="Noto Serif"/>
+          <w:sz w:val="24"/>
+          <w:szCs w:val="24"/>
+          <w:lang w:val="en-US"/>
+        </w:rPr>
+        <w:t xml:space="preserve"> (Timpani)</w:t>
+      </w:r>
+    </w:p>
+    <w:p>
+      <w:pPr>
+        <w:jc w:val="right"/>
+        <w:rPr>
+          <w:rFonts w:ascii="Noto Serif" w:eastAsia="Noto Serif SC" w:hAnsi="Noto Serif" w:cs="Noto Serif"/>
+          <w:sz w:val="21"/>
+          <w:szCs w:val="21"/>
+          <w:lang w:val="en-US"/>
+        </w:rPr>
+      </w:pPr>
+      <w:r>
+        <w:rPr>
+          <w:rFonts w:ascii="Noto Serif" w:eastAsia="Noto Serif SC" w:hAnsi="Noto Serif" w:cs="Noto Serif" w:hint="eastAsia"/>
+          <w:sz w:val="21"/>
+          <w:szCs w:val="21"/>
+          <w:lang w:val="en-US"/>
+        </w:rPr>
+        <w:t>打击乐</w:t>
+      </w:r>
+      <w:r>
+        <w:rPr>
+          <w:rFonts w:ascii="Noto Serif" w:eastAsia="Noto Serif SC" w:hAnsi="Noto Serif" w:cs="Noto Serif"/>
+          <w:sz w:val="21"/>
+          <w:szCs w:val="21"/>
+          <w:lang w:val="en-US"/>
+        </w:rPr>
+        <w:t xml:space="preserve"> I (Percussion I): </w:t>
+      </w:r>
+      <w:r>
+        <w:rPr>
+          <w:rFonts w:ascii="Noto Serif" w:eastAsia="Noto Serif SC" w:hAnsi="Noto Serif" w:cs="Noto Serif" w:hint="eastAsia"/>
+          <w:sz w:val="21"/>
+          <w:szCs w:val="21"/>
+        </w:rPr>
+        <w:t>管钟</w:t>
+      </w:r>
+      <w:r>
+        <w:rPr>
+          <w:rFonts w:ascii="Noto Serif" w:eastAsia="Noto Serif SC" w:hAnsi="Noto Serif" w:cs="Noto Serif"/>
+          <w:sz w:val="21"/>
+          <w:szCs w:val="21"/>
+        </w:rPr>
+        <w:t xml:space="preserve"> Tubular bells, </w:t>
+      </w:r>
+      <w:r>
+        <w:rPr>
+          <w:rFonts w:ascii="Noto Serif" w:eastAsia="Noto Serif SC" w:hAnsi="Noto Serif" w:cs="Noto Serif" w:hint="eastAsia"/>
+          <w:sz w:val="21"/>
+          <w:szCs w:val="21"/>
+        </w:rPr>
+        <w:t>风锣</w:t>
+      </w:r>
+      <w:r>
+        <w:rPr>
+          <w:rFonts w:ascii="Noto Serif" w:eastAsia="Noto Serif SC" w:hAnsi="Noto Serif" w:cs="Noto Serif"/>
+          <w:sz w:val="21"/>
+          <w:szCs w:val="21"/>
+        </w:rPr>
+        <w:t xml:space="preserve"> Fengluo, </w:t>
+      </w:r>
+      <w:r>
+        <w:rPr>
+          <w:rFonts w:ascii="Noto Serif" w:eastAsia="Noto Serif SC" w:hAnsi="Noto Serif" w:cs="Noto Serif" w:hint="eastAsia"/>
+          <w:sz w:val="21"/>
+          <w:szCs w:val="21"/>
+        </w:rPr>
+        <w:t>木琴</w:t>
+      </w:r>
+      <w:r>
+        <w:rPr>
+          <w:rFonts w:ascii="Noto Serif" w:eastAsia="Noto Serif SC" w:hAnsi="Noto Serif" w:cs="Noto Serif"/>
+          <w:sz w:val="21"/>
+          <w:szCs w:val="21"/>
+        </w:rPr>
+        <w:t xml:space="preserve"> Xylophone, </w:t>
+      </w:r>
+      <w:r>
+        <w:rPr>
+          <w:rFonts w:ascii="Noto Serif" w:eastAsia="Noto Serif SC" w:hAnsi="Noto Serif" w:cs="Noto Serif" w:hint="eastAsia"/>
+          <w:sz w:val="21"/>
+          <w:szCs w:val="21"/>
+        </w:rPr>
+        <w:t>颤音琴</w:t>
+      </w:r>
+      <w:r>
+        <w:rPr>
+          <w:rFonts w:ascii="Noto Serif" w:eastAsia="Noto Serif SC" w:hAnsi="Noto Serif" w:cs="Noto Serif"/>
+          <w:sz w:val="21"/>
+          <w:szCs w:val="21"/>
+        </w:rPr>
+        <w:t xml:space="preserve"> Vibraphone</w:t>
+      </w:r>
+    </w:p>
+    <w:p>
+      <w:pPr>
+        <w:jc w:val="right"/>
+        <w:rPr>
+          <w:rFonts w:ascii="Noto Serif" w:eastAsia="Noto Serif SC" w:hAnsi="Noto Serif" w:cs="Noto Serif"/>
+          <w:sz w:val="21"/>
+          <w:szCs w:val="21"/>
+          <w:lang w:val="en-US"/>
+        </w:rPr>
+      </w:pPr>
+      <w:r>
+        <w:rPr>
+          <w:rFonts w:ascii="Noto Serif" w:eastAsia="Noto Serif SC" w:hAnsi="Noto Serif" w:cs="Noto Serif" w:hint="eastAsia"/>
+          <w:sz w:val="21"/>
+          <w:szCs w:val="21"/>
+          <w:lang w:val="en-US"/>
+        </w:rPr>
+        <w:t>打击乐</w:t>
+      </w:r>
+      <w:r>
+        <w:rPr>
+          <w:rFonts w:ascii="Noto Serif" w:eastAsia="Noto Serif SC" w:hAnsi="Noto Serif" w:cs="Noto Serif"/>
+          <w:sz w:val="21"/>
+          <w:szCs w:val="21"/>
+          <w:lang w:val="en-US"/>
+        </w:rPr>
+        <w:t xml:space="preserve"> II (Percussion II): </w:t>
+      </w:r>
+      <w:r>
+        <w:rPr>
+          <w:rFonts w:ascii="Noto Serif" w:eastAsia="Noto Serif SC" w:hAnsi="Noto Serif" w:cs="Noto Serif" w:hint="eastAsia"/>
+          <w:sz w:val="21"/>
+          <w:szCs w:val="21"/>
+        </w:rPr>
+        <w:t>云锣</w:t>
+      </w:r>
+      <w:r>
+        <w:rPr>
+          <w:rFonts w:ascii="Noto Serif" w:eastAsia="Noto Serif SC" w:hAnsi="Noto Serif" w:cs="Noto Serif"/>
+          <w:sz w:val="21"/>
+          <w:szCs w:val="21"/>
+        </w:rPr>
+        <w:t xml:space="preserve"> Yunluo, </w:t>
+      </w:r>
+      <w:r>
+        <w:rPr>
+          <w:rFonts w:ascii="Noto Serif" w:eastAsia="Noto Serif SC" w:hAnsi="Noto Serif" w:cs="Noto Serif" w:hint="eastAsia"/>
+          <w:sz w:val="21"/>
+          <w:szCs w:val="21"/>
+        </w:rPr>
+        <w:t>颤音琴</w:t>
+      </w:r>
+      <w:r>
+        <w:rPr>
+          <w:rFonts w:ascii="Noto Serif" w:eastAsia="Noto Serif SC" w:hAnsi="Noto Serif" w:cs="Noto Serif"/>
+          <w:sz w:val="21"/>
+          <w:szCs w:val="21"/>
+        </w:rPr>
+        <w:t xml:space="preserve"> Vibraphone</w:t>
+      </w:r>
+    </w:p>
+    <w:p>
+      <w:pPr>
+        <w:jc w:val="right"/>
+        <w:rPr>
+          <w:rFonts w:ascii="Noto Serif" w:eastAsia="Noto Serif SC" w:hAnsi="Noto Serif" w:cs="Noto Serif"/>
+          <w:sz w:val="21"/>
+          <w:szCs w:val="21"/>
+        </w:rPr>
+      </w:pPr>
+      <w:r>
+        <w:rPr>
+          <w:rFonts w:ascii="Noto Serif" w:eastAsia="Noto Serif SC" w:hAnsi="Noto Serif" w:cs="Noto Serif" w:hint="eastAsia"/>
+          <w:sz w:val="21"/>
+          <w:szCs w:val="21"/>
+          <w:lang w:val="en-US"/>
+        </w:rPr>
+        <w:t>打击乐</w:t>
+      </w:r>
+      <w:r>
+        <w:rPr>
+          <w:rFonts w:ascii="Noto Serif" w:eastAsia="Noto Serif SC" w:hAnsi="Noto Serif" w:cs="Noto Serif"/>
+          <w:sz w:val="21"/>
+          <w:szCs w:val="21"/>
+          <w:lang w:val="en-US"/>
+        </w:rPr>
+        <w:t xml:space="preserve"> III (Percussion III): </w:t>
+      </w:r>
+      <w:r>
+        <w:rPr>
+          <w:rFonts w:ascii="Noto Serif" w:eastAsia="Noto Serif SC" w:hAnsi="Noto Serif" w:cs="Noto Serif" w:hint="eastAsia"/>
+          <w:sz w:val="21"/>
+          <w:szCs w:val="21"/>
+        </w:rPr>
+        <w:t>大堂鼓</w:t>
+      </w:r>
+      <w:r>
+        <w:rPr>
+          <w:rFonts w:ascii="Noto Serif" w:eastAsia="Noto Serif SC" w:hAnsi="Noto Serif" w:cs="Noto Serif"/>
+          <w:sz w:val="21"/>
+          <w:szCs w:val="21"/>
+        </w:rPr>
+        <w:t xml:space="preserve"> Da Tanggu, </w:t>
+      </w:r>
+      <w:r>
+        <w:rPr>
+          <w:rFonts w:ascii="Noto Serif" w:eastAsia="Noto Serif SC" w:hAnsi="Noto Serif" w:cs="Noto Serif" w:hint="eastAsia"/>
+          <w:sz w:val="21"/>
+          <w:szCs w:val="21"/>
+        </w:rPr>
+        <w:t>大小</w:t>
+      </w:r>
+      <w:r>
+        <w:rPr>
+          <w:rFonts w:ascii="Noto Serif" w:eastAsia="Noto Serif SC" w:hAnsi="Noto Serif" w:cs="Noto Serif"/>
+          <w:sz w:val="21"/>
+          <w:szCs w:val="21"/>
+        </w:rPr>
+        <w:t xml:space="preserve"> Flexatone, </w:t>
+      </w:r>
+      <w:r>
+        <w:rPr>
+          <w:rFonts w:ascii="Noto Serif" w:eastAsia="Noto Serif SC" w:hAnsi="Noto Serif" w:cs="Noto Serif" w:hint="eastAsia"/>
+          <w:sz w:val="21"/>
+          <w:szCs w:val="21"/>
+        </w:rPr>
+        <w:t>小风铃</w:t>
+      </w:r>
+      <w:r>
+        <w:rPr>
+          <w:rFonts w:ascii="Noto Serif" w:eastAsia="Noto Serif SC" w:hAnsi="Noto Serif" w:cs="Noto Serif"/>
+          <w:sz w:val="21"/>
+          <w:szCs w:val="21"/>
+        </w:rPr>
+        <w:t xml:space="preserve"> Small Windchimes</w:t>
+      </w:r>
+    </w:p>
+    <w:p>
+      <w:pPr>
+        <w:jc w:val="right"/>
+        <w:rPr>
+          <w:rFonts w:ascii="Noto Serif" w:eastAsia="Noto Serif SC" w:hAnsi="Noto Serif" w:cs="Noto Serif"/>
+          <w:sz w:val="21"/>
+          <w:szCs w:val="21"/>
+          <w:lang w:val="en-US"/>
+        </w:rPr>
+      </w:pPr>
+      <w:r>
+        <w:rPr>
+          <w:rFonts w:ascii="Noto Serif" w:eastAsia="Noto Serif SC" w:hAnsi="Noto Serif" w:cs="Noto Serif" w:hint="eastAsia"/>
+          <w:sz w:val="21"/>
+          <w:szCs w:val="21"/>
+          <w:lang w:val="en-US"/>
+        </w:rPr>
+        <w:t>打击乐</w:t>
+      </w:r>
+      <w:r>
+        <w:rPr>
+          <w:rFonts w:ascii="Noto Serif" w:eastAsia="Noto Serif SC" w:hAnsi="Noto Serif" w:cs="Noto Serif"/>
+          <w:sz w:val="21"/>
+          <w:szCs w:val="21"/>
+          <w:lang w:val="en-US"/>
+        </w:rPr>
+        <w:t xml:space="preserve"> IV (Percussion IV): </w:t>
+      </w:r>
+      <w:r>
+        <w:rPr>
+          <w:rFonts w:ascii="Noto Serif" w:eastAsia="Noto Serif SC" w:hAnsi="Noto Serif" w:cs="Noto Serif" w:hint="eastAsia"/>
+          <w:sz w:val="21"/>
+          <w:szCs w:val="21"/>
+        </w:rPr>
+        <w:t>吊钹</w:t>
+      </w:r>
+      <w:r>
+        <w:rPr>
+          <w:rFonts w:ascii="Noto Serif" w:eastAsia="Noto Serif SC" w:hAnsi="Noto Serif" w:cs="Noto Serif"/>
+          <w:sz w:val="21"/>
+          <w:szCs w:val="21"/>
+        </w:rPr>
+        <w:t xml:space="preserve"> Suspended Cymbal, </w:t>
+      </w:r>
+      <w:r>
+        <w:rPr>
+          <w:rFonts w:ascii="Noto Serif" w:eastAsia="Noto Serif SC" w:hAnsi="Noto Serif" w:cs="Noto Serif" w:hint="eastAsia"/>
+          <w:sz w:val="21"/>
+          <w:szCs w:val="21"/>
+        </w:rPr>
+        <w:t>大小拍颤器</w:t>
+      </w:r>
+      <w:r>
+        <w:rPr>
+          <w:rFonts w:ascii="Noto Serif" w:eastAsia="Noto Serif SC" w:hAnsi="Noto Serif" w:cs="Noto Serif"/>
+          <w:sz w:val="21"/>
+          <w:szCs w:val="21"/>
+        </w:rPr>
+        <w:t xml:space="preserve"> (Large &amp; Small Vibraslap), </w:t>
+      </w:r>
+      <w:r>
+        <w:rPr>
+          <w:rFonts w:ascii="Noto Serif" w:eastAsia="Noto Serif SC" w:hAnsi="Noto Serif" w:cs="Noto Serif" w:hint="eastAsia"/>
+          <w:sz w:val="21"/>
+          <w:szCs w:val="21"/>
+        </w:rPr>
+        <w:t>大堂鼓</w:t>
+      </w:r>
+      <w:r>
+        <w:rPr>
+          <w:rFonts w:ascii="Noto Serif" w:eastAsia="Noto Serif SC" w:hAnsi="Noto Serif" w:cs="Noto Serif"/>
+          <w:sz w:val="21"/>
+          <w:szCs w:val="21"/>
+        </w:rPr>
+        <w:t xml:space="preserve"> Da Tanggu, </w:t>
+      </w:r>
+      <w:r>
+        <w:rPr>
+          <w:rFonts w:ascii="Noto Serif" w:eastAsia="Noto Serif SC" w:hAnsi="Noto Serif" w:cs="Noto Serif" w:hint="eastAsia"/>
+          <w:sz w:val="21"/>
+          <w:szCs w:val="21"/>
+        </w:rPr>
+        <w:t>小堂鼓</w:t>
+      </w:r>
+      <w:r>
+        <w:rPr>
+          <w:rFonts w:ascii="Noto Serif" w:eastAsia="Noto Serif SC" w:hAnsi="Noto Serif" w:cs="Noto Serif"/>
+          <w:sz w:val="21"/>
+          <w:szCs w:val="21"/>
+        </w:rPr>
+        <w:t xml:space="preserve"> Xiao Tanggu</w:t>
+      </w:r>
+    </w:p>
+    <w:p>
+      <w:pPr>
+        <w:jc w:val="right"/>
+        <w:rPr>
+          <w:rFonts w:ascii="Noto Serif" w:eastAsia="Noto Serif SC" w:hAnsi="Noto Serif" w:cs="Noto Serif"/>
+          <w:sz w:val="21"/>
+          <w:szCs w:val="21"/>
+          <w:lang w:val="en-GB"/>
+        </w:rPr>
+      </w:pPr>
+      <w:r>
+        <w:rPr>
+          <w:rFonts w:ascii="Noto Serif" w:eastAsia="Noto Serif SC" w:hAnsi="Noto Serif" w:cs="Noto Serif" w:hint="eastAsia"/>
+          <w:sz w:val="21"/>
+          <w:szCs w:val="21"/>
+          <w:lang w:val="en-US"/>
+        </w:rPr>
+        <w:t>打击乐</w:t>
+      </w:r>
+      <w:r>
+        <w:rPr>
+          <w:rFonts w:ascii="Noto Serif" w:eastAsia="Noto Serif SC" w:hAnsi="Noto Serif" w:cs="Noto Serif"/>
+          <w:sz w:val="21"/>
+          <w:szCs w:val="21"/>
+          <w:lang w:val="en-US"/>
+        </w:rPr>
+        <w:t xml:space="preserve"> V (Percussion V): </w:t>
+      </w:r>
+      <w:r>
+        <w:rPr>
+          <w:rFonts w:ascii="Noto Serif" w:eastAsia="Noto Serif SC" w:hAnsi="Noto Serif" w:cs="Noto Serif" w:hint="eastAsia"/>
+          <w:sz w:val="21"/>
+          <w:szCs w:val="21"/>
+        </w:rPr>
+        <w:t>板鼓</w:t>
+      </w:r>
+      <w:r>
+        <w:rPr>
+          <w:rFonts w:ascii="Noto Serif" w:eastAsia="Noto Serif SC" w:hAnsi="Noto Serif" w:cs="Noto Serif"/>
+          <w:sz w:val="21"/>
+          <w:szCs w:val="21"/>
+        </w:rPr>
+        <w:t xml:space="preserve"> Bangu, </w:t>
+      </w:r>
+      <w:r>
+        <w:rPr>
+          <w:rFonts w:ascii="Noto Serif" w:eastAsia="Noto Serif SC" w:hAnsi="Noto Serif" w:cs="Noto Serif" w:hint="eastAsia"/>
+          <w:sz w:val="21"/>
+          <w:szCs w:val="21"/>
+        </w:rPr>
+        <w:t>弹簧鼓</w:t>
+      </w:r>
+      <w:r>
+        <w:rPr>
+          <w:rFonts w:ascii="Noto Serif" w:eastAsia="Noto Serif SC" w:hAnsi="Noto Serif" w:cs="Noto Serif"/>
+          <w:sz w:val="21"/>
+          <w:szCs w:val="21"/>
+          <w:lang w:val="en-GB"/>
         </w:rPr>
         <w:t xml:space="preserve"> </w:t>
       </w:r>
-      <w:proofErr w:type="spellStart"/>
-      <w:r>
-        <w:rPr>
-          <w:rFonts w:ascii="Noto Serif" w:eastAsia="Noto Serif SC" w:hAnsi="Noto Serif" w:cs="Noto Serif"/>
-          <w:sz w:val="24"/>
-          <w:szCs w:val="24"/>
-          <w:lang w:val="en-US"/>
-        </w:rPr>
-        <w:t>Suona</w:t>
-      </w:r>
-      <w:proofErr w:type="spellEnd"/>
-      <w:r>
-        <w:rPr>
-          <w:rFonts w:ascii="Noto Serif" w:eastAsia="Noto Serif SC" w:hAnsi="Noto Serif" w:cs="Noto Serif"/>
-          <w:sz w:val="24"/>
-          <w:szCs w:val="24"/>
-          <w:lang w:val="en-US"/>
-        </w:rPr>
-        <w:t xml:space="preserve"> I, II)</w:t>
-      </w:r>
-    </w:p>
-    <w:p>
-      <w:pPr>
-        <w:jc w:val="right"/>
-        <w:rPr>
-          <w:rFonts w:ascii="Noto Serif" w:eastAsia="Noto Serif SC" w:hAnsi="Noto Serif" w:cs="Noto Serif"/>
-          <w:sz w:val="24"/>
-          <w:szCs w:val="24"/>
-          <w:lang w:val="en-US"/>
-        </w:rPr>
-      </w:pPr>
-      <w:r>
-        <w:rPr>
-          <w:rFonts w:ascii="Noto Serif" w:eastAsia="Noto Serif SC" w:hAnsi="Noto Serif" w:cs="Noto Serif" w:hint="eastAsia"/>
-          <w:sz w:val="24"/>
-          <w:szCs w:val="24"/>
-          <w:lang w:val="en-US"/>
-        </w:rPr>
-        <w:t>中音加键唢吶</w:t>
-      </w:r>
-      <w:r>
-        <w:rPr>
-          <w:rFonts w:ascii="Noto Serif" w:eastAsia="Noto Serif SC" w:hAnsi="Noto Serif" w:cs="Noto Serif"/>
-          <w:sz w:val="24"/>
-          <w:szCs w:val="24"/>
-          <w:lang w:val="en-US"/>
-        </w:rPr>
-        <w:t xml:space="preserve"> I, II (</w:t>
-      </w:r>
-      <w:proofErr w:type="spellStart"/>
-      <w:r>
-        <w:rPr>
-          <w:rFonts w:ascii="Noto Serif" w:eastAsia="Noto Serif SC" w:hAnsi="Noto Serif" w:cs="Noto Serif"/>
-          <w:sz w:val="24"/>
-          <w:szCs w:val="24"/>
-          <w:lang w:val="en-US"/>
-        </w:rPr>
-        <w:t>Zhongyin</w:t>
-      </w:r>
-      <w:proofErr w:type="spellEnd"/>
-      <w:r>
-        <w:rPr>
-          <w:rFonts w:ascii="Noto Serif" w:eastAsia="Noto Serif SC" w:hAnsi="Noto Serif" w:cs="Noto Serif"/>
-          <w:sz w:val="24"/>
-          <w:szCs w:val="24"/>
-          <w:lang w:val="en-US"/>
+      <w:r>
+        <w:rPr>
+          <w:rFonts w:ascii="Noto Serif" w:eastAsia="Noto Serif SC" w:hAnsi="Noto Serif" w:cs="Noto Serif"/>
+          <w:sz w:val="21"/>
+          <w:szCs w:val="21"/>
+        </w:rPr>
+        <w:t xml:space="preserve">Thunder tube, </w:t>
+      </w:r>
+      <w:r>
+        <w:rPr>
+          <w:rFonts w:ascii="Noto Serif" w:eastAsia="Noto Serif SC" w:hAnsi="Noto Serif" w:cs="Noto Serif" w:hint="eastAsia"/>
+          <w:sz w:val="21"/>
+          <w:szCs w:val="21"/>
+        </w:rPr>
+        <w:t>拍板</w:t>
+      </w:r>
+      <w:r>
+        <w:rPr>
+          <w:rFonts w:ascii="Noto Serif" w:eastAsia="Noto Serif SC" w:hAnsi="Noto Serif" w:cs="Noto Serif"/>
+          <w:sz w:val="21"/>
+          <w:szCs w:val="21"/>
+        </w:rPr>
+        <w:t xml:space="preserve"> Paiban, </w:t>
+      </w:r>
+      <w:r>
+        <w:rPr>
+          <w:rFonts w:ascii="Noto Serif" w:eastAsia="Noto Serif SC" w:hAnsi="Noto Serif" w:cs="Noto Serif" w:hint="eastAsia"/>
+          <w:sz w:val="21"/>
+          <w:szCs w:val="21"/>
+        </w:rPr>
+        <w:t>狮钹</w:t>
+      </w:r>
+      <w:r>
+        <w:rPr>
+          <w:rFonts w:ascii="Noto Serif" w:eastAsia="Noto Serif SC" w:hAnsi="Noto Serif" w:cs="Noto Serif"/>
+          <w:sz w:val="21"/>
+          <w:szCs w:val="21"/>
+        </w:rPr>
+        <w:t xml:space="preserve"> Shibo, </w:t>
+      </w:r>
+      <w:r>
+        <w:rPr>
+          <w:rFonts w:ascii="Noto Serif" w:eastAsia="Noto Serif SC" w:hAnsi="Noto Serif" w:cs="Noto Serif" w:hint="eastAsia"/>
+          <w:sz w:val="21"/>
+          <w:szCs w:val="21"/>
+        </w:rPr>
+        <w:t>低音木鱼</w:t>
+      </w:r>
+      <w:r>
+        <w:rPr>
+          <w:rFonts w:ascii="Noto Serif" w:eastAsia="Noto Serif SC" w:hAnsi="Noto Serif" w:cs="Noto Serif"/>
+          <w:sz w:val="21"/>
+          <w:szCs w:val="21"/>
+        </w:rPr>
+        <w:t xml:space="preserve"> Low Wooden Fish, </w:t>
+      </w:r>
+      <w:r>
+        <w:rPr>
+          <w:rFonts w:ascii="Noto Serif" w:eastAsia="Noto Serif SC" w:hAnsi="Noto Serif" w:cs="Noto Serif" w:hint="eastAsia"/>
+          <w:sz w:val="21"/>
+          <w:szCs w:val="21"/>
+        </w:rPr>
+        <w:t>小木铃</w:t>
+      </w:r>
+      <w:r>
+        <w:rPr>
+          <w:rFonts w:ascii="Noto Serif" w:eastAsia="Noto Serif SC" w:hAnsi="Noto Serif" w:cs="Noto Serif"/>
+          <w:sz w:val="21"/>
+          <w:szCs w:val="21"/>
+        </w:rPr>
+        <w:t xml:space="preserve"> Woodchimes</w:t>
+      </w:r>
+    </w:p>
+    <w:p>
+      <w:pPr>
+        <w:jc w:val="right"/>
+        <w:rPr>
+          <w:rFonts w:ascii="Noto Serif" w:eastAsia="Noto Serif SC" w:hAnsi="Noto Serif" w:cs="Noto Serif"/>
+          <w:sz w:val="21"/>
+          <w:szCs w:val="21"/>
+          <w:lang w:val="en-US"/>
+        </w:rPr>
+      </w:pPr>
+      <w:r>
+        <w:rPr>
+          <w:rFonts w:ascii="Noto Serif" w:eastAsia="Noto Serif SC" w:hAnsi="Noto Serif" w:cs="Noto Serif" w:hint="eastAsia"/>
+          <w:sz w:val="21"/>
+          <w:szCs w:val="21"/>
+          <w:lang w:val="en-US"/>
+        </w:rPr>
+        <w:t>打击乐</w:t>
+      </w:r>
+      <w:r>
+        <w:rPr>
+          <w:rFonts w:ascii="Noto Serif" w:eastAsia="Noto Serif SC" w:hAnsi="Noto Serif" w:cs="Noto Serif"/>
+          <w:sz w:val="21"/>
+          <w:szCs w:val="21"/>
+          <w:lang w:val="en-US"/>
+        </w:rPr>
+        <w:t xml:space="preserve"> VI (Percussion VI): </w:t>
+      </w:r>
+      <w:r>
+        <w:rPr>
+          <w:rFonts w:ascii="Noto Serif" w:eastAsia="Noto Serif SC" w:hAnsi="Noto Serif" w:cs="Noto Serif" w:hint="eastAsia"/>
+          <w:sz w:val="21"/>
+          <w:szCs w:val="21"/>
+        </w:rPr>
+        <w:t>低音军鼓</w:t>
+      </w:r>
+      <w:r>
+        <w:rPr>
+          <w:rFonts w:ascii="Noto Serif" w:eastAsia="Noto Serif SC" w:hAnsi="Noto Serif" w:cs="Noto Serif"/>
+          <w:sz w:val="21"/>
+          <w:szCs w:val="21"/>
+        </w:rPr>
+        <w:t xml:space="preserve"> Diyin Jungu, </w:t>
+      </w:r>
+      <w:r>
+        <w:rPr>
+          <w:rFonts w:ascii="Noto Serif" w:eastAsia="Noto Serif SC" w:hAnsi="Noto Serif" w:cs="Noto Serif" w:hint="eastAsia"/>
+          <w:sz w:val="21"/>
+          <w:szCs w:val="21"/>
+        </w:rPr>
+        <w:t>狮钹</w:t>
+      </w:r>
+      <w:r>
+        <w:rPr>
+          <w:rFonts w:ascii="Noto Serif" w:eastAsia="Noto Serif SC" w:hAnsi="Noto Serif" w:cs="Noto Serif"/>
+          <w:sz w:val="21"/>
+          <w:szCs w:val="21"/>
+        </w:rPr>
+        <w:t xml:space="preserve"> Shibo, </w:t>
+      </w:r>
+      <w:r>
+        <w:rPr>
+          <w:rFonts w:ascii="Noto Serif" w:eastAsia="Noto Serif SC" w:hAnsi="Noto Serif" w:cs="Noto Serif" w:hint="eastAsia"/>
+          <w:sz w:val="21"/>
+          <w:szCs w:val="21"/>
+        </w:rPr>
+        <w:t>高音木鱼</w:t>
+      </w:r>
+      <w:r>
+        <w:rPr>
+          <w:rFonts w:ascii="Noto Serif" w:eastAsia="Noto Serif SC" w:hAnsi="Noto Serif" w:cs="Noto Serif"/>
+          <w:sz w:val="21"/>
+          <w:szCs w:val="21"/>
+        </w:rPr>
+        <w:t xml:space="preserve"> High Wooden Fish, </w:t>
+      </w:r>
+      <w:r>
+        <w:rPr>
+          <w:rFonts w:ascii="Noto Serif" w:eastAsia="Noto Serif SC" w:hAnsi="Noto Serif" w:cs="Noto Serif" w:hint="eastAsia"/>
+          <w:sz w:val="21"/>
+          <w:szCs w:val="21"/>
+        </w:rPr>
+        <w:t>狮钹</w:t>
+      </w:r>
+      <w:r>
+        <w:rPr>
+          <w:rFonts w:ascii="Noto Serif" w:eastAsia="Noto Serif SC" w:hAnsi="Noto Serif" w:cs="Noto Serif"/>
+          <w:sz w:val="21"/>
+          <w:szCs w:val="21"/>
+        </w:rPr>
+        <w:t xml:space="preserve"> Shibo, </w:t>
+      </w:r>
+      <w:r>
+        <w:rPr>
+          <w:rFonts w:ascii="Noto Serif" w:eastAsia="Noto Serif SC" w:hAnsi="Noto Serif" w:cs="Noto Serif" w:hint="eastAsia"/>
+          <w:sz w:val="21"/>
+          <w:szCs w:val="21"/>
+        </w:rPr>
+        <w:t>军钹</w:t>
+      </w:r>
+      <w:r>
+        <w:rPr>
+          <w:rFonts w:ascii="Noto Serif" w:eastAsia="Noto Serif SC" w:hAnsi="Noto Serif" w:cs="Noto Serif"/>
+          <w:sz w:val="21"/>
+          <w:szCs w:val="21"/>
+        </w:rPr>
+        <w:t xml:space="preserve"> Junbo</w:t>
+      </w:r>
+    </w:p>
+    <w:p>
+      <w:pPr>
+        <w:jc w:val="right"/>
+        <w:rPr>
+          <w:rFonts w:ascii="Noto Serif" w:eastAsia="Noto Serif SC" w:hAnsi="Noto Serif" w:cs="Noto Serif"/>
+          <w:sz w:val="21"/>
+          <w:szCs w:val="21"/>
+          <w:lang w:val="en-US"/>
+        </w:rPr>
+      </w:pPr>
+      <w:r>
+        <w:rPr>
+          <w:rFonts w:ascii="Noto Serif" w:eastAsia="Noto Serif SC" w:hAnsi="Noto Serif" w:cs="Noto Serif" w:hint="eastAsia"/>
+          <w:sz w:val="21"/>
+          <w:szCs w:val="21"/>
+          <w:lang w:val="en-US"/>
+        </w:rPr>
+        <w:t>打击乐</w:t>
+      </w:r>
+      <w:r>
+        <w:rPr>
+          <w:rFonts w:ascii="Noto Serif" w:eastAsia="Noto Serif SC" w:hAnsi="Noto Serif" w:cs="Noto Serif"/>
+          <w:sz w:val="21"/>
+          <w:szCs w:val="21"/>
+          <w:lang w:val="en-US"/>
+        </w:rPr>
+        <w:t xml:space="preserve"> VII (Percussion VII): </w:t>
+      </w:r>
+      <w:r>
+        <w:rPr>
+          <w:rFonts w:ascii="Noto Serif" w:eastAsia="Noto Serif SC" w:hAnsi="Noto Serif" w:cs="Noto Serif" w:hint="eastAsia"/>
+          <w:sz w:val="21"/>
+          <w:szCs w:val="21"/>
+        </w:rPr>
+        <w:t>拍板</w:t>
+      </w:r>
+      <w:r>
+        <w:rPr>
+          <w:rFonts w:ascii="Noto Serif" w:eastAsia="Noto Serif SC" w:hAnsi="Noto Serif" w:cs="Noto Serif"/>
+          <w:sz w:val="21"/>
+          <w:szCs w:val="21"/>
+          <w:lang w:val="en-GB"/>
         </w:rPr>
         <w:t xml:space="preserve"> </w:t>
       </w:r>
-      <w:proofErr w:type="spellStart"/>
-      <w:r>
-        <w:rPr>
-          <w:rFonts w:ascii="Noto Serif" w:eastAsia="Noto Serif SC" w:hAnsi="Noto Serif" w:cs="Noto Serif"/>
-          <w:sz w:val="24"/>
-          <w:szCs w:val="24"/>
-          <w:lang w:val="en-US"/>
-        </w:rPr>
-        <w:t>Suona</w:t>
-      </w:r>
-      <w:proofErr w:type="spellEnd"/>
-      <w:r>
-        <w:rPr>
-          <w:rFonts w:ascii="Noto Serif" w:eastAsia="Noto Serif SC" w:hAnsi="Noto Serif" w:cs="Noto Serif"/>
-          <w:sz w:val="24"/>
-          <w:szCs w:val="24"/>
-          <w:lang w:val="en-US"/>
-        </w:rPr>
-        <w:t xml:space="preserve"> I, II)</w:t>
-      </w:r>
-    </w:p>
-    <w:p>
-      <w:pPr>
-        <w:jc w:val="right"/>
-        <w:rPr>
-          <w:rFonts w:ascii="Noto Serif" w:eastAsia="Noto Serif SC" w:hAnsi="Noto Serif" w:cs="Noto Serif"/>
-          <w:sz w:val="24"/>
-          <w:szCs w:val="24"/>
-          <w:lang w:val="en-US"/>
-        </w:rPr>
-      </w:pPr>
-      <w:r>
-        <w:rPr>
-          <w:rFonts w:ascii="Noto Serif" w:eastAsia="Noto Serif SC" w:hAnsi="Noto Serif" w:cs="Noto Serif" w:hint="eastAsia"/>
-          <w:sz w:val="24"/>
-          <w:szCs w:val="24"/>
-          <w:lang w:val="en-US"/>
-        </w:rPr>
-        <w:t>低音加键唢吶</w:t>
-      </w:r>
-      <w:r>
-        <w:rPr>
-          <w:rFonts w:ascii="Noto Serif" w:eastAsia="Noto Serif SC" w:hAnsi="Noto Serif" w:cs="Noto Serif"/>
-          <w:sz w:val="24"/>
-          <w:szCs w:val="24"/>
-          <w:lang w:val="en-US"/>
-        </w:rPr>
-        <w:t xml:space="preserve"> (</w:t>
-      </w:r>
-      <w:proofErr w:type="spellStart"/>
-      <w:r>
-        <w:rPr>
-          <w:rFonts w:ascii="Noto Serif" w:eastAsia="Noto Serif SC" w:hAnsi="Noto Serif" w:cs="Noto Serif"/>
-          <w:sz w:val="24"/>
-          <w:szCs w:val="24"/>
-          <w:lang w:val="en-US"/>
-        </w:rPr>
-        <w:t>Diyin</w:t>
-      </w:r>
-      <w:proofErr w:type="spellEnd"/>
-      <w:r>
-        <w:rPr>
-          <w:rFonts w:ascii="Noto Serif" w:eastAsia="Noto Serif SC" w:hAnsi="Noto Serif" w:cs="Noto Serif"/>
-          <w:sz w:val="24"/>
-          <w:szCs w:val="24"/>
-          <w:lang w:val="en-US"/>
-        </w:rPr>
-        <w:t xml:space="preserve"> </w:t>
-      </w:r>
-      <w:proofErr w:type="spellStart"/>
-      <w:r>
-        <w:rPr>
-          <w:rFonts w:ascii="Noto Serif" w:eastAsia="Noto Serif SC" w:hAnsi="Noto Serif" w:cs="Noto Serif"/>
-          <w:sz w:val="24"/>
-          <w:szCs w:val="24"/>
-          <w:lang w:val="en-US"/>
-        </w:rPr>
-        <w:t>Suona</w:t>
-      </w:r>
-      <w:proofErr w:type="spellEnd"/>
-      <w:r>
-        <w:rPr>
-          <w:rFonts w:ascii="Noto Serif" w:eastAsia="Noto Serif SC" w:hAnsi="Noto Serif" w:cs="Noto Serif"/>
-          <w:sz w:val="24"/>
-          <w:szCs w:val="24"/>
-          <w:lang w:val="en-US"/>
-        </w:rPr>
-        <w:t>)</w:t>
-      </w:r>
-    </w:p>
-    <w:p>
-      <w:pPr>
-        <w:jc w:val="right"/>
-        <w:rPr>
-          <w:rFonts w:ascii="Noto Serif" w:eastAsia="Noto Serif SC" w:hAnsi="Noto Serif" w:cs="Noto Serif"/>
-          <w:sz w:val="24"/>
-          <w:szCs w:val="24"/>
-          <w:lang w:val="en-US"/>
-        </w:rPr>
-      </w:pPr>
-    </w:p>
-    <w:p>
-      <w:pPr>
-        <w:jc w:val="right"/>
-        <w:rPr>
-          <w:rFonts w:ascii="Noto Serif" w:eastAsia="Noto Serif SC" w:hAnsi="Noto Serif" w:cs="Noto Serif"/>
-          <w:sz w:val="24"/>
-          <w:szCs w:val="24"/>
-          <w:lang w:val="en-GB"/>
-        </w:rPr>
-      </w:pPr>
-      <w:r>
-        <w:rPr>
-          <w:rFonts w:ascii="Noto Serif" w:eastAsia="Noto Serif SC" w:hAnsi="Noto Serif" w:cs="Noto Serif" w:hint="eastAsia"/>
-          <w:sz w:val="24"/>
-          <w:szCs w:val="24"/>
-          <w:lang w:val="en-GB"/>
-        </w:rPr>
-        <w:t>中音加键管</w:t>
-      </w:r>
-      <w:r>
-        <w:rPr>
-          <w:rFonts w:ascii="Noto Serif" w:eastAsia="Noto Serif SC" w:hAnsi="Noto Serif" w:cs="Noto Serif"/>
-          <w:sz w:val="24"/>
-          <w:szCs w:val="24"/>
-          <w:lang w:val="en-GB"/>
-        </w:rPr>
-        <w:t xml:space="preserve"> (</w:t>
-      </w:r>
-      <w:proofErr w:type="spellStart"/>
-      <w:r>
-        <w:rPr>
-          <w:rFonts w:ascii="Noto Serif" w:eastAsia="Noto Serif SC" w:hAnsi="Noto Serif" w:cs="Noto Serif"/>
-          <w:sz w:val="24"/>
-          <w:szCs w:val="24"/>
-          <w:lang w:val="en-GB"/>
-        </w:rPr>
-        <w:t>Zhongyin</w:t>
-      </w:r>
-      <w:proofErr w:type="spellEnd"/>
-      <w:r>
-        <w:rPr>
-          <w:rFonts w:ascii="Noto Serif" w:eastAsia="Noto Serif SC" w:hAnsi="Noto Serif" w:cs="Noto Serif"/>
-          <w:sz w:val="24"/>
-          <w:szCs w:val="24"/>
-          <w:lang w:val="en-GB"/>
-        </w:rPr>
-        <w:t xml:space="preserve"> </w:t>
-      </w:r>
-      <w:proofErr w:type="spellStart"/>
-      <w:r>
-        <w:rPr>
-          <w:rFonts w:ascii="Noto Serif" w:eastAsia="Noto Serif SC" w:hAnsi="Noto Serif" w:cs="Noto Serif"/>
-          <w:sz w:val="24"/>
-          <w:szCs w:val="24"/>
-          <w:lang w:val="en-GB"/>
-        </w:rPr>
-        <w:t>Jiajian</w:t>
-      </w:r>
-      <w:proofErr w:type="spellEnd"/>
-      <w:r>
-        <w:rPr>
-          <w:rFonts w:ascii="Noto Serif" w:eastAsia="Noto Serif SC" w:hAnsi="Noto Serif" w:cs="Noto Serif"/>
-          <w:sz w:val="24"/>
-          <w:szCs w:val="24"/>
-          <w:lang w:val="en-GB"/>
-        </w:rPr>
-        <w:t xml:space="preserve"> Guan)</w:t>
-      </w:r>
-    </w:p>
-    <w:p>
-      <w:pPr>
-        <w:jc w:val="right"/>
-        <w:rPr>
-          <w:rFonts w:ascii="Noto Serif" w:eastAsia="Noto Serif SC" w:hAnsi="Noto Serif" w:cs="Noto Serif"/>
-          <w:sz w:val="24"/>
-          <w:szCs w:val="24"/>
-          <w:lang w:val="en-GB"/>
-        </w:rPr>
-      </w:pPr>
-      <w:r>
-        <w:rPr>
-          <w:rFonts w:ascii="Noto Serif" w:eastAsia="Noto Serif SC" w:hAnsi="Noto Serif" w:cs="Noto Serif" w:hint="eastAsia"/>
-          <w:sz w:val="24"/>
-          <w:szCs w:val="24"/>
-          <w:lang w:val="en-GB"/>
-        </w:rPr>
-        <w:t>低音加键管</w:t>
-      </w:r>
-      <w:r>
-        <w:rPr>
-          <w:rFonts w:ascii="Noto Serif" w:eastAsia="Noto Serif SC" w:hAnsi="Noto Serif" w:cs="Noto Serif"/>
-          <w:sz w:val="24"/>
-          <w:szCs w:val="24"/>
-          <w:lang w:val="en-GB"/>
-        </w:rPr>
-        <w:t xml:space="preserve"> (</w:t>
-      </w:r>
-      <w:proofErr w:type="spellStart"/>
-      <w:r>
-        <w:rPr>
-          <w:rFonts w:ascii="Noto Serif" w:eastAsia="Noto Serif SC" w:hAnsi="Noto Serif" w:cs="Noto Serif"/>
-          <w:sz w:val="24"/>
-          <w:szCs w:val="24"/>
-          <w:lang w:val="en-GB"/>
-        </w:rPr>
-        <w:t>Diyin</w:t>
-      </w:r>
-      <w:proofErr w:type="spellEnd"/>
-      <w:r>
-        <w:rPr>
-          <w:rFonts w:ascii="Noto Serif" w:eastAsia="Noto Serif SC" w:hAnsi="Noto Serif" w:cs="Noto Serif"/>
-          <w:sz w:val="24"/>
-          <w:szCs w:val="24"/>
-          <w:lang w:val="en-GB"/>
-        </w:rPr>
-        <w:t xml:space="preserve"> </w:t>
-      </w:r>
-      <w:proofErr w:type="spellStart"/>
-      <w:r>
-        <w:rPr>
-          <w:rFonts w:ascii="Noto Serif" w:eastAsia="Noto Serif SC" w:hAnsi="Noto Serif" w:cs="Noto Serif"/>
-          <w:sz w:val="24"/>
-          <w:szCs w:val="24"/>
-          <w:lang w:val="en-GB"/>
-        </w:rPr>
-        <w:t>Jiajian</w:t>
-      </w:r>
-      <w:proofErr w:type="spellEnd"/>
-      <w:r>
-        <w:rPr>
-          <w:rFonts w:ascii="Noto Serif" w:eastAsia="Noto Serif SC" w:hAnsi="Noto Serif" w:cs="Noto Serif"/>
-          <w:sz w:val="24"/>
-          <w:szCs w:val="24"/>
-          <w:lang w:val="en-GB"/>
-        </w:rPr>
-        <w:t xml:space="preserve"> Guan)</w:t>
-      </w:r>
-    </w:p>
-    <w:p>
-      <w:pPr>
-        <w:jc w:val="right"/>
-        <w:rPr>
-          <w:rFonts w:ascii="Noto Serif" w:eastAsia="Noto Serif SC" w:hAnsi="Noto Serif" w:cs="Noto Serif"/>
-          <w:sz w:val="24"/>
-          <w:szCs w:val="24"/>
-          <w:lang w:val="en-US"/>
-        </w:rPr>
-      </w:pPr>
-      <w:r>
-        <w:rPr>
-          <w:rFonts w:ascii="Noto Serif" w:eastAsia="Noto Serif SC" w:hAnsi="Noto Serif" w:cs="Noto Serif" w:hint="eastAsia"/>
-          <w:sz w:val="24"/>
-          <w:szCs w:val="24"/>
-          <w:lang w:val="en-GB"/>
-        </w:rPr>
-        <w:t>倍低音加键管</w:t>
-      </w:r>
-      <w:r>
-        <w:rPr>
-          <w:rFonts w:ascii="Noto Serif" w:eastAsia="Noto Serif SC" w:hAnsi="Noto Serif" w:cs="Noto Serif"/>
-          <w:sz w:val="24"/>
-          <w:szCs w:val="24"/>
-          <w:lang w:val="en-GB"/>
-        </w:rPr>
-        <w:t xml:space="preserve"> (Bei </w:t>
-      </w:r>
-      <w:proofErr w:type="spellStart"/>
-      <w:r>
-        <w:rPr>
-          <w:rFonts w:ascii="Noto Serif" w:eastAsia="Noto Serif SC" w:hAnsi="Noto Serif" w:cs="Noto Serif"/>
-          <w:sz w:val="24"/>
-          <w:szCs w:val="24"/>
-          <w:lang w:val="en-GB"/>
-        </w:rPr>
-        <w:t>Diyin</w:t>
-      </w:r>
-      <w:proofErr w:type="spellEnd"/>
-      <w:r>
-        <w:rPr>
-          <w:rFonts w:ascii="Noto Serif" w:eastAsia="Noto Serif SC" w:hAnsi="Noto Serif" w:cs="Noto Serif"/>
-          <w:sz w:val="24"/>
-          <w:szCs w:val="24"/>
-          <w:lang w:val="en-GB"/>
-        </w:rPr>
-        <w:t xml:space="preserve"> </w:t>
-      </w:r>
-      <w:proofErr w:type="spellStart"/>
-      <w:r>
-        <w:rPr>
-          <w:rFonts w:ascii="Noto Serif" w:eastAsia="Noto Serif SC" w:hAnsi="Noto Serif" w:cs="Noto Serif"/>
-          <w:sz w:val="24"/>
-          <w:szCs w:val="24"/>
-          <w:lang w:val="en-GB"/>
-        </w:rPr>
-        <w:t>Jiajian</w:t>
-      </w:r>
-      <w:proofErr w:type="spellEnd"/>
-      <w:r>
-        <w:rPr>
-          <w:rFonts w:ascii="Noto Serif" w:eastAsia="Noto Serif SC" w:hAnsi="Noto Serif" w:cs="Noto Serif"/>
-          <w:sz w:val="24"/>
-          <w:szCs w:val="24"/>
-          <w:lang w:val="en-GB"/>
-        </w:rPr>
-        <w:t xml:space="preserve"> Guan)</w:t>
-      </w:r>
-    </w:p>
-    <w:p>
-      <w:pPr>
-        <w:jc w:val="right"/>
-        <w:rPr>
-          <w:rFonts w:ascii="Noto Serif" w:eastAsia="Noto Serif SC" w:hAnsi="Noto Serif" w:cs="Noto Serif"/>
-          <w:sz w:val="24"/>
-          <w:szCs w:val="24"/>
-          <w:lang w:val="en-US"/>
-        </w:rPr>
-      </w:pPr>
-    </w:p>
-    <w:p>
-      <w:pPr>
-        <w:jc w:val="right"/>
-        <w:rPr>
-          <w:rFonts w:ascii="Noto Serif" w:eastAsia="Noto Serif SC" w:hAnsi="Noto Serif" w:cs="Noto Serif"/>
-          <w:sz w:val="24"/>
-          <w:szCs w:val="24"/>
-          <w:lang w:val="en-US"/>
-        </w:rPr>
-      </w:pPr>
-      <w:r>
-        <w:rPr>
-          <w:rFonts w:ascii="Noto Serif" w:eastAsia="Noto Serif SC" w:hAnsi="Noto Serif" w:cs="Noto Serif" w:hint="eastAsia"/>
-          <w:sz w:val="24"/>
-          <w:szCs w:val="24"/>
-          <w:lang w:val="en-US"/>
-        </w:rPr>
-        <w:t>扬琴</w:t>
-      </w:r>
-      <w:r>
-        <w:rPr>
-          <w:rFonts w:ascii="Noto Serif" w:eastAsia="Noto Serif SC" w:hAnsi="Noto Serif" w:cs="Noto Serif"/>
-          <w:sz w:val="24"/>
-          <w:szCs w:val="24"/>
-          <w:lang w:val="en-US"/>
-        </w:rPr>
-        <w:t xml:space="preserve"> I, II (Yangqin I, II)</w:t>
-      </w:r>
-    </w:p>
-    <w:p>
-      <w:pPr>
-        <w:jc w:val="right"/>
-        <w:rPr>
-          <w:rFonts w:ascii="Noto Serif" w:eastAsia="Noto Serif SC" w:hAnsi="Noto Serif" w:cs="Noto Serif"/>
-          <w:sz w:val="24"/>
-          <w:szCs w:val="24"/>
-          <w:lang w:val="en-US"/>
-        </w:rPr>
-      </w:pPr>
-      <w:r>
-        <w:rPr>
-          <w:rFonts w:ascii="Noto Serif" w:eastAsia="Noto Serif SC" w:hAnsi="Noto Serif" w:cs="Noto Serif" w:hint="eastAsia"/>
-          <w:sz w:val="24"/>
-          <w:szCs w:val="24"/>
-          <w:lang w:val="en-US"/>
-        </w:rPr>
-        <w:t>琵琶</w:t>
-      </w:r>
-      <w:r>
-        <w:rPr>
-          <w:rFonts w:ascii="Noto Serif" w:eastAsia="Noto Serif SC" w:hAnsi="Noto Serif" w:cs="Noto Serif"/>
-          <w:sz w:val="24"/>
-          <w:szCs w:val="24"/>
-          <w:lang w:val="en-US"/>
-        </w:rPr>
-        <w:t xml:space="preserve"> I-IV (Pipa I-IV)</w:t>
-      </w:r>
-    </w:p>
-    <w:p>
-      <w:pPr>
-        <w:jc w:val="right"/>
-        <w:rPr>
-          <w:rFonts w:ascii="Noto Serif" w:eastAsia="Noto Serif SC" w:hAnsi="Noto Serif" w:cs="Noto Serif"/>
-          <w:sz w:val="24"/>
-          <w:szCs w:val="24"/>
-          <w:lang w:val="en-US"/>
-        </w:rPr>
-      </w:pPr>
-      <w:r>
-        <w:rPr>
-          <w:rFonts w:ascii="Noto Serif" w:eastAsia="Noto Serif SC" w:hAnsi="Noto Serif" w:cs="Noto Serif" w:hint="eastAsia"/>
-          <w:sz w:val="24"/>
-          <w:szCs w:val="24"/>
-          <w:lang w:val="en-GB"/>
-        </w:rPr>
-        <w:t>高音阮</w:t>
-      </w:r>
-      <w:r>
-        <w:rPr>
-          <w:rFonts w:ascii="Noto Serif" w:eastAsia="Noto Serif SC" w:hAnsi="Noto Serif" w:cs="Noto Serif"/>
-          <w:sz w:val="24"/>
-          <w:szCs w:val="24"/>
-          <w:lang w:val="en-GB"/>
-        </w:rPr>
-        <w:t xml:space="preserve"> I, II (</w:t>
-      </w:r>
-      <w:proofErr w:type="spellStart"/>
-      <w:r>
-        <w:rPr>
-          <w:rFonts w:ascii="Noto Serif" w:eastAsia="Noto Serif SC" w:hAnsi="Noto Serif" w:cs="Noto Serif"/>
-          <w:sz w:val="24"/>
-          <w:szCs w:val="24"/>
-          <w:lang w:val="en-GB"/>
-        </w:rPr>
-        <w:t>Gaoyin</w:t>
-      </w:r>
-      <w:proofErr w:type="spellEnd"/>
-      <w:r>
-        <w:rPr>
-          <w:rFonts w:ascii="Noto Serif" w:eastAsia="Noto Serif SC" w:hAnsi="Noto Serif" w:cs="Noto Serif"/>
-          <w:sz w:val="24"/>
-          <w:szCs w:val="24"/>
-          <w:lang w:val="en-GB"/>
-        </w:rPr>
-        <w:t xml:space="preserve"> Ruan I, II)</w:t>
-      </w:r>
-    </w:p>
-    <w:p>
-      <w:pPr>
-        <w:jc w:val="right"/>
-        <w:rPr>
-          <w:rFonts w:ascii="Noto Serif" w:eastAsia="Noto Serif SC" w:hAnsi="Noto Serif" w:cs="Noto Serif"/>
-          <w:sz w:val="24"/>
-          <w:szCs w:val="24"/>
-          <w:lang w:val="en-US"/>
-        </w:rPr>
-      </w:pPr>
-      <w:r>
-        <w:rPr>
-          <w:rFonts w:ascii="Noto Serif" w:eastAsia="Noto Serif SC" w:hAnsi="Noto Serif" w:cs="Noto Serif" w:hint="eastAsia"/>
-          <w:sz w:val="24"/>
-          <w:szCs w:val="24"/>
-          <w:lang w:val="en-US"/>
-        </w:rPr>
-        <w:t>中阮</w:t>
-      </w:r>
-      <w:r>
-        <w:rPr>
-          <w:rFonts w:ascii="Noto Serif" w:eastAsia="Noto Serif SC" w:hAnsi="Noto Serif" w:cs="Noto Serif"/>
-          <w:sz w:val="24"/>
-          <w:szCs w:val="24"/>
-          <w:lang w:val="en-US"/>
-        </w:rPr>
-        <w:t xml:space="preserve"> I-VI (Zhongruan I-VI)</w:t>
-      </w:r>
-    </w:p>
-    <w:p>
-      <w:pPr>
-        <w:jc w:val="right"/>
-        <w:rPr>
-          <w:rFonts w:ascii="Noto Serif" w:eastAsia="Noto Serif SC" w:hAnsi="Noto Serif" w:cs="Noto Serif"/>
-          <w:sz w:val="24"/>
-          <w:szCs w:val="24"/>
-          <w:lang w:val="en-US"/>
-        </w:rPr>
-      </w:pPr>
-      <w:r>
-        <w:rPr>
-          <w:rFonts w:ascii="Noto Serif" w:eastAsia="Noto Serif SC" w:hAnsi="Noto Serif" w:cs="Noto Serif" w:hint="eastAsia"/>
-          <w:sz w:val="24"/>
-          <w:szCs w:val="24"/>
-          <w:lang w:val="en-US"/>
-        </w:rPr>
-        <w:t>大阮</w:t>
-      </w:r>
-      <w:r>
-        <w:rPr>
-          <w:rFonts w:ascii="Noto Serif" w:eastAsia="Noto Serif SC" w:hAnsi="Noto Serif" w:cs="Noto Serif"/>
-          <w:sz w:val="24"/>
-          <w:szCs w:val="24"/>
-          <w:lang w:val="en-US"/>
-        </w:rPr>
-        <w:t xml:space="preserve"> I, II (Daruan I, II)</w:t>
-      </w:r>
-    </w:p>
-    <w:p>
-      <w:pPr>
-        <w:jc w:val="right"/>
-        <w:rPr>
-          <w:rFonts w:ascii="Noto Serif" w:eastAsia="Noto Serif SC" w:hAnsi="Noto Serif" w:cs="Noto Serif"/>
-          <w:sz w:val="24"/>
-          <w:szCs w:val="24"/>
-          <w:lang w:val="en-US"/>
-        </w:rPr>
-      </w:pPr>
-      <w:r>
-        <w:rPr>
-          <w:rFonts w:ascii="Noto Serif" w:eastAsia="Noto Serif SC" w:hAnsi="Noto Serif" w:cs="Noto Serif" w:hint="eastAsia"/>
-          <w:sz w:val="24"/>
-          <w:szCs w:val="24"/>
-          <w:lang w:val="en-US"/>
-        </w:rPr>
-        <w:t>古筝</w:t>
-      </w:r>
-      <w:r>
-        <w:rPr>
-          <w:rFonts w:ascii="Noto Serif" w:eastAsia="Noto Serif SC" w:hAnsi="Noto Serif" w:cs="Noto Serif"/>
-          <w:sz w:val="24"/>
-          <w:szCs w:val="24"/>
-          <w:lang w:val="en-US"/>
-        </w:rPr>
-        <w:t xml:space="preserve"> (Guzheng)</w:t>
-      </w:r>
-    </w:p>
-    <w:p>
-      <w:pPr>
-        <w:jc w:val="right"/>
-        <w:rPr>
-          <w:rFonts w:ascii="Noto Serif" w:eastAsia="Noto Serif SC" w:hAnsi="Noto Serif" w:cs="Noto Serif"/>
-          <w:sz w:val="24"/>
-          <w:szCs w:val="24"/>
-          <w:lang w:val="en-US"/>
-        </w:rPr>
-      </w:pPr>
-    </w:p>
-    <w:p>
-      <w:pPr>
-        <w:jc w:val="right"/>
-        <w:rPr>
-          <w:rFonts w:ascii="Noto Serif" w:eastAsia="Noto Serif SC" w:hAnsi="Noto Serif" w:cs="Noto Serif"/>
-          <w:sz w:val="24"/>
-          <w:szCs w:val="24"/>
-          <w:lang w:val="en-US"/>
-        </w:rPr>
-      </w:pPr>
-      <w:r>
-        <w:rPr>
-          <w:rFonts w:ascii="Noto Serif" w:eastAsia="Noto Serif SC" w:hAnsi="Noto Serif" w:cs="Noto Serif" w:hint="eastAsia"/>
-          <w:sz w:val="24"/>
-          <w:szCs w:val="24"/>
-          <w:lang w:val="en-US"/>
-        </w:rPr>
-        <w:t>定音鼓</w:t>
-      </w:r>
-      <w:r>
-        <w:rPr>
-          <w:rFonts w:ascii="Noto Serif" w:eastAsia="Noto Serif SC" w:hAnsi="Noto Serif" w:cs="Noto Serif"/>
-          <w:sz w:val="24"/>
-          <w:szCs w:val="24"/>
-          <w:lang w:val="en-US"/>
-        </w:rPr>
-        <w:t xml:space="preserve"> (Timpani)</w:t>
-      </w:r>
-    </w:p>
-    <w:p>
-      <w:pPr>
-        <w:jc w:val="right"/>
-        <w:rPr>
-          <w:rFonts w:ascii="Noto Serif" w:eastAsia="Noto Serif SC" w:hAnsi="Noto Serif" w:cs="Noto Serif"/>
-          <w:sz w:val="21"/>
-          <w:szCs w:val="21"/>
-          <w:lang w:val="en-US"/>
-        </w:rPr>
-      </w:pPr>
-      <w:r>
-        <w:rPr>
-          <w:rFonts w:ascii="Noto Serif" w:eastAsia="Noto Serif SC" w:hAnsi="Noto Serif" w:cs="Noto Serif" w:hint="eastAsia"/>
-          <w:sz w:val="21"/>
-          <w:szCs w:val="21"/>
-          <w:lang w:val="en-US"/>
-        </w:rPr>
-        <w:t>打击乐</w:t>
-      </w:r>
-      <w:r>
-        <w:rPr>
-          <w:rFonts w:ascii="Noto Serif" w:eastAsia="Noto Serif SC" w:hAnsi="Noto Serif" w:cs="Noto Serif"/>
-          <w:sz w:val="21"/>
-          <w:szCs w:val="21"/>
-          <w:lang w:val="en-US"/>
-        </w:rPr>
-        <w:t xml:space="preserve"> I (Percussion I): </w:t>
-      </w:r>
-      <w:r>
-        <w:rPr>
-          <w:rFonts w:ascii="Noto Serif" w:eastAsia="Noto Serif SC" w:hAnsi="Noto Serif" w:cs="Noto Serif" w:hint="eastAsia"/>
-          <w:sz w:val="21"/>
-          <w:szCs w:val="21"/>
-        </w:rPr>
-        <w:t>管钟</w:t>
-      </w:r>
-      <w:r>
-        <w:rPr>
-          <w:rFonts w:ascii="Noto Serif" w:eastAsia="Noto Serif SC" w:hAnsi="Noto Serif" w:cs="Noto Serif"/>
-          <w:sz w:val="21"/>
-          <w:szCs w:val="21"/>
-        </w:rPr>
-        <w:t xml:space="preserve"> Tubular bells, </w:t>
-      </w:r>
-      <w:r>
-        <w:rPr>
-          <w:rFonts w:ascii="Noto Serif" w:eastAsia="Noto Serif SC" w:hAnsi="Noto Serif" w:cs="Noto Serif" w:hint="eastAsia"/>
-          <w:sz w:val="21"/>
-          <w:szCs w:val="21"/>
-        </w:rPr>
-        <w:t>风锣</w:t>
-      </w:r>
-      <w:r>
-        <w:rPr>
-          <w:rFonts w:ascii="Noto Serif" w:eastAsia="Noto Serif SC" w:hAnsi="Noto Serif" w:cs="Noto Serif"/>
-          <w:sz w:val="21"/>
-          <w:szCs w:val="21"/>
-        </w:rPr>
-        <w:t xml:space="preserve"> </w:t>
-      </w:r>
-      <w:proofErr w:type="spellStart"/>
-      <w:r>
-        <w:rPr>
-          <w:rFonts w:ascii="Noto Serif" w:eastAsia="Noto Serif SC" w:hAnsi="Noto Serif" w:cs="Noto Serif"/>
-          <w:sz w:val="21"/>
-          <w:szCs w:val="21"/>
-        </w:rPr>
-        <w:t>Fengluo</w:t>
-      </w:r>
-      <w:proofErr w:type="spellEnd"/>
-      <w:r>
-        <w:rPr>
-          <w:rFonts w:ascii="Noto Serif" w:eastAsia="Noto Serif SC" w:hAnsi="Noto Serif" w:cs="Noto Serif"/>
-          <w:sz w:val="21"/>
-          <w:szCs w:val="21"/>
-        </w:rPr>
-        <w:t xml:space="preserve">, </w:t>
-      </w:r>
-      <w:r>
-        <w:rPr>
-          <w:rFonts w:ascii="Noto Serif" w:eastAsia="Noto Serif SC" w:hAnsi="Noto Serif" w:cs="Noto Serif" w:hint="eastAsia"/>
-          <w:sz w:val="21"/>
-          <w:szCs w:val="21"/>
-        </w:rPr>
-        <w:t>木琴</w:t>
-      </w:r>
-      <w:r>
-        <w:rPr>
-          <w:rFonts w:ascii="Noto Serif" w:eastAsia="Noto Serif SC" w:hAnsi="Noto Serif" w:cs="Noto Serif"/>
-          <w:sz w:val="21"/>
-          <w:szCs w:val="21"/>
-        </w:rPr>
-        <w:t xml:space="preserve"> Xylophone, </w:t>
-      </w:r>
-      <w:r>
-        <w:rPr>
-          <w:rFonts w:ascii="Noto Serif" w:eastAsia="Noto Serif SC" w:hAnsi="Noto Serif" w:cs="Noto Serif" w:hint="eastAsia"/>
-          <w:sz w:val="21"/>
-          <w:szCs w:val="21"/>
-        </w:rPr>
-        <w:t>颤音琴</w:t>
-      </w:r>
-      <w:r>
-        <w:rPr>
-          <w:rFonts w:ascii="Noto Serif" w:eastAsia="Noto Serif SC" w:hAnsi="Noto Serif" w:cs="Noto Serif"/>
-          <w:sz w:val="21"/>
-          <w:szCs w:val="21"/>
-        </w:rPr>
-        <w:t xml:space="preserve"> Vibraphone</w:t>
-      </w:r>
-    </w:p>
-    <w:p>
-      <w:pPr>
-        <w:jc w:val="right"/>
-        <w:rPr>
-          <w:rFonts w:ascii="Noto Serif" w:eastAsia="Noto Serif SC" w:hAnsi="Noto Serif" w:cs="Noto Serif"/>
-          <w:sz w:val="21"/>
-          <w:szCs w:val="21"/>
-          <w:lang w:val="en-US"/>
-        </w:rPr>
-      </w:pPr>
-      <w:r>
-        <w:rPr>
-          <w:rFonts w:ascii="Noto Serif" w:eastAsia="Noto Serif SC" w:hAnsi="Noto Serif" w:cs="Noto Serif" w:hint="eastAsia"/>
-          <w:sz w:val="21"/>
-          <w:szCs w:val="21"/>
-          <w:lang w:val="en-US"/>
-        </w:rPr>
-        <w:t>打击乐</w:t>
-      </w:r>
-      <w:r>
-        <w:rPr>
-          <w:rFonts w:ascii="Noto Serif" w:eastAsia="Noto Serif SC" w:hAnsi="Noto Serif" w:cs="Noto Serif"/>
-          <w:sz w:val="21"/>
-          <w:szCs w:val="21"/>
-          <w:lang w:val="en-US"/>
-        </w:rPr>
-        <w:t xml:space="preserve"> II (Percussion II): </w:t>
-      </w:r>
-      <w:r>
-        <w:rPr>
-          <w:rFonts w:ascii="Noto Serif" w:eastAsia="Noto Serif SC" w:hAnsi="Noto Serif" w:cs="Noto Serif" w:hint="eastAsia"/>
-          <w:sz w:val="21"/>
-          <w:szCs w:val="21"/>
-        </w:rPr>
-        <w:t>云锣</w:t>
-      </w:r>
-      <w:r>
-        <w:rPr>
-          <w:rFonts w:ascii="Noto Serif" w:eastAsia="Noto Serif SC" w:hAnsi="Noto Serif" w:cs="Noto Serif"/>
-          <w:sz w:val="21"/>
-          <w:szCs w:val="21"/>
-        </w:rPr>
-        <w:t xml:space="preserve"> Yunluo, </w:t>
-      </w:r>
-      <w:r>
-        <w:rPr>
-          <w:rFonts w:ascii="Noto Serif" w:eastAsia="Noto Serif SC" w:hAnsi="Noto Serif" w:cs="Noto Serif" w:hint="eastAsia"/>
-          <w:sz w:val="21"/>
-          <w:szCs w:val="21"/>
-        </w:rPr>
-        <w:t>颤音琴</w:t>
-      </w:r>
-      <w:r>
-        <w:rPr>
-          <w:rFonts w:ascii="Noto Serif" w:eastAsia="Noto Serif SC" w:hAnsi="Noto Serif" w:cs="Noto Serif"/>
-          <w:sz w:val="21"/>
-          <w:szCs w:val="21"/>
-        </w:rPr>
-        <w:t xml:space="preserve"> Vibraphone</w:t>
-      </w:r>
-    </w:p>
-    <w:p>
-      <w:pPr>
-        <w:jc w:val="right"/>
-        <w:rPr>
-          <w:rFonts w:ascii="Noto Serif" w:eastAsia="Noto Serif SC" w:hAnsi="Noto Serif" w:cs="Noto Serif"/>
-          <w:sz w:val="21"/>
-          <w:szCs w:val="21"/>
-        </w:rPr>
-      </w:pPr>
-      <w:r>
-        <w:rPr>
-          <w:rFonts w:ascii="Noto Serif" w:eastAsia="Noto Serif SC" w:hAnsi="Noto Serif" w:cs="Noto Serif" w:hint="eastAsia"/>
-          <w:sz w:val="21"/>
-          <w:szCs w:val="21"/>
-          <w:lang w:val="en-US"/>
-        </w:rPr>
-        <w:t>打击乐</w:t>
-      </w:r>
-      <w:r>
-        <w:rPr>
-          <w:rFonts w:ascii="Noto Serif" w:eastAsia="Noto Serif SC" w:hAnsi="Noto Serif" w:cs="Noto Serif"/>
-          <w:sz w:val="21"/>
-          <w:szCs w:val="21"/>
-          <w:lang w:val="en-US"/>
-        </w:rPr>
-        <w:t xml:space="preserve"> III (Percussion III): </w:t>
-      </w:r>
-      <w:r>
-        <w:rPr>
-          <w:rFonts w:ascii="Noto Serif" w:eastAsia="Noto Serif SC" w:hAnsi="Noto Serif" w:cs="Noto Serif" w:hint="eastAsia"/>
-          <w:sz w:val="21"/>
-          <w:szCs w:val="21"/>
-        </w:rPr>
-        <w:t>大堂鼓</w:t>
-      </w:r>
-      <w:r>
-        <w:rPr>
-          <w:rFonts w:ascii="Noto Serif" w:eastAsia="Noto Serif SC" w:hAnsi="Noto Serif" w:cs="Noto Serif"/>
-          <w:sz w:val="21"/>
-          <w:szCs w:val="21"/>
-        </w:rPr>
-        <w:t xml:space="preserve"> Da </w:t>
-      </w:r>
-      <w:proofErr w:type="spellStart"/>
-      <w:r>
-        <w:rPr>
-          <w:rFonts w:ascii="Noto Serif" w:eastAsia="Noto Serif SC" w:hAnsi="Noto Serif" w:cs="Noto Serif"/>
-          <w:sz w:val="21"/>
-          <w:szCs w:val="21"/>
-        </w:rPr>
-        <w:t>Tanggu</w:t>
-      </w:r>
-      <w:proofErr w:type="spellEnd"/>
-      <w:r>
-        <w:rPr>
-          <w:rFonts w:ascii="Noto Serif" w:eastAsia="Noto Serif SC" w:hAnsi="Noto Serif" w:cs="Noto Serif"/>
-          <w:sz w:val="21"/>
-          <w:szCs w:val="21"/>
-        </w:rPr>
-        <w:t xml:space="preserve">, </w:t>
-      </w:r>
-      <w:r>
-        <w:rPr>
-          <w:rFonts w:ascii="Noto Serif" w:eastAsia="Noto Serif SC" w:hAnsi="Noto Serif" w:cs="Noto Serif" w:hint="eastAsia"/>
-          <w:sz w:val="21"/>
-          <w:szCs w:val="21"/>
-        </w:rPr>
-        <w:t>大小</w:t>
-      </w:r>
-      <w:r>
-        <w:rPr>
-          <w:rFonts w:ascii="Noto Serif" w:eastAsia="Noto Serif SC" w:hAnsi="Noto Serif" w:cs="Noto Serif"/>
-          <w:sz w:val="21"/>
-          <w:szCs w:val="21"/>
-        </w:rPr>
-        <w:t xml:space="preserve"> Flexatone, </w:t>
-      </w:r>
-      <w:r>
-        <w:rPr>
-          <w:rFonts w:ascii="Noto Serif" w:eastAsia="Noto Serif SC" w:hAnsi="Noto Serif" w:cs="Noto Serif" w:hint="eastAsia"/>
-          <w:sz w:val="21"/>
-          <w:szCs w:val="21"/>
-        </w:rPr>
-        <w:t>小风铃</w:t>
-      </w:r>
-      <w:r>
-        <w:rPr>
-          <w:rFonts w:ascii="Noto Serif" w:eastAsia="Noto Serif SC" w:hAnsi="Noto Serif" w:cs="Noto Serif"/>
-          <w:sz w:val="21"/>
-          <w:szCs w:val="21"/>
-        </w:rPr>
-        <w:t xml:space="preserve"> Small Windchimes</w:t>
-      </w:r>
-    </w:p>
-    <w:p>
-      <w:pPr>
-        <w:jc w:val="right"/>
-        <w:rPr>
-          <w:rFonts w:ascii="Noto Serif" w:eastAsia="Noto Serif SC" w:hAnsi="Noto Serif" w:cs="Noto Serif"/>
-          <w:sz w:val="21"/>
-          <w:szCs w:val="21"/>
-          <w:lang w:val="en-US"/>
-        </w:rPr>
-      </w:pPr>
-      <w:r>
-        <w:rPr>
-          <w:rFonts w:ascii="Noto Serif" w:eastAsia="Noto Serif SC" w:hAnsi="Noto Serif" w:cs="Noto Serif" w:hint="eastAsia"/>
-          <w:sz w:val="21"/>
-          <w:szCs w:val="21"/>
-          <w:lang w:val="en-US"/>
-        </w:rPr>
-        <w:t>打击乐</w:t>
-      </w:r>
-      <w:r>
-        <w:rPr>
-          <w:rFonts w:ascii="Noto Serif" w:eastAsia="Noto Serif SC" w:hAnsi="Noto Serif" w:cs="Noto Serif"/>
-          <w:sz w:val="21"/>
-          <w:szCs w:val="21"/>
-          <w:lang w:val="en-US"/>
-        </w:rPr>
-        <w:t xml:space="preserve"> IV (Percussion IV): </w:t>
-      </w:r>
-      <w:r>
-        <w:rPr>
-          <w:rFonts w:ascii="Noto Serif" w:eastAsia="Noto Serif SC" w:hAnsi="Noto Serif" w:cs="Noto Serif" w:hint="eastAsia"/>
-          <w:sz w:val="21"/>
-          <w:szCs w:val="21"/>
-        </w:rPr>
-        <w:t>吊钹</w:t>
-      </w:r>
-      <w:r>
-        <w:rPr>
-          <w:rFonts w:ascii="Noto Serif" w:eastAsia="Noto Serif SC" w:hAnsi="Noto Serif" w:cs="Noto Serif"/>
-          <w:sz w:val="21"/>
-          <w:szCs w:val="21"/>
-        </w:rPr>
-        <w:t xml:space="preserve"> Suspended Cymbals, </w:t>
-      </w:r>
-      <w:r>
-        <w:rPr>
-          <w:rFonts w:ascii="Noto Serif" w:eastAsia="Noto Serif SC" w:hAnsi="Noto Serif" w:cs="Noto Serif" w:hint="eastAsia"/>
-          <w:sz w:val="21"/>
-          <w:szCs w:val="21"/>
-        </w:rPr>
-        <w:t>大小拍颤器</w:t>
-      </w:r>
-      <w:r>
-        <w:rPr>
-          <w:rFonts w:ascii="Noto Serif" w:eastAsia="Noto Serif SC" w:hAnsi="Noto Serif" w:cs="Noto Serif"/>
-          <w:sz w:val="21"/>
-          <w:szCs w:val="21"/>
-        </w:rPr>
-        <w:t xml:space="preserve"> (Large &amp; Small Vibraslap), </w:t>
-      </w:r>
-      <w:r>
-        <w:rPr>
-          <w:rFonts w:ascii="Noto Serif" w:eastAsia="Noto Serif SC" w:hAnsi="Noto Serif" w:cs="Noto Serif" w:hint="eastAsia"/>
-          <w:sz w:val="21"/>
-          <w:szCs w:val="21"/>
-        </w:rPr>
-        <w:t>大堂鼓</w:t>
-      </w:r>
-      <w:r>
-        <w:rPr>
-          <w:rFonts w:ascii="Noto Serif" w:eastAsia="Noto Serif SC" w:hAnsi="Noto Serif" w:cs="Noto Serif"/>
-          <w:sz w:val="21"/>
-          <w:szCs w:val="21"/>
-        </w:rPr>
-        <w:t xml:space="preserve"> Da </w:t>
-      </w:r>
-      <w:proofErr w:type="spellStart"/>
-      <w:r>
-        <w:rPr>
-          <w:rFonts w:ascii="Noto Serif" w:eastAsia="Noto Serif SC" w:hAnsi="Noto Serif" w:cs="Noto Serif"/>
-          <w:sz w:val="21"/>
-          <w:szCs w:val="21"/>
-        </w:rPr>
-        <w:t>Tanggu</w:t>
-      </w:r>
-      <w:proofErr w:type="spellEnd"/>
-      <w:r>
-        <w:rPr>
-          <w:rFonts w:ascii="Noto Serif" w:eastAsia="Noto Serif SC" w:hAnsi="Noto Serif" w:cs="Noto Serif"/>
-          <w:sz w:val="21"/>
-          <w:szCs w:val="21"/>
-        </w:rPr>
-        <w:t xml:space="preserve">, </w:t>
-      </w:r>
-      <w:r>
-        <w:rPr>
-          <w:rFonts w:ascii="Noto Serif" w:eastAsia="Noto Serif SC" w:hAnsi="Noto Serif" w:cs="Noto Serif" w:hint="eastAsia"/>
-          <w:sz w:val="21"/>
-          <w:szCs w:val="21"/>
-        </w:rPr>
-        <w:t>小堂鼓</w:t>
-      </w:r>
-      <w:r>
-        <w:rPr>
-          <w:rFonts w:ascii="Noto Serif" w:eastAsia="Noto Serif SC" w:hAnsi="Noto Serif" w:cs="Noto Serif"/>
-          <w:sz w:val="21"/>
-          <w:szCs w:val="21"/>
-        </w:rPr>
-        <w:t xml:space="preserve"> Xiao </w:t>
-      </w:r>
-      <w:proofErr w:type="spellStart"/>
-      <w:r>
-        <w:rPr>
-          <w:rFonts w:ascii="Noto Serif" w:eastAsia="Noto Serif SC" w:hAnsi="Noto Serif" w:cs="Noto Serif"/>
-          <w:sz w:val="21"/>
-          <w:szCs w:val="21"/>
-        </w:rPr>
-        <w:t>Tanggu</w:t>
-      </w:r>
-      <w:proofErr w:type="spellEnd"/>
-    </w:p>
-    <w:p>
-      <w:pPr>
-        <w:jc w:val="right"/>
-        <w:rPr>
-          <w:rFonts w:ascii="Noto Serif" w:eastAsia="Noto Serif SC" w:hAnsi="Noto Serif" w:cs="Noto Serif"/>
-          <w:sz w:val="21"/>
-          <w:szCs w:val="21"/>
-          <w:lang w:val="en-GB"/>
-        </w:rPr>
-      </w:pPr>
-      <w:r>
-        <w:rPr>
-          <w:rFonts w:ascii="Noto Serif" w:eastAsia="Noto Serif SC" w:hAnsi="Noto Serif" w:cs="Noto Serif" w:hint="eastAsia"/>
-          <w:sz w:val="21"/>
-          <w:szCs w:val="21"/>
-          <w:lang w:val="en-US"/>
-        </w:rPr>
-        <w:t>打击乐</w:t>
-      </w:r>
-      <w:r>
-        <w:rPr>
-          <w:rFonts w:ascii="Noto Serif" w:eastAsia="Noto Serif SC" w:hAnsi="Noto Serif" w:cs="Noto Serif"/>
-          <w:sz w:val="21"/>
-          <w:szCs w:val="21"/>
-          <w:lang w:val="en-US"/>
-        </w:rPr>
-        <w:t xml:space="preserve"> V (Percussion V): </w:t>
-      </w:r>
-      <w:r>
-        <w:rPr>
-          <w:rFonts w:ascii="Noto Serif" w:eastAsia="Noto Serif SC" w:hAnsi="Noto Serif" w:cs="Noto Serif" w:hint="eastAsia"/>
-          <w:sz w:val="21"/>
-          <w:szCs w:val="21"/>
-        </w:rPr>
-        <w:t>板鼓</w:t>
-      </w:r>
-      <w:r>
-        <w:rPr>
-          <w:rFonts w:ascii="Noto Serif" w:eastAsia="Noto Serif SC" w:hAnsi="Noto Serif" w:cs="Noto Serif"/>
-          <w:sz w:val="21"/>
-          <w:szCs w:val="21"/>
-        </w:rPr>
-        <w:t xml:space="preserve"> Bangu, </w:t>
-      </w:r>
-      <w:r>
-        <w:rPr>
-          <w:rFonts w:ascii="Noto Serif" w:eastAsia="Noto Serif SC" w:hAnsi="Noto Serif" w:cs="Noto Serif" w:hint="eastAsia"/>
-          <w:sz w:val="21"/>
-          <w:szCs w:val="21"/>
-        </w:rPr>
-        <w:t>弹簧鼓</w:t>
-      </w:r>
-      <w:r>
-        <w:rPr>
-          <w:rFonts w:ascii="Noto Serif" w:eastAsia="Noto Serif SC" w:hAnsi="Noto Serif" w:cs="Noto Serif"/>
-          <w:sz w:val="21"/>
-          <w:szCs w:val="21"/>
-          <w:lang w:val="en-GB"/>
-        </w:rPr>
-        <w:t xml:space="preserve"> </w:t>
-      </w:r>
-      <w:r>
-        <w:rPr>
-          <w:rFonts w:ascii="Noto Serif" w:eastAsia="Noto Serif SC" w:hAnsi="Noto Serif" w:cs="Noto Serif"/>
-          <w:sz w:val="21"/>
-          <w:szCs w:val="21"/>
-        </w:rPr>
-        <w:t xml:space="preserve">Thunder tube, </w:t>
-      </w:r>
-      <w:r>
-        <w:rPr>
-          <w:rFonts w:ascii="Noto Serif" w:eastAsia="Noto Serif SC" w:hAnsi="Noto Serif" w:cs="Noto Serif" w:hint="eastAsia"/>
-          <w:sz w:val="21"/>
-          <w:szCs w:val="21"/>
-        </w:rPr>
-        <w:t>拍板</w:t>
-      </w:r>
-      <w:r>
-        <w:rPr>
-          <w:rFonts w:ascii="Noto Serif" w:eastAsia="Noto Serif SC" w:hAnsi="Noto Serif" w:cs="Noto Serif"/>
-          <w:sz w:val="21"/>
-          <w:szCs w:val="21"/>
-        </w:rPr>
-        <w:t xml:space="preserve"> Paiban, </w:t>
-      </w:r>
-      <w:r>
-        <w:rPr>
-          <w:rFonts w:ascii="Noto Serif" w:eastAsia="Noto Serif SC" w:hAnsi="Noto Serif" w:cs="Noto Serif" w:hint="eastAsia"/>
-          <w:sz w:val="21"/>
-          <w:szCs w:val="21"/>
-        </w:rPr>
-        <w:t>狮钹</w:t>
-      </w:r>
-      <w:r>
-        <w:rPr>
-          <w:rFonts w:ascii="Noto Serif" w:eastAsia="Noto Serif SC" w:hAnsi="Noto Serif" w:cs="Noto Serif"/>
-          <w:sz w:val="21"/>
-          <w:szCs w:val="21"/>
-        </w:rPr>
-        <w:t xml:space="preserve"> </w:t>
-      </w:r>
-      <w:proofErr w:type="spellStart"/>
-      <w:r>
-        <w:rPr>
-          <w:rFonts w:ascii="Noto Serif" w:eastAsia="Noto Serif SC" w:hAnsi="Noto Serif" w:cs="Noto Serif"/>
-          <w:sz w:val="21"/>
-          <w:szCs w:val="21"/>
-        </w:rPr>
-        <w:t>Shibo</w:t>
-      </w:r>
-      <w:proofErr w:type="spellEnd"/>
-      <w:r>
-        <w:rPr>
-          <w:rFonts w:ascii="Noto Serif" w:eastAsia="Noto Serif SC" w:hAnsi="Noto Serif" w:cs="Noto Serif"/>
-          <w:sz w:val="21"/>
-          <w:szCs w:val="21"/>
-        </w:rPr>
-        <w:t xml:space="preserve">, </w:t>
-      </w:r>
-      <w:r>
-        <w:rPr>
-          <w:rFonts w:ascii="Noto Serif" w:eastAsia="Noto Serif SC" w:hAnsi="Noto Serif" w:cs="Noto Serif" w:hint="eastAsia"/>
-          <w:sz w:val="21"/>
-          <w:szCs w:val="21"/>
-        </w:rPr>
-        <w:t>低音木鱼</w:t>
-      </w:r>
-      <w:r>
-        <w:rPr>
-          <w:rFonts w:ascii="Noto Serif" w:eastAsia="Noto Serif SC" w:hAnsi="Noto Serif" w:cs="Noto Serif"/>
-          <w:sz w:val="21"/>
-          <w:szCs w:val="21"/>
-        </w:rPr>
-        <w:t xml:space="preserve"> Low Wooden Fish, </w:t>
-      </w:r>
-      <w:r>
-        <w:rPr>
-          <w:rFonts w:ascii="Noto Serif" w:eastAsia="Noto Serif SC" w:hAnsi="Noto Serif" w:cs="Noto Serif" w:hint="eastAsia"/>
-          <w:sz w:val="21"/>
-          <w:szCs w:val="21"/>
-        </w:rPr>
-        <w:t>小木铃</w:t>
-      </w:r>
-      <w:r>
-        <w:rPr>
-          <w:rFonts w:ascii="Noto Serif" w:eastAsia="Noto Serif SC" w:hAnsi="Noto Serif" w:cs="Noto Serif"/>
-          <w:sz w:val="21"/>
-          <w:szCs w:val="21"/>
-        </w:rPr>
-        <w:t xml:space="preserve"> </w:t>
-      </w:r>
-      <w:proofErr w:type="spellStart"/>
-      <w:r>
-        <w:rPr>
-          <w:rFonts w:ascii="Noto Serif" w:eastAsia="Noto Serif SC" w:hAnsi="Noto Serif" w:cs="Noto Serif"/>
-          <w:sz w:val="21"/>
-          <w:szCs w:val="21"/>
-        </w:rPr>
-        <w:t>Woodchimes</w:t>
-      </w:r>
-      <w:proofErr w:type="spellEnd"/>
-    </w:p>
-    <w:p>
-      <w:pPr>
-        <w:jc w:val="right"/>
-        <w:rPr>
-          <w:rFonts w:ascii="Noto Serif" w:eastAsia="Noto Serif SC" w:hAnsi="Noto Serif" w:cs="Noto Serif"/>
-          <w:sz w:val="21"/>
-          <w:szCs w:val="21"/>
-          <w:lang w:val="en-US"/>
-        </w:rPr>
-      </w:pPr>
-      <w:r>
-        <w:rPr>
-          <w:rFonts w:ascii="Noto Serif" w:eastAsia="Noto Serif SC" w:hAnsi="Noto Serif" w:cs="Noto Serif" w:hint="eastAsia"/>
-          <w:sz w:val="21"/>
-          <w:szCs w:val="21"/>
-          <w:lang w:val="en-US"/>
-        </w:rPr>
-        <w:t>打击乐</w:t>
-      </w:r>
-      <w:r>
-        <w:rPr>
-          <w:rFonts w:ascii="Noto Serif" w:eastAsia="Noto Serif SC" w:hAnsi="Noto Serif" w:cs="Noto Serif"/>
-          <w:sz w:val="21"/>
-          <w:szCs w:val="21"/>
-          <w:lang w:val="en-US"/>
-        </w:rPr>
-        <w:t xml:space="preserve"> VI (Percussion VI): </w:t>
-      </w:r>
-      <w:r>
-        <w:rPr>
-          <w:rFonts w:ascii="Noto Serif" w:eastAsia="Noto Serif SC" w:hAnsi="Noto Serif" w:cs="Noto Serif" w:hint="eastAsia"/>
-          <w:sz w:val="21"/>
-          <w:szCs w:val="21"/>
-        </w:rPr>
-        <w:t>低音军鼓</w:t>
-      </w:r>
-      <w:r>
-        <w:rPr>
-          <w:rFonts w:ascii="Noto Serif" w:eastAsia="Noto Serif SC" w:hAnsi="Noto Serif" w:cs="Noto Serif"/>
-          <w:sz w:val="21"/>
-          <w:szCs w:val="21"/>
-        </w:rPr>
-        <w:t xml:space="preserve"> </w:t>
-      </w:r>
-      <w:proofErr w:type="spellStart"/>
-      <w:r>
-        <w:rPr>
-          <w:rFonts w:ascii="Noto Serif" w:eastAsia="Noto Serif SC" w:hAnsi="Noto Serif" w:cs="Noto Serif"/>
-          <w:sz w:val="21"/>
-          <w:szCs w:val="21"/>
-        </w:rPr>
-        <w:t>Diyin</w:t>
-      </w:r>
-      <w:proofErr w:type="spellEnd"/>
-      <w:r>
-        <w:rPr>
-          <w:rFonts w:ascii="Noto Serif" w:eastAsia="Noto Serif SC" w:hAnsi="Noto Serif" w:cs="Noto Serif"/>
-          <w:sz w:val="21"/>
-          <w:szCs w:val="21"/>
-        </w:rPr>
-        <w:t xml:space="preserve"> </w:t>
-      </w:r>
-      <w:proofErr w:type="spellStart"/>
-      <w:r>
-        <w:rPr>
-          <w:rFonts w:ascii="Noto Serif" w:eastAsia="Noto Serif SC" w:hAnsi="Noto Serif" w:cs="Noto Serif"/>
-          <w:sz w:val="21"/>
-          <w:szCs w:val="21"/>
-        </w:rPr>
-        <w:t>Jungu</w:t>
-      </w:r>
-      <w:proofErr w:type="spellEnd"/>
-      <w:r>
-        <w:rPr>
-          <w:rFonts w:ascii="Noto Serif" w:eastAsia="Noto Serif SC" w:hAnsi="Noto Serif" w:cs="Noto Serif"/>
-          <w:sz w:val="21"/>
-          <w:szCs w:val="21"/>
-        </w:rPr>
-        <w:t xml:space="preserve">, </w:t>
-      </w:r>
-      <w:r>
-        <w:rPr>
-          <w:rFonts w:ascii="Noto Serif" w:eastAsia="Noto Serif SC" w:hAnsi="Noto Serif" w:cs="Noto Serif" w:hint="eastAsia"/>
-          <w:sz w:val="21"/>
-          <w:szCs w:val="21"/>
-        </w:rPr>
-        <w:t>狮钹</w:t>
-      </w:r>
-      <w:r>
-        <w:rPr>
-          <w:rFonts w:ascii="Noto Serif" w:eastAsia="Noto Serif SC" w:hAnsi="Noto Serif" w:cs="Noto Serif"/>
-          <w:sz w:val="21"/>
-          <w:szCs w:val="21"/>
-        </w:rPr>
-        <w:t xml:space="preserve"> </w:t>
-      </w:r>
-      <w:proofErr w:type="spellStart"/>
-      <w:r>
-        <w:rPr>
-          <w:rFonts w:ascii="Noto Serif" w:eastAsia="Noto Serif SC" w:hAnsi="Noto Serif" w:cs="Noto Serif"/>
-          <w:sz w:val="21"/>
-          <w:szCs w:val="21"/>
-        </w:rPr>
-        <w:t>Shibo</w:t>
-      </w:r>
-      <w:proofErr w:type="spellEnd"/>
-      <w:r>
-        <w:rPr>
-          <w:rFonts w:ascii="Noto Serif" w:eastAsia="Noto Serif SC" w:hAnsi="Noto Serif" w:cs="Noto Serif"/>
-          <w:sz w:val="21"/>
-          <w:szCs w:val="21"/>
-        </w:rPr>
-        <w:t xml:space="preserve">, </w:t>
-      </w:r>
-      <w:r>
-        <w:rPr>
-          <w:rFonts w:ascii="Noto Serif" w:eastAsia="Noto Serif SC" w:hAnsi="Noto Serif" w:cs="Noto Serif" w:hint="eastAsia"/>
-          <w:sz w:val="21"/>
-          <w:szCs w:val="21"/>
-        </w:rPr>
-        <w:t>高音木鱼</w:t>
-      </w:r>
-      <w:r>
-        <w:rPr>
-          <w:rFonts w:ascii="Noto Serif" w:eastAsia="Noto Serif SC" w:hAnsi="Noto Serif" w:cs="Noto Serif"/>
-          <w:sz w:val="21"/>
-          <w:szCs w:val="21"/>
-        </w:rPr>
-        <w:t xml:space="preserve"> High Wooden Fish, </w:t>
-      </w:r>
-      <w:r>
-        <w:rPr>
-          <w:rFonts w:ascii="Noto Serif" w:eastAsia="Noto Serif SC" w:hAnsi="Noto Serif" w:cs="Noto Serif" w:hint="eastAsia"/>
-          <w:sz w:val="21"/>
-          <w:szCs w:val="21"/>
-        </w:rPr>
-        <w:t>狮钹</w:t>
-      </w:r>
-      <w:r>
-        <w:rPr>
-          <w:rFonts w:ascii="Noto Serif" w:eastAsia="Noto Serif SC" w:hAnsi="Noto Serif" w:cs="Noto Serif"/>
-          <w:sz w:val="21"/>
-          <w:szCs w:val="21"/>
-        </w:rPr>
-        <w:t xml:space="preserve"> </w:t>
-      </w:r>
-      <w:proofErr w:type="spellStart"/>
-      <w:r>
-        <w:rPr>
-          <w:rFonts w:ascii="Noto Serif" w:eastAsia="Noto Serif SC" w:hAnsi="Noto Serif" w:cs="Noto Serif"/>
-          <w:sz w:val="21"/>
-          <w:szCs w:val="21"/>
-        </w:rPr>
-        <w:t>Shibo</w:t>
-      </w:r>
-      <w:proofErr w:type="spellEnd"/>
-      <w:r>
-        <w:rPr>
-          <w:rFonts w:ascii="Noto Serif" w:eastAsia="Noto Serif SC" w:hAnsi="Noto Serif" w:cs="Noto Serif"/>
-          <w:sz w:val="21"/>
-          <w:szCs w:val="21"/>
-        </w:rPr>
-        <w:t xml:space="preserve">, </w:t>
-      </w:r>
-      <w:r>
-        <w:rPr>
-          <w:rFonts w:ascii="Noto Serif" w:eastAsia="Noto Serif SC" w:hAnsi="Noto Serif" w:cs="Noto Serif" w:hint="eastAsia"/>
-          <w:sz w:val="21"/>
-          <w:szCs w:val="21"/>
-        </w:rPr>
-        <w:t>军钹</w:t>
-      </w:r>
-      <w:r>
-        <w:rPr>
-          <w:rFonts w:ascii="Noto Serif" w:eastAsia="Noto Serif SC" w:hAnsi="Noto Serif" w:cs="Noto Serif"/>
-          <w:sz w:val="21"/>
-          <w:szCs w:val="21"/>
-        </w:rPr>
-        <w:t xml:space="preserve"> </w:t>
-      </w:r>
-      <w:proofErr w:type="spellStart"/>
-      <w:r>
-        <w:rPr>
-          <w:rFonts w:ascii="Noto Serif" w:eastAsia="Noto Serif SC" w:hAnsi="Noto Serif" w:cs="Noto Serif"/>
-          <w:sz w:val="21"/>
-          <w:szCs w:val="21"/>
-        </w:rPr>
-        <w:t>Junbo</w:t>
-      </w:r>
-      <w:proofErr w:type="spellEnd"/>
-    </w:p>
-    <w:p>
-      <w:pPr>
-        <w:jc w:val="right"/>
-        <w:rPr>
-          <w:rFonts w:ascii="Noto Serif" w:eastAsia="Noto Serif SC" w:hAnsi="Noto Serif" w:cs="Noto Serif"/>
-          <w:sz w:val="21"/>
-          <w:szCs w:val="21"/>
-          <w:lang w:val="en-US"/>
-        </w:rPr>
-      </w:pPr>
-      <w:r>
-        <w:rPr>
-          <w:rFonts w:ascii="Noto Serif" w:eastAsia="Noto Serif SC" w:hAnsi="Noto Serif" w:cs="Noto Serif" w:hint="eastAsia"/>
-          <w:sz w:val="21"/>
-          <w:szCs w:val="21"/>
-          <w:lang w:val="en-US"/>
-        </w:rPr>
-        <w:t>打击乐</w:t>
-      </w:r>
-      <w:r>
-        <w:rPr>
-          <w:rFonts w:ascii="Noto Serif" w:eastAsia="Noto Serif SC" w:hAnsi="Noto Serif" w:cs="Noto Serif"/>
-          <w:sz w:val="21"/>
-          <w:szCs w:val="21"/>
-          <w:lang w:val="en-US"/>
-        </w:rPr>
-        <w:t xml:space="preserve"> VII (Percussion VII): </w:t>
-      </w:r>
-      <w:r>
-        <w:rPr>
-          <w:rFonts w:ascii="Noto Serif" w:eastAsia="Noto Serif SC" w:hAnsi="Noto Serif" w:cs="Noto Serif" w:hint="eastAsia"/>
-          <w:sz w:val="21"/>
-          <w:szCs w:val="21"/>
-        </w:rPr>
-        <w:t>拍板</w:t>
-      </w:r>
-      <w:r>
-        <w:rPr>
-          <w:rFonts w:ascii="Noto Serif" w:eastAsia="Noto Serif SC" w:hAnsi="Noto Serif" w:cs="Noto Serif"/>
-          <w:sz w:val="21"/>
-          <w:szCs w:val="21"/>
-          <w:lang w:val="en-GB"/>
-        </w:rPr>
-        <w:t xml:space="preserve"> </w:t>
-      </w:r>
       <w:r>
         <w:rPr>
           <w:rFonts w:ascii="Noto Serif" w:eastAsia="Noto Serif SC" w:hAnsi="Noto Serif" w:cs="Noto Serif"/>
@@ -4970,43 +4237,7 @@
           <w:sz w:val="21"/>
           <w:szCs w:val="21"/>
         </w:rPr>
-        <w:t xml:space="preserve"> </w:t>
-      </w:r>
-      <w:proofErr w:type="spellStart"/>
-      <w:r>
-        <w:rPr>
-          <w:rFonts w:ascii="Noto Serif" w:eastAsia="Noto Serif SC" w:hAnsi="Noto Serif" w:cs="Noto Serif"/>
-          <w:sz w:val="21"/>
-          <w:szCs w:val="21"/>
-        </w:rPr>
-        <w:t>Diyin</w:t>
-      </w:r>
-      <w:proofErr w:type="spellEnd"/>
-      <w:r>
-        <w:rPr>
-          <w:rFonts w:ascii="Noto Serif" w:eastAsia="Noto Serif SC" w:hAnsi="Noto Serif" w:cs="Noto Serif"/>
-          <w:sz w:val="21"/>
-          <w:szCs w:val="21"/>
-        </w:rPr>
-        <w:t xml:space="preserve"> </w:t>
-      </w:r>
-      <w:proofErr w:type="spellStart"/>
-      <w:r>
-        <w:rPr>
-          <w:rFonts w:ascii="Noto Serif" w:eastAsia="Noto Serif SC" w:hAnsi="Noto Serif" w:cs="Noto Serif"/>
-          <w:sz w:val="21"/>
-          <w:szCs w:val="21"/>
-        </w:rPr>
-        <w:t>Daluo</w:t>
-      </w:r>
-      <w:proofErr w:type="spellEnd"/>
-      <w:r>
-        <w:rPr>
-          <w:rFonts w:ascii="Noto Serif" w:eastAsia="Noto Serif SC" w:hAnsi="Noto Serif" w:cs="Noto Serif"/>
-          <w:sz w:val="21"/>
-          <w:szCs w:val="21"/>
-        </w:rPr>
-        <w:t xml:space="preserve">, </w:t>
+        <w:t xml:space="preserve"> Diyin Daluo, </w:t>
       </w:r>
       <w:r>
         <w:rPr>
@@ -5022,25 +4253,7 @@
           <w:sz w:val="21"/>
           <w:szCs w:val="21"/>
         </w:rPr>
-        <w:t xml:space="preserve"> Gao </w:t>
-      </w:r>
-      <w:proofErr w:type="spellStart"/>
-      <w:r>
-        <w:rPr>
-          <w:rFonts w:ascii="Noto Serif" w:eastAsia="Noto Serif SC" w:hAnsi="Noto Serif" w:cs="Noto Serif"/>
-          <w:sz w:val="21"/>
-          <w:szCs w:val="21"/>
-        </w:rPr>
-        <w:t>Bianluo</w:t>
-      </w:r>
-      <w:proofErr w:type="spellEnd"/>
-      <w:r>
-        <w:rPr>
-          <w:rFonts w:ascii="Noto Serif" w:eastAsia="Noto Serif SC" w:hAnsi="Noto Serif" w:cs="Noto Serif"/>
-          <w:sz w:val="21"/>
-          <w:szCs w:val="21"/>
-        </w:rPr>
-        <w:t xml:space="preserve">, </w:t>
+        <w:t xml:space="preserve"> Gao Bianluo, </w:t>
       </w:r>
       <w:r>
         <w:rPr>

</xml_diff>

<commit_message>
Minor edits to piece 9, Fixed errors in 7, 9 front matter
</commit_message>
<xml_diff>
--- a/Front Matter/Template/7_Front-Matter_Template-v5.docx
+++ b/Front Matter/Template/7_Front-Matter_Template-v5.docx
@@ -274,7 +274,25 @@
           <w:sz w:val="40"/>
           <w:szCs w:val="96"/>
         </w:rPr>
-        <w:t>Fung Dic-Lun</w:t>
+        <w:t xml:space="preserve">Fung </w:t>
+      </w:r>
+      <w:proofErr w:type="spellStart"/>
+      <w:r>
+        <w:rPr>
+          <w:rFonts w:ascii="Noto Serif" w:eastAsia="Noto Serif SC" w:hAnsi="Noto Serif" w:cs="Noto Serif"/>
+          <w:sz w:val="40"/>
+          <w:szCs w:val="96"/>
+        </w:rPr>
+        <w:t>Dic</w:t>
+      </w:r>
+      <w:proofErr w:type="spellEnd"/>
+      <w:r>
+        <w:rPr>
+          <w:rFonts w:ascii="Noto Serif" w:eastAsia="Noto Serif SC" w:hAnsi="Noto Serif" w:cs="Noto Serif"/>
+          <w:sz w:val="40"/>
+          <w:szCs w:val="96"/>
+        </w:rPr>
+        <w:t>-Lun</w:t>
       </w:r>
     </w:p>
     <w:p>
@@ -1005,7 +1023,25 @@
           <w:sz w:val="40"/>
           <w:szCs w:val="96"/>
         </w:rPr>
-        <w:t>Fung Dic-Lun</w:t>
+        <w:t xml:space="preserve">Fung </w:t>
+      </w:r>
+      <w:proofErr w:type="spellStart"/>
+      <w:r>
+        <w:rPr>
+          <w:rFonts w:ascii="Noto Serif" w:eastAsia="Noto Serif SC" w:hAnsi="Noto Serif" w:cs="Noto Serif"/>
+          <w:sz w:val="40"/>
+          <w:szCs w:val="96"/>
+        </w:rPr>
+        <w:t>Dic</w:t>
+      </w:r>
+      <w:proofErr w:type="spellEnd"/>
+      <w:r>
+        <w:rPr>
+          <w:rFonts w:ascii="Noto Serif" w:eastAsia="Noto Serif SC" w:hAnsi="Noto Serif" w:cs="Noto Serif"/>
+          <w:sz w:val="40"/>
+          <w:szCs w:val="96"/>
+        </w:rPr>
+        <w:t>-Lun</w:t>
       </w:r>
     </w:p>
     <w:p>
@@ -1870,7 +1906,6 @@
     <w:p>
       <w:pPr>
         <w:spacing w:after="640"/>
-        <w:jc w:val="right"/>
         <w:rPr>
           <w:rFonts w:ascii="Noto Serif" w:eastAsia="Noto Serif SC" w:hAnsi="Noto Serif" w:cs="Noto Serif"/>
           <w:b/>
@@ -2160,8 +2195,19 @@
           <w:szCs w:val="24"/>
           <w:lang w:val="en-US"/>
         </w:rPr>
-        <w:t>Ensemble Gending</w:t>
-      </w:r>
+        <w:t xml:space="preserve">Ensemble </w:t>
+      </w:r>
+      <w:proofErr w:type="spellStart"/>
+      <w:r>
+        <w:rPr>
+          <w:rFonts w:ascii="Noto Serif" w:eastAsia="Noto Serif SC" w:hAnsi="Noto Serif" w:cs="Noto Serif"/>
+          <w:sz w:val="24"/>
+          <w:szCs w:val="24"/>
+          <w:lang w:val="en-US"/>
+        </w:rPr>
+        <w:t>Gending</w:t>
+      </w:r>
+      <w:proofErr w:type="spellEnd"/>
       <w:r>
         <w:rPr>
           <w:rFonts w:ascii="Noto Serif" w:eastAsia="Noto Serif SC" w:hAnsi="Noto Serif" w:cs="Noto Serif" w:hint="eastAsia"/>
@@ -2333,7 +2379,47 @@
           <w:szCs w:val="24"/>
           <w:lang w:val="en-US"/>
         </w:rPr>
-        <w:t>Fung Dic-Lun is a PhD student (Music Composition) under the supervision of Prof. CHAN Hing-yan at the University of Hong Kong, where he received his M. Phil., and B. A. degree (Music – First Class Honors).</w:t>
+        <w:t xml:space="preserve">Fung </w:t>
+      </w:r>
+      <w:proofErr w:type="spellStart"/>
+      <w:r>
+        <w:rPr>
+          <w:rFonts w:ascii="Noto Serif" w:eastAsia="Noto Serif SC" w:hAnsi="Noto Serif" w:cs="Noto Serif"/>
+          <w:sz w:val="24"/>
+          <w:szCs w:val="24"/>
+          <w:lang w:val="en-US"/>
+        </w:rPr>
+        <w:t>Dic</w:t>
+      </w:r>
+      <w:proofErr w:type="spellEnd"/>
+      <w:r>
+        <w:rPr>
+          <w:rFonts w:ascii="Noto Serif" w:eastAsia="Noto Serif SC" w:hAnsi="Noto Serif" w:cs="Noto Serif"/>
+          <w:sz w:val="24"/>
+          <w:szCs w:val="24"/>
+          <w:lang w:val="en-US"/>
+        </w:rPr>
+        <w:t>-Lun is a PhD student (Music Composition) under the supervision of Prof. CHAN Hing-</w:t>
+      </w:r>
+      <w:proofErr w:type="spellStart"/>
+      <w:r>
+        <w:rPr>
+          <w:rFonts w:ascii="Noto Serif" w:eastAsia="Noto Serif SC" w:hAnsi="Noto Serif" w:cs="Noto Serif"/>
+          <w:sz w:val="24"/>
+          <w:szCs w:val="24"/>
+          <w:lang w:val="en-US"/>
+        </w:rPr>
+        <w:t>yan</w:t>
+      </w:r>
+      <w:proofErr w:type="spellEnd"/>
+      <w:r>
+        <w:rPr>
+          <w:rFonts w:ascii="Noto Serif" w:eastAsia="Noto Serif SC" w:hAnsi="Noto Serif" w:cs="Noto Serif"/>
+          <w:sz w:val="24"/>
+          <w:szCs w:val="24"/>
+          <w:lang w:val="en-US"/>
+        </w:rPr>
+        <w:t xml:space="preserve"> at the University of Hong Kong, where he received his M. Phil., and B. A. degree (Music – First Class Honors).</w:t>
       </w:r>
       <w:r>
         <w:rPr>
@@ -2373,7 +2459,47 @@
           <w:szCs w:val="24"/>
           <w:lang w:val="en-US"/>
         </w:rPr>
-        <w:t>Fung has exposed to Chinese music since young, and his interest further expands into ethnic music. Being well-known for composing with mixed use of ethnic and Western instruments, and unconventional instrumentations, he has achieved several international awards: 2nd prize in Sayat Nova International Composition Competition (2014), honourable mention in Atlas Ensemble Composition Competition (2014), 3rd runner-up in the 10th Luxembourg Sinfonietta International Composition Prize (2013), etc. His works are heard in both international and local concerts, including Croatia, Germany, the Netherlands, U. S. A., Russia, South Korea, and Indonesia; also, in renowned festivals ISCM – WMD and International Gaudeamus Music Week.</w:t>
+        <w:t xml:space="preserve">Fung has exposed to Chinese music since young, and his interest further expands into ethnic music. Being well-known for composing with mixed use of ethnic and Western instruments, and unconventional instrumentations, he has achieved several international awards: 2nd prize in </w:t>
+      </w:r>
+      <w:proofErr w:type="spellStart"/>
+      <w:r>
+        <w:rPr>
+          <w:rFonts w:ascii="Noto Serif" w:eastAsia="Noto Serif SC" w:hAnsi="Noto Serif" w:cs="Noto Serif"/>
+          <w:sz w:val="24"/>
+          <w:szCs w:val="24"/>
+          <w:lang w:val="en-US"/>
+        </w:rPr>
+        <w:t>Sayat</w:t>
+      </w:r>
+      <w:proofErr w:type="spellEnd"/>
+      <w:r>
+        <w:rPr>
+          <w:rFonts w:ascii="Noto Serif" w:eastAsia="Noto Serif SC" w:hAnsi="Noto Serif" w:cs="Noto Serif"/>
+          <w:sz w:val="24"/>
+          <w:szCs w:val="24"/>
+          <w:lang w:val="en-US"/>
+        </w:rPr>
+        <w:t xml:space="preserve"> Nova International Composition Competition (2014), </w:t>
+      </w:r>
+      <w:proofErr w:type="spellStart"/>
+      <w:r>
+        <w:rPr>
+          <w:rFonts w:ascii="Noto Serif" w:eastAsia="Noto Serif SC" w:hAnsi="Noto Serif" w:cs="Noto Serif"/>
+          <w:sz w:val="24"/>
+          <w:szCs w:val="24"/>
+          <w:lang w:val="en-US"/>
+        </w:rPr>
+        <w:t>honourable</w:t>
+      </w:r>
+      <w:proofErr w:type="spellEnd"/>
+      <w:r>
+        <w:rPr>
+          <w:rFonts w:ascii="Noto Serif" w:eastAsia="Noto Serif SC" w:hAnsi="Noto Serif" w:cs="Noto Serif"/>
+          <w:sz w:val="24"/>
+          <w:szCs w:val="24"/>
+          <w:lang w:val="en-US"/>
+        </w:rPr>
+        <w:t xml:space="preserve"> mention in Atlas Ensemble Composition Competition (2014), 3rd runner-up in the 10th Luxembourg Sinfonietta International Composition Prize (2013), etc. His works are heard in both international and local concerts, including Croatia, Germany, the Netherlands, U. S. A., Russia, South Korea, and Indonesia; also, in renowned festivals ISCM – WMD and International Gaudeamus Music Week.</w:t>
       </w:r>
       <w:r>
         <w:rPr>
@@ -2413,7 +2539,67 @@
           <w:szCs w:val="24"/>
           <w:lang w:val="en-US"/>
         </w:rPr>
-        <w:t>Fung’s works have been performed by guanzi virtuoso Guo Ya-zhi, 4 Gig Heads Percussion Group, Ensemble Gending, HRT Tamburitza Orchestra, Atlas Ensemble, International Ensemble Modern Academy, Hong Kong New Music Ensemble, Hong Kong Chinese Orchestra, Luxembourg Sinfonietta, and Ensemble Proton Bern.  As the only composer from Hong Kong, FUNG is invited to write a new work for EXPO Milano 2015’s project “Feeding Music.”</w:t>
+        <w:t xml:space="preserve">Fung’s works have been performed by </w:t>
+      </w:r>
+      <w:proofErr w:type="spellStart"/>
+      <w:r>
+        <w:rPr>
+          <w:rFonts w:ascii="Noto Serif" w:eastAsia="Noto Serif SC" w:hAnsi="Noto Serif" w:cs="Noto Serif"/>
+          <w:sz w:val="24"/>
+          <w:szCs w:val="24"/>
+          <w:lang w:val="en-US"/>
+        </w:rPr>
+        <w:t>guanzi</w:t>
+      </w:r>
+      <w:proofErr w:type="spellEnd"/>
+      <w:r>
+        <w:rPr>
+          <w:rFonts w:ascii="Noto Serif" w:eastAsia="Noto Serif SC" w:hAnsi="Noto Serif" w:cs="Noto Serif"/>
+          <w:sz w:val="24"/>
+          <w:szCs w:val="24"/>
+          <w:lang w:val="en-US"/>
+        </w:rPr>
+        <w:t xml:space="preserve"> virtuoso Guo Ya-</w:t>
+      </w:r>
+      <w:proofErr w:type="spellStart"/>
+      <w:r>
+        <w:rPr>
+          <w:rFonts w:ascii="Noto Serif" w:eastAsia="Noto Serif SC" w:hAnsi="Noto Serif" w:cs="Noto Serif"/>
+          <w:sz w:val="24"/>
+          <w:szCs w:val="24"/>
+          <w:lang w:val="en-US"/>
+        </w:rPr>
+        <w:t>zhi</w:t>
+      </w:r>
+      <w:proofErr w:type="spellEnd"/>
+      <w:r>
+        <w:rPr>
+          <w:rFonts w:ascii="Noto Serif" w:eastAsia="Noto Serif SC" w:hAnsi="Noto Serif" w:cs="Noto Serif"/>
+          <w:sz w:val="24"/>
+          <w:szCs w:val="24"/>
+          <w:lang w:val="en-US"/>
+        </w:rPr>
+        <w:t xml:space="preserve">, 4 Gig Heads Percussion Group, Ensemble </w:t>
+      </w:r>
+      <w:proofErr w:type="spellStart"/>
+      <w:r>
+        <w:rPr>
+          <w:rFonts w:ascii="Noto Serif" w:eastAsia="Noto Serif SC" w:hAnsi="Noto Serif" w:cs="Noto Serif"/>
+          <w:sz w:val="24"/>
+          <w:szCs w:val="24"/>
+          <w:lang w:val="en-US"/>
+        </w:rPr>
+        <w:t>Gending</w:t>
+      </w:r>
+      <w:proofErr w:type="spellEnd"/>
+      <w:r>
+        <w:rPr>
+          <w:rFonts w:ascii="Noto Serif" w:eastAsia="Noto Serif SC" w:hAnsi="Noto Serif" w:cs="Noto Serif"/>
+          <w:sz w:val="24"/>
+          <w:szCs w:val="24"/>
+          <w:lang w:val="en-US"/>
+        </w:rPr>
+        <w:t>, HRT Tamburitza Orchestra, Atlas Ensemble, International Ensemble Modern Academy, Hong Kong New Music Ensemble, Hong Kong Chinese Orchestra, Luxembourg Sinfonietta, and Ensemble Proton Bern.  As the only composer from Hong Kong, FUNG is invited to write a new work for EXPO Milano 2015’s project “Feeding Music.”</w:t>
       </w:r>
     </w:p>
     <w:p>
@@ -2488,7 +2674,6 @@
     <w:p>
       <w:pPr>
         <w:spacing w:after="640"/>
-        <w:jc w:val="right"/>
         <w:rPr>
           <w:rFonts w:ascii="Noto Serif" w:eastAsia="Noto Serif SC" w:hAnsi="Noto Serif" w:cs="Noto Serif"/>
           <w:b/>
@@ -2721,6 +2906,7 @@
         </w:rPr>
         <w:t xml:space="preserve">The traditional Cantonese lion dance is well known for its sophisticated and technical demanding gestures. This composition draws inspiration from this gorgeous tradition, using musical materials to depict various elements in the lion dance. The melodic materials are derived from the Cantonese tune </w:t>
       </w:r>
+      <w:proofErr w:type="spellStart"/>
       <w:r>
         <w:rPr>
           <w:rFonts w:ascii="Noto Serif" w:eastAsia="Noto Serif SC" w:hAnsi="Noto Serif" w:cs="Noto Serif"/>
@@ -2732,6 +2918,7 @@
         </w:rPr>
         <w:t>Singsi</w:t>
       </w:r>
+      <w:proofErr w:type="spellEnd"/>
       <w:r>
         <w:rPr>
           <w:rFonts w:ascii="Noto Serif" w:eastAsia="Noto Serif SC" w:hAnsi="Noto Serif" w:cs="Noto Serif"/>
@@ -2741,6 +2928,7 @@
         </w:rPr>
         <w:t xml:space="preserve"> (literally “Awakening of the Lion/Lion Dance”). The original melody is segmented. Through the traditional Chinese composing technique “slowing down and adding flowers,” and “melodic decoration,” the new materials are constructed. This composition closely follows the structure of a traditional pipa piece. Apart from having </w:t>
       </w:r>
+      <w:proofErr w:type="spellStart"/>
       <w:r>
         <w:rPr>
           <w:rFonts w:ascii="Noto Serif" w:eastAsia="Noto Serif SC" w:hAnsi="Noto Serif" w:cs="Noto Serif"/>
@@ -2752,6 +2940,7 @@
         </w:rPr>
         <w:t>flavours</w:t>
       </w:r>
+      <w:proofErr w:type="spellEnd"/>
       <w:r>
         <w:rPr>
           <w:rFonts w:ascii="Noto Serif" w:eastAsia="Noto Serif SC" w:hAnsi="Noto Serif" w:cs="Noto Serif"/>
@@ -2761,6 +2950,7 @@
         </w:rPr>
         <w:t xml:space="preserve"> from both </w:t>
       </w:r>
+      <w:proofErr w:type="spellStart"/>
       <w:r>
         <w:rPr>
           <w:rFonts w:ascii="Noto Serif" w:eastAsia="Noto Serif SC" w:hAnsi="Noto Serif" w:cs="Noto Serif"/>
@@ -2772,6 +2962,7 @@
         </w:rPr>
         <w:t>wenqu</w:t>
       </w:r>
+      <w:proofErr w:type="spellEnd"/>
       <w:r>
         <w:rPr>
           <w:rFonts w:ascii="Noto Serif" w:eastAsia="Noto Serif SC" w:hAnsi="Noto Serif" w:cs="Noto Serif"/>
@@ -2781,6 +2972,7 @@
         </w:rPr>
         <w:t xml:space="preserve"> and </w:t>
       </w:r>
+      <w:proofErr w:type="spellStart"/>
       <w:r>
         <w:rPr>
           <w:rFonts w:ascii="Noto Serif" w:eastAsia="Noto Serif SC" w:hAnsi="Noto Serif" w:cs="Noto Serif"/>
@@ -2792,6 +2984,7 @@
         </w:rPr>
         <w:t>wuqu</w:t>
       </w:r>
+      <w:proofErr w:type="spellEnd"/>
       <w:r>
         <w:rPr>
           <w:rFonts w:ascii="Noto Serif" w:eastAsia="Noto Serif SC" w:hAnsi="Noto Serif" w:cs="Noto Serif"/>
@@ -2801,6 +2994,7 @@
         </w:rPr>
         <w:t xml:space="preserve">, the musical flow follows a “qi – </w:t>
       </w:r>
+      <w:proofErr w:type="spellStart"/>
       <w:r>
         <w:rPr>
           <w:rFonts w:ascii="Noto Serif" w:eastAsia="Noto Serif SC" w:hAnsi="Noto Serif" w:cs="Noto Serif"/>
@@ -2812,6 +3006,7 @@
         </w:rPr>
         <w:t>cheng</w:t>
       </w:r>
+      <w:proofErr w:type="spellEnd"/>
       <w:r>
         <w:rPr>
           <w:rFonts w:ascii="Noto Serif" w:eastAsia="Noto Serif SC" w:hAnsi="Noto Serif" w:cs="Noto Serif"/>
@@ -2821,6 +3016,7 @@
         </w:rPr>
         <w:t xml:space="preserve">- </w:t>
       </w:r>
+      <w:proofErr w:type="spellStart"/>
       <w:r>
         <w:rPr>
           <w:rFonts w:ascii="Noto Serif" w:eastAsia="Noto Serif SC" w:hAnsi="Noto Serif" w:cs="Noto Serif"/>
@@ -2832,6 +3028,7 @@
         </w:rPr>
         <w:t>zhuan</w:t>
       </w:r>
+      <w:proofErr w:type="spellEnd"/>
       <w:r>
         <w:rPr>
           <w:rFonts w:ascii="Noto Serif" w:eastAsia="Noto Serif SC" w:hAnsi="Noto Serif" w:cs="Noto Serif"/>
@@ -2900,6 +3097,15 @@
       </w:pPr>
       <w:r>
         <w:rPr>
+          <w:rFonts w:ascii="Noto Serif" w:eastAsia="Noto Serif SC" w:hAnsi="Noto Serif" w:cs="Noto Serif"/>
+          <w:sz w:val="24"/>
+          <w:szCs w:val="24"/>
+          <w:lang w:val="en-US"/>
+        </w:rPr>
+        <w:t>2</w:t>
+      </w:r>
+      <w:r>
+        <w:rPr>
           <w:rFonts w:ascii="Noto Serif" w:eastAsia="Noto Serif SC" w:hAnsi="Noto Serif" w:cs="Noto Serif" w:hint="eastAsia"/>
           <w:sz w:val="24"/>
           <w:szCs w:val="24"/>
@@ -2914,136 +3120,160 @@
           <w:szCs w:val="24"/>
           <w:lang w:val="en-US"/>
         </w:rPr>
-        <w:t xml:space="preserve"> I Bangdi I </w:t>
-      </w:r>
-      <w:r>
-        <w:rPr>
-          <w:rFonts w:ascii="Noto Serif" w:eastAsia="Noto Serif SC" w:hAnsi="Noto Serif" w:cs="Noto Serif"/>
-          <w:sz w:val="24"/>
-          <w:szCs w:val="24"/>
-          <w:lang w:val="en-US"/>
-        </w:rPr>
-        <w:t>(</w:t>
-      </w:r>
-      <w:r>
-        <w:rPr>
-          <w:rFonts w:ascii="Noto Serif" w:eastAsia="Noto Serif SC" w:hAnsi="Noto Serif" w:cs="Noto Serif"/>
-          <w:sz w:val="24"/>
-          <w:szCs w:val="24"/>
-          <w:lang w:val="en-US"/>
-        </w:rPr>
-        <w:t>‬C</w:t>
-      </w:r>
-      <w:r>
-        <w:rPr>
-          <w:rFonts w:ascii="Noto Serif" w:eastAsia="Noto Serif SC" w:hAnsi="Noto Serif" w:cs="Noto Serif" w:hint="eastAsia"/>
-          <w:sz w:val="24"/>
-          <w:szCs w:val="24"/>
-          <w:lang w:val="en-US"/>
-        </w:rPr>
-        <w:t>调小笛、</w:t>
-      </w:r>
-      <w:r>
-        <w:rPr>
-          <w:rFonts w:ascii="Noto Serif" w:eastAsia="Noto Serif SC" w:hAnsi="Noto Serif" w:cs="Noto Serif"/>
-          <w:sz w:val="24"/>
-          <w:szCs w:val="24"/>
-          <w:lang w:val="en-US"/>
-        </w:rPr>
-        <w:t>G</w:t>
-      </w:r>
-      <w:r>
-        <w:rPr>
-          <w:rFonts w:ascii="Noto Serif" w:eastAsia="Noto Serif SC" w:hAnsi="Noto Serif" w:cs="Noto Serif" w:hint="eastAsia"/>
-          <w:sz w:val="24"/>
-          <w:szCs w:val="24"/>
-          <w:lang w:val="en-US"/>
-        </w:rPr>
-        <w:t>调梆笛</w:t>
-      </w:r>
-      <w:r>
-        <w:rPr>
-          <w:rFonts w:ascii="Noto Serif" w:eastAsia="Noto Serif SC" w:hAnsi="Noto Serif" w:cs="Noto Serif"/>
-          <w:sz w:val="24"/>
-          <w:szCs w:val="24"/>
-          <w:lang w:val="en-US"/>
-        </w:rPr>
-        <w:t xml:space="preserve"> ; Keyed in C and G)</w:t>
-      </w:r>
-    </w:p>
-    <w:p>
-      <w:pPr>
-        <w:rPr>
-          <w:rFonts w:ascii="Noto Serif" w:eastAsia="Noto Serif SC" w:hAnsi="Noto Serif" w:cs="Noto Serif"/>
-          <w:sz w:val="24"/>
-          <w:szCs w:val="24"/>
-          <w:lang w:val="en-US"/>
-        </w:rPr>
-      </w:pPr>
-      <w:r>
-        <w:rPr>
-          <w:rFonts w:ascii="Noto Serif" w:eastAsia="Noto Serif SC" w:hAnsi="Noto Serif" w:cs="Noto Serif" w:hint="eastAsia"/>
-          <w:sz w:val="24"/>
-          <w:szCs w:val="24"/>
-          <w:lang w:val="en-US"/>
-        </w:rPr>
-        <w:t>梆笛</w:t>
-      </w:r>
-      <w:r>
-        <w:rPr>
-          <w:rFonts w:ascii="Noto Serif" w:eastAsia="Noto Serif SC" w:hAnsi="Noto Serif" w:cs="Noto Serif"/>
-          <w:sz w:val="24"/>
-          <w:szCs w:val="24"/>
-          <w:lang w:val="en-US"/>
-        </w:rPr>
-        <w:t xml:space="preserve"> II Bangdi II </w:t>
-      </w:r>
-      <w:r>
-        <w:rPr>
-          <w:rFonts w:ascii="Noto Serif" w:eastAsia="Noto Serif SC" w:hAnsi="Noto Serif" w:cs="Noto Serif"/>
-          <w:sz w:val="24"/>
-          <w:szCs w:val="24"/>
-          <w:lang w:val="en-US"/>
-        </w:rPr>
-        <w:t>(</w:t>
-      </w:r>
-      <w:r>
-        <w:rPr>
-          <w:rFonts w:ascii="Noto Serif" w:eastAsia="Noto Serif SC" w:hAnsi="Noto Serif" w:cs="Noto Serif"/>
-          <w:sz w:val="24"/>
-          <w:szCs w:val="24"/>
-          <w:lang w:val="en-US"/>
-        </w:rPr>
-        <w:t>G</w:t>
-      </w:r>
-      <w:r>
-        <w:rPr>
-          <w:rFonts w:ascii="Noto Serif" w:eastAsia="Noto Serif SC" w:hAnsi="Noto Serif" w:cs="Noto Serif" w:hint="eastAsia"/>
-          <w:sz w:val="24"/>
-          <w:szCs w:val="24"/>
-          <w:lang w:val="en-US"/>
-        </w:rPr>
-        <w:t>调梆笛</w:t>
-      </w:r>
-      <w:r>
-        <w:rPr>
-          <w:rFonts w:ascii="Noto Serif" w:eastAsia="Noto Serif SC" w:hAnsi="Noto Serif" w:cs="Noto Serif"/>
-          <w:sz w:val="24"/>
-          <w:szCs w:val="24"/>
-          <w:lang w:val="en-US"/>
-        </w:rPr>
-        <w:t xml:space="preserve"> ; Keyed in G)</w:t>
-      </w:r>
-    </w:p>
-    <w:p>
-      <w:pPr>
-        <w:rPr>
-          <w:rFonts w:ascii="Noto Serif" w:eastAsia="Noto Serif SC" w:hAnsi="Noto Serif" w:cs="Noto Serif"/>
-          <w:sz w:val="24"/>
-          <w:szCs w:val="24"/>
-          <w:lang w:val="en-US"/>
-        </w:rPr>
-      </w:pPr>
+        <w:t xml:space="preserve"> </w:t>
+      </w:r>
+      <w:r>
+        <w:rPr>
+          <w:rFonts w:ascii="Noto Serif" w:eastAsia="Noto Serif SC" w:hAnsi="Noto Serif" w:cs="Noto Serif"/>
+          <w:sz w:val="24"/>
+          <w:szCs w:val="24"/>
+          <w:lang w:val="en-US"/>
+        </w:rPr>
+        <w:t xml:space="preserve">2 </w:t>
+      </w:r>
+      <w:proofErr w:type="spellStart"/>
+      <w:r>
+        <w:rPr>
+          <w:rFonts w:ascii="Noto Serif" w:eastAsia="Noto Serif SC" w:hAnsi="Noto Serif" w:cs="Noto Serif"/>
+          <w:sz w:val="24"/>
+          <w:szCs w:val="24"/>
+          <w:lang w:val="en-US"/>
+        </w:rPr>
+        <w:t>Bangdi</w:t>
+      </w:r>
+      <w:proofErr w:type="spellEnd"/>
+      <w:r>
+        <w:rPr>
+          <w:rFonts w:ascii="Noto Serif" w:eastAsia="Noto Serif SC" w:hAnsi="Noto Serif" w:cs="Noto Serif"/>
+          <w:sz w:val="24"/>
+          <w:szCs w:val="24"/>
+          <w:lang w:val="en-US"/>
+        </w:rPr>
+        <w:t>*</w:t>
+      </w:r>
+    </w:p>
+    <w:p>
+      <w:pPr>
+        <w:rPr>
+          <w:rFonts w:ascii="Noto Serif SC" w:eastAsia="Noto Serif SC" w:hAnsi="Noto Serif SC" w:cs="Noto Serif"/>
+          <w:sz w:val="20"/>
+          <w:szCs w:val="20"/>
+          <w:lang w:val="en-US"/>
+        </w:rPr>
+      </w:pPr>
+      <w:r>
+        <w:rPr>
+          <w:rFonts w:ascii="Noto Serif" w:eastAsia="Noto Serif SC" w:hAnsi="Noto Serif" w:cs="Noto Serif"/>
+          <w:sz w:val="20"/>
+          <w:szCs w:val="20"/>
+          <w:lang w:val="en-US"/>
+        </w:rPr>
+        <w:t>*</w:t>
+      </w:r>
+      <w:r>
+        <w:rPr>
+          <w:rFonts w:ascii="Noto Serif SC" w:eastAsia="Noto Serif SC" w:hAnsi="Noto Serif SC" w:cs="Noto Serif"/>
+          <w:sz w:val="20"/>
+          <w:szCs w:val="20"/>
+          <w:lang w:val="en-GB"/>
+        </w:rPr>
+        <w:t>I</w:t>
+      </w:r>
+      <w:r>
+        <w:rPr>
+          <w:rFonts w:ascii="Noto Serif SC" w:eastAsia="Noto Serif SC" w:hAnsi="Noto Serif SC" w:cs="Noto Serif" w:hint="eastAsia"/>
+          <w:sz w:val="20"/>
+          <w:szCs w:val="20"/>
+          <w:lang w:val="en-GB"/>
+        </w:rPr>
+        <w:t>兼奏</w:t>
+      </w:r>
+      <w:r>
+        <w:rPr>
+          <w:rFonts w:ascii="Noto Serif SC" w:eastAsia="Noto Serif SC" w:hAnsi="Noto Serif SC" w:cs="Noto Serif" w:hint="eastAsia"/>
+          <w:sz w:val="20"/>
+          <w:szCs w:val="20"/>
+          <w:lang w:val="en-US"/>
+        </w:rPr>
+        <w:t>小笛</w:t>
+      </w:r>
+      <w:r>
+        <w:rPr>
+          <w:rFonts w:ascii="Noto Serif SC" w:eastAsia="Noto Serif SC" w:hAnsi="Noto Serif SC" w:cs="Noto Serif"/>
+          <w:sz w:val="20"/>
+          <w:szCs w:val="20"/>
+          <w:lang w:val="en-GB"/>
+        </w:rPr>
+        <w:t xml:space="preserve"> </w:t>
+      </w:r>
+      <w:r>
+        <w:rPr>
+          <w:rFonts w:ascii="Noto Serif SC" w:eastAsia="Noto Serif SC" w:hAnsi="Noto Serif SC" w:cs="Noto Serif"/>
+          <w:sz w:val="20"/>
+          <w:szCs w:val="20"/>
+          <w:lang w:val="en-GB"/>
+        </w:rPr>
+        <w:t>*</w:t>
+      </w:r>
+      <w:r>
+        <w:rPr>
+          <w:rFonts w:ascii="Noto Serif SC" w:eastAsia="Noto Serif SC" w:hAnsi="Noto Serif SC" w:cs="Noto Serif"/>
+          <w:sz w:val="20"/>
+          <w:szCs w:val="20"/>
+          <w:lang w:val="en-GB"/>
+        </w:rPr>
+        <w:t xml:space="preserve">I </w:t>
+      </w:r>
+      <w:proofErr w:type="spellStart"/>
+      <w:r>
+        <w:rPr>
+          <w:rFonts w:ascii="Noto Serif SC" w:eastAsia="Noto Serif SC" w:hAnsi="Noto Serif SC" w:cs="Noto Serif"/>
+          <w:sz w:val="20"/>
+          <w:szCs w:val="20"/>
+          <w:lang w:val="en-GB"/>
+        </w:rPr>
+        <w:t>doub</w:t>
+      </w:r>
+      <w:proofErr w:type="spellEnd"/>
+      <w:r>
+        <w:rPr>
+          <w:rFonts w:ascii="Noto Serif SC" w:eastAsia="Noto Serif SC" w:hAnsi="Noto Serif SC" w:cs="Noto Serif"/>
+          <w:sz w:val="20"/>
+          <w:szCs w:val="20"/>
+          <w:lang w:val="en-GB"/>
+        </w:rPr>
+        <w:t xml:space="preserve">. </w:t>
+      </w:r>
+      <w:proofErr w:type="spellStart"/>
+      <w:r>
+        <w:rPr>
+          <w:rFonts w:ascii="Noto Serif SC" w:eastAsia="Noto Serif SC" w:hAnsi="Noto Serif SC" w:cs="Noto Serif"/>
+          <w:sz w:val="20"/>
+          <w:szCs w:val="20"/>
+          <w:lang w:val="en-GB"/>
+        </w:rPr>
+        <w:t>Xiaodi</w:t>
+      </w:r>
+      <w:proofErr w:type="spellEnd"/>
+    </w:p>
+    <w:p>
+      <w:pPr>
+        <w:rPr>
+          <w:rFonts w:ascii="Noto Serif" w:eastAsia="Noto Serif SC" w:hAnsi="Noto Serif" w:cs="Noto Serif"/>
+          <w:sz w:val="24"/>
+          <w:szCs w:val="24"/>
+          <w:lang w:val="en-US"/>
+        </w:rPr>
+      </w:pPr>
+      <w:r>
+        <w:rPr>
+          <w:rFonts w:ascii="Noto Serif" w:eastAsia="Noto Serif SC" w:hAnsi="Noto Serif" w:cs="Noto Serif"/>
+          <w:sz w:val="24"/>
+          <w:szCs w:val="24"/>
+          <w:lang w:val="en-US"/>
+        </w:rPr>
+        <w:t xml:space="preserve">1 </w:t>
+      </w:r>
       <w:r>
         <w:rPr>
           <w:rFonts w:ascii="Noto Serif" w:eastAsia="Noto Serif SC" w:hAnsi="Noto Serif" w:cs="Noto Serif" w:hint="eastAsia"/>
@@ -3060,8 +3290,28 @@
           <w:szCs w:val="24"/>
           <w:lang w:val="en-US"/>
         </w:rPr>
-        <w:t xml:space="preserve"> (Qudi)</w:t>
-      </w:r>
+        <w:t xml:space="preserve"> </w:t>
+      </w:r>
+      <w:r>
+        <w:rPr>
+          <w:rFonts w:ascii="Noto Serif" w:eastAsia="Noto Serif SC" w:hAnsi="Noto Serif" w:cs="Noto Serif"/>
+          <w:sz w:val="24"/>
+          <w:szCs w:val="24"/>
+          <w:lang w:val="en-US"/>
+        </w:rPr>
+        <w:t xml:space="preserve">1 </w:t>
+      </w:r>
+      <w:proofErr w:type="spellStart"/>
+      <w:r>
+        <w:rPr>
+          <w:rFonts w:ascii="Noto Serif" w:eastAsia="Noto Serif SC" w:hAnsi="Noto Serif" w:cs="Noto Serif"/>
+          <w:sz w:val="24"/>
+          <w:szCs w:val="24"/>
+          <w:lang w:val="en-US"/>
+        </w:rPr>
+        <w:t>Qudi</w:t>
+      </w:r>
+      <w:proofErr w:type="spellEnd"/>
     </w:p>
     <w:p>
       <w:pPr>
@@ -3108,6 +3358,7 @@
         </w:rPr>
         <w:t xml:space="preserve">2 </w:t>
       </w:r>
+      <w:proofErr w:type="spellStart"/>
       <w:r>
         <w:rPr>
           <w:rFonts w:ascii="Noto Serif" w:eastAsia="Noto Serif SC" w:hAnsi="Noto Serif" w:cs="Noto Serif"/>
@@ -3117,6 +3368,7 @@
         </w:rPr>
         <w:t>Xindi</w:t>
       </w:r>
+      <w:proofErr w:type="spellEnd"/>
     </w:p>
     <w:p>
       <w:pPr>
@@ -3173,14 +3425,25 @@
         </w:rPr>
         <w:t xml:space="preserve">2 </w:t>
       </w:r>
-      <w:r>
-        <w:rPr>
-          <w:rFonts w:ascii="Noto Serif" w:eastAsia="Noto Serif SC" w:hAnsi="Noto Serif" w:cs="Noto Serif"/>
-          <w:sz w:val="24"/>
-          <w:szCs w:val="24"/>
-          <w:lang w:val="en-US"/>
-        </w:rPr>
-        <w:t>Gaoyin Sheng</w:t>
+      <w:proofErr w:type="spellStart"/>
+      <w:r>
+        <w:rPr>
+          <w:rFonts w:ascii="Noto Serif" w:eastAsia="Noto Serif SC" w:hAnsi="Noto Serif" w:cs="Noto Serif"/>
+          <w:sz w:val="24"/>
+          <w:szCs w:val="24"/>
+          <w:lang w:val="en-US"/>
+        </w:rPr>
+        <w:t>Gaoyin</w:t>
+      </w:r>
+      <w:proofErr w:type="spellEnd"/>
+      <w:r>
+        <w:rPr>
+          <w:rFonts w:ascii="Noto Serif" w:eastAsia="Noto Serif SC" w:hAnsi="Noto Serif" w:cs="Noto Serif"/>
+          <w:sz w:val="24"/>
+          <w:szCs w:val="24"/>
+          <w:lang w:val="en-US"/>
+        </w:rPr>
+        <w:t xml:space="preserve"> Sheng</w:t>
       </w:r>
     </w:p>
     <w:p>
@@ -3228,25 +3491,45 @@
         </w:rPr>
         <w:t xml:space="preserve">2 </w:t>
       </w:r>
-      <w:r>
-        <w:rPr>
-          <w:rFonts w:ascii="Noto Serif" w:eastAsia="Noto Serif SC" w:hAnsi="Noto Serif" w:cs="Noto Serif"/>
-          <w:sz w:val="24"/>
-          <w:szCs w:val="24"/>
-          <w:lang w:val="en-US"/>
-        </w:rPr>
-        <w:t>Zhongyin Sheng</w:t>
-      </w:r>
-    </w:p>
-    <w:p>
-      <w:pPr>
-        <w:rPr>
-          <w:rFonts w:ascii="Noto Serif" w:eastAsia="Noto Serif SC" w:hAnsi="Noto Serif" w:cs="Noto Serif"/>
-          <w:sz w:val="24"/>
-          <w:szCs w:val="24"/>
-          <w:lang w:val="en-US"/>
-        </w:rPr>
-      </w:pPr>
+      <w:proofErr w:type="spellStart"/>
+      <w:r>
+        <w:rPr>
+          <w:rFonts w:ascii="Noto Serif" w:eastAsia="Noto Serif SC" w:hAnsi="Noto Serif" w:cs="Noto Serif"/>
+          <w:sz w:val="24"/>
+          <w:szCs w:val="24"/>
+          <w:lang w:val="en-US"/>
+        </w:rPr>
+        <w:t>Zhongyin</w:t>
+      </w:r>
+      <w:proofErr w:type="spellEnd"/>
+      <w:r>
+        <w:rPr>
+          <w:rFonts w:ascii="Noto Serif" w:eastAsia="Noto Serif SC" w:hAnsi="Noto Serif" w:cs="Noto Serif"/>
+          <w:sz w:val="24"/>
+          <w:szCs w:val="24"/>
+          <w:lang w:val="en-US"/>
+        </w:rPr>
+        <w:t xml:space="preserve"> Sheng</w:t>
+      </w:r>
+    </w:p>
+    <w:p>
+      <w:pPr>
+        <w:rPr>
+          <w:rFonts w:ascii="Noto Serif" w:eastAsia="Noto Serif SC" w:hAnsi="Noto Serif" w:cs="Noto Serif"/>
+          <w:sz w:val="24"/>
+          <w:szCs w:val="24"/>
+          <w:lang w:val="en-US"/>
+        </w:rPr>
+      </w:pPr>
+      <w:r>
+        <w:rPr>
+          <w:rFonts w:ascii="Noto Serif" w:eastAsia="Noto Serif SC" w:hAnsi="Noto Serif" w:cs="Noto Serif"/>
+          <w:sz w:val="24"/>
+          <w:szCs w:val="24"/>
+          <w:lang w:val="en-US"/>
+        </w:rPr>
+        <w:t xml:space="preserve">1 </w:t>
+      </w:r>
       <w:r>
         <w:rPr>
           <w:rFonts w:ascii="Noto Serif" w:eastAsia="Noto Serif SC" w:hAnsi="Noto Serif" w:cs="Noto Serif" w:hint="eastAsia"/>
@@ -3256,6 +3539,35 @@
         </w:rPr>
         <w:t>低音笙</w:t>
       </w:r>
+      <w:r>
+        <w:rPr>
+          <w:rFonts w:ascii="Noto Serif" w:eastAsia="Noto Serif SC" w:hAnsi="Noto Serif" w:cs="Noto Serif"/>
+          <w:sz w:val="24"/>
+          <w:szCs w:val="24"/>
+          <w:lang w:val="en-US"/>
+        </w:rPr>
+        <w:t xml:space="preserve"> 1 </w:t>
+      </w:r>
+      <w:proofErr w:type="spellStart"/>
+      <w:r>
+        <w:rPr>
+          <w:rFonts w:ascii="Noto Serif" w:eastAsia="Noto Serif SC" w:hAnsi="Noto Serif" w:cs="Noto Serif"/>
+          <w:sz w:val="24"/>
+          <w:szCs w:val="24"/>
+          <w:lang w:val="en-US"/>
+        </w:rPr>
+        <w:t>Diyin</w:t>
+      </w:r>
+      <w:proofErr w:type="spellEnd"/>
+      <w:r>
+        <w:rPr>
+          <w:rFonts w:ascii="Noto Serif" w:eastAsia="Noto Serif SC" w:hAnsi="Noto Serif" w:cs="Noto Serif"/>
+          <w:sz w:val="24"/>
+          <w:szCs w:val="24"/>
+          <w:lang w:val="en-US"/>
+        </w:rPr>
+        <w:t xml:space="preserve"> Sheng</w:t>
+      </w:r>
     </w:p>
     <w:p>
       <w:pPr>
@@ -3312,25 +3624,56 @@
         </w:rPr>
         <w:t xml:space="preserve">2 </w:t>
       </w:r>
-      <w:r>
-        <w:rPr>
-          <w:rFonts w:ascii="Noto Serif" w:eastAsia="Noto Serif SC" w:hAnsi="Noto Serif" w:cs="Noto Serif"/>
-          <w:sz w:val="24"/>
-          <w:szCs w:val="24"/>
-          <w:lang w:val="en-US"/>
-        </w:rPr>
-        <w:t>Gaoyin Suona</w:t>
-      </w:r>
-    </w:p>
-    <w:p>
-      <w:pPr>
-        <w:rPr>
-          <w:rFonts w:ascii="Noto Serif" w:eastAsia="Noto Serif SC" w:hAnsi="Noto Serif" w:cs="Noto Serif"/>
-          <w:sz w:val="24"/>
-          <w:szCs w:val="24"/>
-          <w:lang w:val="en-US"/>
-        </w:rPr>
-      </w:pPr>
+      <w:proofErr w:type="spellStart"/>
+      <w:r>
+        <w:rPr>
+          <w:rFonts w:ascii="Noto Serif" w:eastAsia="Noto Serif SC" w:hAnsi="Noto Serif" w:cs="Noto Serif"/>
+          <w:sz w:val="24"/>
+          <w:szCs w:val="24"/>
+          <w:lang w:val="en-US"/>
+        </w:rPr>
+        <w:t>Gaoyin</w:t>
+      </w:r>
+      <w:proofErr w:type="spellEnd"/>
+      <w:r>
+        <w:rPr>
+          <w:rFonts w:ascii="Noto Serif" w:eastAsia="Noto Serif SC" w:hAnsi="Noto Serif" w:cs="Noto Serif"/>
+          <w:sz w:val="24"/>
+          <w:szCs w:val="24"/>
+          <w:lang w:val="en-US"/>
+        </w:rPr>
+        <w:t xml:space="preserve"> </w:t>
+      </w:r>
+      <w:proofErr w:type="spellStart"/>
+      <w:r>
+        <w:rPr>
+          <w:rFonts w:ascii="Noto Serif" w:eastAsia="Noto Serif SC" w:hAnsi="Noto Serif" w:cs="Noto Serif"/>
+          <w:sz w:val="24"/>
+          <w:szCs w:val="24"/>
+          <w:lang w:val="en-US"/>
+        </w:rPr>
+        <w:t>Suona</w:t>
+      </w:r>
+      <w:proofErr w:type="spellEnd"/>
+    </w:p>
+    <w:p>
+      <w:pPr>
+        <w:rPr>
+          <w:rFonts w:ascii="Noto Serif" w:eastAsia="Noto Serif SC" w:hAnsi="Noto Serif" w:cs="Noto Serif"/>
+          <w:sz w:val="24"/>
+          <w:szCs w:val="24"/>
+          <w:lang w:val="en-US"/>
+        </w:rPr>
+      </w:pPr>
+      <w:r>
+        <w:rPr>
+          <w:rFonts w:ascii="Noto Serif" w:eastAsia="Noto Serif SC" w:hAnsi="Noto Serif" w:cs="Noto Serif"/>
+          <w:sz w:val="24"/>
+          <w:szCs w:val="24"/>
+          <w:lang w:val="en-US"/>
+        </w:rPr>
+        <w:t>1</w:t>
+      </w:r>
       <w:r>
         <w:rPr>
           <w:rFonts w:ascii="Noto Serif" w:eastAsia="Noto Serif SC" w:hAnsi="Noto Serif" w:cs="Noto Serif" w:hint="eastAsia"/>
@@ -3347,18 +3690,67 @@
           <w:szCs w:val="24"/>
           <w:lang w:val="en-US"/>
         </w:rPr>
-        <w:t xml:space="preserve"> Zhongyin Suona</w:t>
-      </w:r>
-    </w:p>
-    <w:p>
-      <w:pPr>
-        <w:rPr>
-          <w:rFonts w:ascii="Noto Serif" w:eastAsia="Noto Serif SC" w:hAnsi="Noto Serif" w:cs="Noto Serif"/>
-          <w:sz w:val="24"/>
-          <w:szCs w:val="24"/>
-          <w:lang w:val="en-US"/>
-        </w:rPr>
-      </w:pPr>
+        <w:t xml:space="preserve"> </w:t>
+      </w:r>
+      <w:r>
+        <w:rPr>
+          <w:rFonts w:ascii="Noto Serif" w:eastAsia="Noto Serif SC" w:hAnsi="Noto Serif" w:cs="Noto Serif"/>
+          <w:sz w:val="24"/>
+          <w:szCs w:val="24"/>
+          <w:lang w:val="en-US"/>
+        </w:rPr>
+        <w:t xml:space="preserve">1 </w:t>
+      </w:r>
+      <w:proofErr w:type="spellStart"/>
+      <w:r>
+        <w:rPr>
+          <w:rFonts w:ascii="Noto Serif" w:eastAsia="Noto Serif SC" w:hAnsi="Noto Serif" w:cs="Noto Serif"/>
+          <w:sz w:val="24"/>
+          <w:szCs w:val="24"/>
+          <w:lang w:val="en-US"/>
+        </w:rPr>
+        <w:t>Zhongyin</w:t>
+      </w:r>
+      <w:proofErr w:type="spellEnd"/>
+      <w:r>
+        <w:rPr>
+          <w:rFonts w:ascii="Noto Serif" w:eastAsia="Noto Serif SC" w:hAnsi="Noto Serif" w:cs="Noto Serif"/>
+          <w:sz w:val="24"/>
+          <w:szCs w:val="24"/>
+          <w:lang w:val="en-US"/>
+        </w:rPr>
+        <w:t xml:space="preserve"> </w:t>
+      </w:r>
+      <w:proofErr w:type="spellStart"/>
+      <w:r>
+        <w:rPr>
+          <w:rFonts w:ascii="Noto Serif" w:eastAsia="Noto Serif SC" w:hAnsi="Noto Serif" w:cs="Noto Serif"/>
+          <w:sz w:val="24"/>
+          <w:szCs w:val="24"/>
+          <w:lang w:val="en-US"/>
+        </w:rPr>
+        <w:t>Suona</w:t>
+      </w:r>
+      <w:proofErr w:type="spellEnd"/>
+    </w:p>
+    <w:p>
+      <w:pPr>
+        <w:rPr>
+          <w:rFonts w:ascii="Noto Serif" w:eastAsia="Noto Serif SC" w:hAnsi="Noto Serif" w:cs="Noto Serif"/>
+          <w:sz w:val="24"/>
+          <w:szCs w:val="24"/>
+          <w:lang w:val="en-US"/>
+        </w:rPr>
+      </w:pPr>
+      <w:r>
+        <w:rPr>
+          <w:rFonts w:ascii="Noto Serif" w:eastAsia="Noto Serif SC" w:hAnsi="Noto Serif" w:cs="Noto Serif"/>
+          <w:sz w:val="24"/>
+          <w:szCs w:val="24"/>
+          <w:lang w:val="en-US"/>
+        </w:rPr>
+        <w:t>1</w:t>
+      </w:r>
       <w:r>
         <w:rPr>
           <w:rFonts w:ascii="Noto Serif" w:eastAsia="Noto Serif SC" w:hAnsi="Noto Serif" w:cs="Noto Serif" w:hint="eastAsia"/>
@@ -3375,8 +3767,48 @@
           <w:szCs w:val="24"/>
           <w:lang w:val="en-US"/>
         </w:rPr>
-        <w:t xml:space="preserve"> Diyin Suona</w:t>
-      </w:r>
+        <w:t xml:space="preserve"> </w:t>
+      </w:r>
+      <w:r>
+        <w:rPr>
+          <w:rFonts w:ascii="Noto Serif" w:eastAsia="Noto Serif SC" w:hAnsi="Noto Serif" w:cs="Noto Serif"/>
+          <w:sz w:val="24"/>
+          <w:szCs w:val="24"/>
+          <w:lang w:val="en-US"/>
+        </w:rPr>
+        <w:t xml:space="preserve">1 </w:t>
+      </w:r>
+      <w:proofErr w:type="spellStart"/>
+      <w:r>
+        <w:rPr>
+          <w:rFonts w:ascii="Noto Serif" w:eastAsia="Noto Serif SC" w:hAnsi="Noto Serif" w:cs="Noto Serif"/>
+          <w:sz w:val="24"/>
+          <w:szCs w:val="24"/>
+          <w:lang w:val="en-US"/>
+        </w:rPr>
+        <w:t>Diyin</w:t>
+      </w:r>
+      <w:proofErr w:type="spellEnd"/>
+      <w:r>
+        <w:rPr>
+          <w:rFonts w:ascii="Noto Serif" w:eastAsia="Noto Serif SC" w:hAnsi="Noto Serif" w:cs="Noto Serif"/>
+          <w:sz w:val="24"/>
+          <w:szCs w:val="24"/>
+          <w:lang w:val="en-US"/>
+        </w:rPr>
+        <w:t xml:space="preserve"> </w:t>
+      </w:r>
+      <w:proofErr w:type="spellStart"/>
+      <w:r>
+        <w:rPr>
+          <w:rFonts w:ascii="Noto Serif" w:eastAsia="Noto Serif SC" w:hAnsi="Noto Serif" w:cs="Noto Serif"/>
+          <w:sz w:val="24"/>
+          <w:szCs w:val="24"/>
+          <w:lang w:val="en-US"/>
+        </w:rPr>
+        <w:t>Suona</w:t>
+      </w:r>
+      <w:proofErr w:type="spellEnd"/>
     </w:p>
     <w:p>
       <w:pPr>
@@ -3399,11 +3831,20 @@
       </w:pPr>
       <w:r>
         <w:rPr>
-          <w:rFonts w:ascii="Noto Serif" w:eastAsia="Noto Serif SC" w:hAnsi="Noto Serif" w:cs="Noto Serif" w:hint="eastAsia"/>
+          <w:rFonts w:ascii="Noto Serif" w:eastAsia="Noto Serif SC" w:hAnsi="Noto Serif" w:cs="Noto Serif"/>
           <w:sz w:val="24"/>
           <w:szCs w:val="24"/>
           <w:lang w:val="en-GB"/>
         </w:rPr>
+        <w:t>1</w:t>
+      </w:r>
+      <w:r>
+        <w:rPr>
+          <w:rFonts w:ascii="Noto Serif" w:eastAsia="Noto Serif SC" w:hAnsi="Noto Serif" w:cs="Noto Serif" w:hint="eastAsia"/>
+          <w:sz w:val="24"/>
+          <w:szCs w:val="24"/>
+          <w:lang w:val="en-GB"/>
+        </w:rPr>
         <w:t>中音加键管</w:t>
       </w:r>
       <w:r>
@@ -3413,25 +3854,63 @@
           <w:szCs w:val="24"/>
           <w:lang w:val="en-GB"/>
         </w:rPr>
-        <w:t xml:space="preserve"> Zhongyin Jiajian Guan</w:t>
-      </w:r>
-    </w:p>
-    <w:p>
-      <w:pPr>
+        <w:t xml:space="preserve"> </w:t>
+      </w:r>
+      <w:r>
         <w:rPr>
           <w:rFonts w:ascii="Noto Serif" w:eastAsia="Noto Serif SC" w:hAnsi="Noto Serif" w:cs="Noto Serif"/>
           <w:sz w:val="24"/>
           <w:szCs w:val="24"/>
           <w:lang w:val="en-GB"/>
         </w:rPr>
-      </w:pPr>
-      <w:r>
-        <w:rPr>
-          <w:rFonts w:ascii="Noto Serif" w:eastAsia="Noto Serif SC" w:hAnsi="Noto Serif" w:cs="Noto Serif" w:hint="eastAsia"/>
+        <w:t xml:space="preserve">1 Keyed </w:t>
+      </w:r>
+      <w:proofErr w:type="spellStart"/>
+      <w:r>
+        <w:rPr>
+          <w:rFonts w:ascii="Noto Serif" w:eastAsia="Noto Serif SC" w:hAnsi="Noto Serif" w:cs="Noto Serif"/>
           <w:sz w:val="24"/>
           <w:szCs w:val="24"/>
           <w:lang w:val="en-GB"/>
         </w:rPr>
+        <w:t>Zhongyin</w:t>
+      </w:r>
+      <w:proofErr w:type="spellEnd"/>
+      <w:r>
+        <w:rPr>
+          <w:rFonts w:ascii="Noto Serif" w:eastAsia="Noto Serif SC" w:hAnsi="Noto Serif" w:cs="Noto Serif"/>
+          <w:sz w:val="24"/>
+          <w:szCs w:val="24"/>
+          <w:lang w:val="en-GB"/>
+        </w:rPr>
+        <w:t xml:space="preserve"> Guan</w:t>
+      </w:r>
+    </w:p>
+    <w:p>
+      <w:pPr>
+        <w:rPr>
+          <w:rFonts w:ascii="Noto Serif" w:eastAsia="Noto Serif SC" w:hAnsi="Noto Serif" w:cs="Noto Serif"/>
+          <w:sz w:val="24"/>
+          <w:szCs w:val="24"/>
+          <w:lang w:val="en-GB"/>
+        </w:rPr>
+      </w:pPr>
+      <w:r>
+        <w:rPr>
+          <w:rFonts w:ascii="Noto Serif" w:eastAsia="Noto Serif SC" w:hAnsi="Noto Serif" w:cs="Noto Serif"/>
+          <w:sz w:val="24"/>
+          <w:szCs w:val="24"/>
+          <w:lang w:val="en-GB"/>
+        </w:rPr>
+        <w:t>1</w:t>
+      </w:r>
+      <w:r>
+        <w:rPr>
+          <w:rFonts w:ascii="Noto Serif" w:eastAsia="Noto Serif SC" w:hAnsi="Noto Serif" w:cs="Noto Serif" w:hint="eastAsia"/>
+          <w:sz w:val="24"/>
+          <w:szCs w:val="24"/>
+          <w:lang w:val="en-GB"/>
+        </w:rPr>
         <w:t>低音加键管</w:t>
       </w:r>
       <w:r>
@@ -3441,25 +3920,63 @@
           <w:szCs w:val="24"/>
           <w:lang w:val="en-GB"/>
         </w:rPr>
-        <w:t xml:space="preserve"> Diyin Jiajian Guan</w:t>
-      </w:r>
-    </w:p>
-    <w:p>
-      <w:pPr>
-        <w:rPr>
-          <w:rFonts w:ascii="Noto Serif" w:eastAsia="Noto Serif SC" w:hAnsi="Noto Serif" w:cs="Noto Serif"/>
-          <w:sz w:val="24"/>
-          <w:szCs w:val="24"/>
-          <w:lang w:val="en-US"/>
-        </w:rPr>
-      </w:pPr>
-      <w:r>
-        <w:rPr>
-          <w:rFonts w:ascii="Noto Serif" w:eastAsia="Noto Serif SC" w:hAnsi="Noto Serif" w:cs="Noto Serif" w:hint="eastAsia"/>
+        <w:t xml:space="preserve"> </w:t>
+      </w:r>
+      <w:r>
+        <w:rPr>
+          <w:rFonts w:ascii="Noto Serif" w:eastAsia="Noto Serif SC" w:hAnsi="Noto Serif" w:cs="Noto Serif"/>
           <w:sz w:val="24"/>
           <w:szCs w:val="24"/>
           <w:lang w:val="en-GB"/>
         </w:rPr>
+        <w:t xml:space="preserve">1 Keyed </w:t>
+      </w:r>
+      <w:proofErr w:type="spellStart"/>
+      <w:r>
+        <w:rPr>
+          <w:rFonts w:ascii="Noto Serif" w:eastAsia="Noto Serif SC" w:hAnsi="Noto Serif" w:cs="Noto Serif"/>
+          <w:sz w:val="24"/>
+          <w:szCs w:val="24"/>
+          <w:lang w:val="en-GB"/>
+        </w:rPr>
+        <w:t>Diyin</w:t>
+      </w:r>
+      <w:proofErr w:type="spellEnd"/>
+      <w:r>
+        <w:rPr>
+          <w:rFonts w:ascii="Noto Serif" w:eastAsia="Noto Serif SC" w:hAnsi="Noto Serif" w:cs="Noto Serif"/>
+          <w:sz w:val="24"/>
+          <w:szCs w:val="24"/>
+          <w:lang w:val="en-GB"/>
+        </w:rPr>
+        <w:t xml:space="preserve"> Guan</w:t>
+      </w:r>
+    </w:p>
+    <w:p>
+      <w:pPr>
+        <w:rPr>
+          <w:rFonts w:ascii="Noto Serif" w:eastAsia="Noto Serif SC" w:hAnsi="Noto Serif" w:cs="Noto Serif"/>
+          <w:sz w:val="24"/>
+          <w:szCs w:val="24"/>
+          <w:lang w:val="en-US"/>
+        </w:rPr>
+      </w:pPr>
+      <w:r>
+        <w:rPr>
+          <w:rFonts w:ascii="Noto Serif" w:eastAsia="Noto Serif SC" w:hAnsi="Noto Serif" w:cs="Noto Serif"/>
+          <w:sz w:val="24"/>
+          <w:szCs w:val="24"/>
+          <w:lang w:val="en-GB"/>
+        </w:rPr>
+        <w:t>1</w:t>
+      </w:r>
+      <w:r>
+        <w:rPr>
+          <w:rFonts w:ascii="Noto Serif" w:eastAsia="Noto Serif SC" w:hAnsi="Noto Serif" w:cs="Noto Serif" w:hint="eastAsia"/>
+          <w:sz w:val="24"/>
+          <w:szCs w:val="24"/>
+          <w:lang w:val="en-GB"/>
+        </w:rPr>
         <w:t>倍低音加键管</w:t>
       </w:r>
       <w:r>
@@ -3469,7 +3986,54 @@
           <w:szCs w:val="24"/>
           <w:lang w:val="en-GB"/>
         </w:rPr>
-        <w:t xml:space="preserve"> Bei Diyin Jiajian Guan</w:t>
+        <w:t xml:space="preserve"> </w:t>
+      </w:r>
+      <w:r>
+        <w:rPr>
+          <w:rFonts w:ascii="Noto Serif" w:eastAsia="Noto Serif SC" w:hAnsi="Noto Serif" w:cs="Noto Serif"/>
+          <w:sz w:val="24"/>
+          <w:szCs w:val="24"/>
+          <w:lang w:val="en-GB"/>
+        </w:rPr>
+        <w:t xml:space="preserve">1 Keyed </w:t>
+      </w:r>
+      <w:proofErr w:type="spellStart"/>
+      <w:r>
+        <w:rPr>
+          <w:rFonts w:ascii="Noto Serif" w:eastAsia="Noto Serif SC" w:hAnsi="Noto Serif" w:cs="Noto Serif"/>
+          <w:sz w:val="24"/>
+          <w:szCs w:val="24"/>
+          <w:lang w:val="en-GB"/>
+        </w:rPr>
+        <w:t>Bei</w:t>
+      </w:r>
+      <w:r>
+        <w:rPr>
+          <w:rFonts w:ascii="Noto Serif" w:eastAsia="Noto Serif SC" w:hAnsi="Noto Serif" w:cs="Noto Serif"/>
+          <w:sz w:val="24"/>
+          <w:szCs w:val="24"/>
+          <w:lang w:val="en-GB"/>
+        </w:rPr>
+        <w:t>d</w:t>
+      </w:r>
+      <w:r>
+        <w:rPr>
+          <w:rFonts w:ascii="Noto Serif" w:eastAsia="Noto Serif SC" w:hAnsi="Noto Serif" w:cs="Noto Serif"/>
+          <w:sz w:val="24"/>
+          <w:szCs w:val="24"/>
+          <w:lang w:val="en-GB"/>
+        </w:rPr>
+        <w:t>iyin</w:t>
+      </w:r>
+      <w:proofErr w:type="spellEnd"/>
+      <w:r>
+        <w:rPr>
+          <w:rFonts w:ascii="Noto Serif" w:eastAsia="Noto Serif SC" w:hAnsi="Noto Serif" w:cs="Noto Serif"/>
+          <w:sz w:val="24"/>
+          <w:szCs w:val="24"/>
+          <w:lang w:val="en-GB"/>
+        </w:rPr>
+        <w:t xml:space="preserve"> Guan</w:t>
       </w:r>
     </w:p>
     <w:p>
@@ -3637,6 +4201,7 @@
         </w:rPr>
         <w:t xml:space="preserve">2 </w:t>
       </w:r>
+      <w:proofErr w:type="spellStart"/>
       <w:r>
         <w:rPr>
           <w:rFonts w:ascii="Noto Serif" w:eastAsia="Noto Serif SC" w:hAnsi="Noto Serif" w:cs="Noto Serif"/>
@@ -3644,7 +4209,17 @@
           <w:szCs w:val="24"/>
           <w:lang w:val="en-GB"/>
         </w:rPr>
-        <w:t>Gaoyin Ruan</w:t>
+        <w:t>Gaoyin</w:t>
+      </w:r>
+      <w:proofErr w:type="spellEnd"/>
+      <w:r>
+        <w:rPr>
+          <w:rFonts w:ascii="Noto Serif" w:eastAsia="Noto Serif SC" w:hAnsi="Noto Serif" w:cs="Noto Serif"/>
+          <w:sz w:val="24"/>
+          <w:szCs w:val="24"/>
+          <w:lang w:val="en-GB"/>
+        </w:rPr>
+        <w:t xml:space="preserve"> Ruan</w:t>
       </w:r>
     </w:p>
     <w:p>
@@ -3918,7 +4493,25 @@
           <w:sz w:val="21"/>
           <w:szCs w:val="21"/>
         </w:rPr>
-        <w:t xml:space="preserve"> Fengluo, </w:t>
+        <w:t xml:space="preserve"> </w:t>
+      </w:r>
+      <w:proofErr w:type="spellStart"/>
+      <w:r>
+        <w:rPr>
+          <w:rFonts w:ascii="Noto Serif" w:eastAsia="Noto Serif SC" w:hAnsi="Noto Serif" w:cs="Noto Serif"/>
+          <w:sz w:val="21"/>
+          <w:szCs w:val="21"/>
+        </w:rPr>
+        <w:t>Fengluo</w:t>
+      </w:r>
+      <w:proofErr w:type="spellEnd"/>
+      <w:r>
+        <w:rPr>
+          <w:rFonts w:ascii="Noto Serif" w:eastAsia="Noto Serif SC" w:hAnsi="Noto Serif" w:cs="Noto Serif"/>
+          <w:sz w:val="21"/>
+          <w:szCs w:val="21"/>
+        </w:rPr>
+        <w:t xml:space="preserve">, </w:t>
       </w:r>
       <w:r>
         <w:rPr>
@@ -4037,7 +4630,25 @@
           <w:sz w:val="21"/>
           <w:szCs w:val="21"/>
         </w:rPr>
-        <w:t xml:space="preserve"> Da Tanggu, </w:t>
+        <w:t xml:space="preserve"> Da </w:t>
+      </w:r>
+      <w:proofErr w:type="spellStart"/>
+      <w:r>
+        <w:rPr>
+          <w:rFonts w:ascii="Noto Serif" w:eastAsia="Noto Serif SC" w:hAnsi="Noto Serif" w:cs="Noto Serif"/>
+          <w:sz w:val="21"/>
+          <w:szCs w:val="21"/>
+        </w:rPr>
+        <w:t>Tanggu</w:t>
+      </w:r>
+      <w:proofErr w:type="spellEnd"/>
+      <w:r>
+        <w:rPr>
+          <w:rFonts w:ascii="Noto Serif" w:eastAsia="Noto Serif SC" w:hAnsi="Noto Serif" w:cs="Noto Serif"/>
+          <w:sz w:val="21"/>
+          <w:szCs w:val="21"/>
+        </w:rPr>
+        <w:t xml:space="preserve">, </w:t>
       </w:r>
       <w:r>
         <w:rPr>
@@ -4137,7 +4748,25 @@
           <w:sz w:val="21"/>
           <w:szCs w:val="21"/>
         </w:rPr>
-        <w:t xml:space="preserve"> Da Tanggu, </w:t>
+        <w:t xml:space="preserve"> Da </w:t>
+      </w:r>
+      <w:proofErr w:type="spellStart"/>
+      <w:r>
+        <w:rPr>
+          <w:rFonts w:ascii="Noto Serif" w:eastAsia="Noto Serif SC" w:hAnsi="Noto Serif" w:cs="Noto Serif"/>
+          <w:sz w:val="21"/>
+          <w:szCs w:val="21"/>
+        </w:rPr>
+        <w:t>Tanggu</w:t>
+      </w:r>
+      <w:proofErr w:type="spellEnd"/>
+      <w:r>
+        <w:rPr>
+          <w:rFonts w:ascii="Noto Serif" w:eastAsia="Noto Serif SC" w:hAnsi="Noto Serif" w:cs="Noto Serif"/>
+          <w:sz w:val="21"/>
+          <w:szCs w:val="21"/>
+        </w:rPr>
+        <w:t xml:space="preserve">, </w:t>
       </w:r>
       <w:r>
         <w:rPr>
@@ -4153,8 +4782,18 @@
           <w:sz w:val="21"/>
           <w:szCs w:val="21"/>
         </w:rPr>
-        <w:t xml:space="preserve"> Xiao Tanggu</w:t>
-      </w:r>
+        <w:t xml:space="preserve"> Xiao </w:t>
+      </w:r>
+      <w:proofErr w:type="spellStart"/>
+      <w:r>
+        <w:rPr>
+          <w:rFonts w:ascii="Noto Serif" w:eastAsia="Noto Serif SC" w:hAnsi="Noto Serif" w:cs="Noto Serif"/>
+          <w:sz w:val="21"/>
+          <w:szCs w:val="21"/>
+        </w:rPr>
+        <w:t>Tanggu</w:t>
+      </w:r>
+      <w:proofErr w:type="spellEnd"/>
     </w:p>
     <w:p>
       <w:pPr>
@@ -4246,7 +4885,25 @@
           <w:sz w:val="21"/>
           <w:szCs w:val="21"/>
         </w:rPr>
-        <w:t xml:space="preserve"> Shibo, </w:t>
+        <w:t xml:space="preserve"> </w:t>
+      </w:r>
+      <w:proofErr w:type="spellStart"/>
+      <w:r>
+        <w:rPr>
+          <w:rFonts w:ascii="Noto Serif" w:eastAsia="Noto Serif SC" w:hAnsi="Noto Serif" w:cs="Noto Serif"/>
+          <w:sz w:val="21"/>
+          <w:szCs w:val="21"/>
+        </w:rPr>
+        <w:t>Shibo</w:t>
+      </w:r>
+      <w:proofErr w:type="spellEnd"/>
+      <w:r>
+        <w:rPr>
+          <w:rFonts w:ascii="Noto Serif" w:eastAsia="Noto Serif SC" w:hAnsi="Noto Serif" w:cs="Noto Serif"/>
+          <w:sz w:val="21"/>
+          <w:szCs w:val="21"/>
+        </w:rPr>
+        <w:t xml:space="preserve">, </w:t>
       </w:r>
       <w:r>
         <w:rPr>
@@ -4278,8 +4935,18 @@
           <w:sz w:val="21"/>
           <w:szCs w:val="21"/>
         </w:rPr>
-        <w:t xml:space="preserve"> Woodchimes</w:t>
-      </w:r>
+        <w:t xml:space="preserve"> </w:t>
+      </w:r>
+      <w:proofErr w:type="spellStart"/>
+      <w:r>
+        <w:rPr>
+          <w:rFonts w:ascii="Noto Serif" w:eastAsia="Noto Serif SC" w:hAnsi="Noto Serif" w:cs="Noto Serif"/>
+          <w:sz w:val="21"/>
+          <w:szCs w:val="21"/>
+        </w:rPr>
+        <w:t>Woodchimes</w:t>
+      </w:r>
+      <w:proofErr w:type="spellEnd"/>
     </w:p>
     <w:p>
       <w:pPr>
@@ -4314,7 +4981,43 @@
           <w:sz w:val="21"/>
           <w:szCs w:val="21"/>
         </w:rPr>
-        <w:t xml:space="preserve"> Diyin Jungu, </w:t>
+        <w:t xml:space="preserve"> </w:t>
+      </w:r>
+      <w:proofErr w:type="spellStart"/>
+      <w:r>
+        <w:rPr>
+          <w:rFonts w:ascii="Noto Serif" w:eastAsia="Noto Serif SC" w:hAnsi="Noto Serif" w:cs="Noto Serif"/>
+          <w:sz w:val="21"/>
+          <w:szCs w:val="21"/>
+        </w:rPr>
+        <w:t>Diyin</w:t>
+      </w:r>
+      <w:proofErr w:type="spellEnd"/>
+      <w:r>
+        <w:rPr>
+          <w:rFonts w:ascii="Noto Serif" w:eastAsia="Noto Serif SC" w:hAnsi="Noto Serif" w:cs="Noto Serif"/>
+          <w:sz w:val="21"/>
+          <w:szCs w:val="21"/>
+        </w:rPr>
+        <w:t xml:space="preserve"> </w:t>
+      </w:r>
+      <w:proofErr w:type="spellStart"/>
+      <w:r>
+        <w:rPr>
+          <w:rFonts w:ascii="Noto Serif" w:eastAsia="Noto Serif SC" w:hAnsi="Noto Serif" w:cs="Noto Serif"/>
+          <w:sz w:val="21"/>
+          <w:szCs w:val="21"/>
+        </w:rPr>
+        <w:t>Jungu</w:t>
+      </w:r>
+      <w:proofErr w:type="spellEnd"/>
+      <w:r>
+        <w:rPr>
+          <w:rFonts w:ascii="Noto Serif" w:eastAsia="Noto Serif SC" w:hAnsi="Noto Serif" w:cs="Noto Serif"/>
+          <w:sz w:val="21"/>
+          <w:szCs w:val="21"/>
+        </w:rPr>
+        <w:t xml:space="preserve">, </w:t>
       </w:r>
       <w:r>
         <w:rPr>
@@ -4330,7 +5033,25 @@
           <w:sz w:val="21"/>
           <w:szCs w:val="21"/>
         </w:rPr>
-        <w:t xml:space="preserve"> Shibo, </w:t>
+        <w:t xml:space="preserve"> </w:t>
+      </w:r>
+      <w:proofErr w:type="spellStart"/>
+      <w:r>
+        <w:rPr>
+          <w:rFonts w:ascii="Noto Serif" w:eastAsia="Noto Serif SC" w:hAnsi="Noto Serif" w:cs="Noto Serif"/>
+          <w:sz w:val="21"/>
+          <w:szCs w:val="21"/>
+        </w:rPr>
+        <w:t>Shibo</w:t>
+      </w:r>
+      <w:proofErr w:type="spellEnd"/>
+      <w:r>
+        <w:rPr>
+          <w:rFonts w:ascii="Noto Serif" w:eastAsia="Noto Serif SC" w:hAnsi="Noto Serif" w:cs="Noto Serif"/>
+          <w:sz w:val="21"/>
+          <w:szCs w:val="21"/>
+        </w:rPr>
+        <w:t xml:space="preserve">, </w:t>
       </w:r>
       <w:r>
         <w:rPr>
@@ -4362,7 +5083,25 @@
           <w:sz w:val="21"/>
           <w:szCs w:val="21"/>
         </w:rPr>
-        <w:t xml:space="preserve"> Shibo, </w:t>
+        <w:t xml:space="preserve"> </w:t>
+      </w:r>
+      <w:proofErr w:type="spellStart"/>
+      <w:r>
+        <w:rPr>
+          <w:rFonts w:ascii="Noto Serif" w:eastAsia="Noto Serif SC" w:hAnsi="Noto Serif" w:cs="Noto Serif"/>
+          <w:sz w:val="21"/>
+          <w:szCs w:val="21"/>
+        </w:rPr>
+        <w:t>Shibo</w:t>
+      </w:r>
+      <w:proofErr w:type="spellEnd"/>
+      <w:r>
+        <w:rPr>
+          <w:rFonts w:ascii="Noto Serif" w:eastAsia="Noto Serif SC" w:hAnsi="Noto Serif" w:cs="Noto Serif"/>
+          <w:sz w:val="21"/>
+          <w:szCs w:val="21"/>
+        </w:rPr>
+        <w:t xml:space="preserve">, </w:t>
       </w:r>
       <w:r>
         <w:rPr>
@@ -4378,8 +5117,18 @@
           <w:sz w:val="21"/>
           <w:szCs w:val="21"/>
         </w:rPr>
-        <w:t xml:space="preserve"> Junbo</w:t>
-      </w:r>
+        <w:t xml:space="preserve"> </w:t>
+      </w:r>
+      <w:proofErr w:type="spellStart"/>
+      <w:r>
+        <w:rPr>
+          <w:rFonts w:ascii="Noto Serif" w:eastAsia="Noto Serif SC" w:hAnsi="Noto Serif" w:cs="Noto Serif"/>
+          <w:sz w:val="21"/>
+          <w:szCs w:val="21"/>
+        </w:rPr>
+        <w:t>Junbo</w:t>
+      </w:r>
+      <w:proofErr w:type="spellEnd"/>
     </w:p>
     <w:p>
       <w:pPr>
@@ -4455,7 +5204,43 @@
           <w:sz w:val="21"/>
           <w:szCs w:val="21"/>
         </w:rPr>
-        <w:t xml:space="preserve"> Diyin Daluo, </w:t>
+        <w:t xml:space="preserve"> </w:t>
+      </w:r>
+      <w:proofErr w:type="spellStart"/>
+      <w:r>
+        <w:rPr>
+          <w:rFonts w:ascii="Noto Serif" w:eastAsia="Noto Serif SC" w:hAnsi="Noto Serif" w:cs="Noto Serif"/>
+          <w:sz w:val="21"/>
+          <w:szCs w:val="21"/>
+        </w:rPr>
+        <w:t>Diyin</w:t>
+      </w:r>
+      <w:proofErr w:type="spellEnd"/>
+      <w:r>
+        <w:rPr>
+          <w:rFonts w:ascii="Noto Serif" w:eastAsia="Noto Serif SC" w:hAnsi="Noto Serif" w:cs="Noto Serif"/>
+          <w:sz w:val="21"/>
+          <w:szCs w:val="21"/>
+        </w:rPr>
+        <w:t xml:space="preserve"> </w:t>
+      </w:r>
+      <w:proofErr w:type="spellStart"/>
+      <w:r>
+        <w:rPr>
+          <w:rFonts w:ascii="Noto Serif" w:eastAsia="Noto Serif SC" w:hAnsi="Noto Serif" w:cs="Noto Serif"/>
+          <w:sz w:val="21"/>
+          <w:szCs w:val="21"/>
+        </w:rPr>
+        <w:t>Daluo</w:t>
+      </w:r>
+      <w:proofErr w:type="spellEnd"/>
+      <w:r>
+        <w:rPr>
+          <w:rFonts w:ascii="Noto Serif" w:eastAsia="Noto Serif SC" w:hAnsi="Noto Serif" w:cs="Noto Serif"/>
+          <w:sz w:val="21"/>
+          <w:szCs w:val="21"/>
+        </w:rPr>
+        <w:t xml:space="preserve">, </w:t>
       </w:r>
       <w:r>
         <w:rPr>
@@ -4471,7 +5256,25 @@
           <w:sz w:val="21"/>
           <w:szCs w:val="21"/>
         </w:rPr>
-        <w:t xml:space="preserve"> Gao Bianluo, </w:t>
+        <w:t xml:space="preserve"> Gao </w:t>
+      </w:r>
+      <w:proofErr w:type="spellStart"/>
+      <w:r>
+        <w:rPr>
+          <w:rFonts w:ascii="Noto Serif" w:eastAsia="Noto Serif SC" w:hAnsi="Noto Serif" w:cs="Noto Serif"/>
+          <w:sz w:val="21"/>
+          <w:szCs w:val="21"/>
+        </w:rPr>
+        <w:t>Bianluo</w:t>
+      </w:r>
+      <w:proofErr w:type="spellEnd"/>
+      <w:r>
+        <w:rPr>
+          <w:rFonts w:ascii="Noto Serif" w:eastAsia="Noto Serif SC" w:hAnsi="Noto Serif" w:cs="Noto Serif"/>
+          <w:sz w:val="21"/>
+          <w:szCs w:val="21"/>
+        </w:rPr>
+        <w:t xml:space="preserve">, </w:t>
       </w:r>
       <w:r>
         <w:rPr>
@@ -4487,53 +5290,33 @@
           <w:sz w:val="21"/>
           <w:szCs w:val="21"/>
         </w:rPr>
-        <w:t xml:space="preserve"> Diyin Qing</w:t>
-      </w:r>
-      <w:r>
-        <w:rPr>
-          <w:rFonts w:ascii="Noto Serif" w:eastAsia="Noto Serif SC" w:hAnsi="Noto Serif" w:cs="Noto Serif"/>
-          <w:sz w:val="21"/>
-          <w:szCs w:val="21"/>
-        </w:rPr>
         <w:t xml:space="preserve"> </w:t>
       </w:r>
-    </w:p>
-    <w:p>
-      <w:pPr>
-        <w:rPr>
-          <w:rFonts w:ascii="Noto Serif" w:eastAsia="Noto Serif SC" w:hAnsi="Noto Serif" w:cs="Noto Serif"/>
-          <w:sz w:val="24"/>
-          <w:szCs w:val="24"/>
-          <w:lang w:val="en-US"/>
-        </w:rPr>
-      </w:pPr>
-    </w:p>
-    <w:p>
-      <w:pPr>
-        <w:rPr>
-          <w:rFonts w:ascii="Noto Serif" w:eastAsia="Noto Serif SC" w:hAnsi="Noto Serif" w:cs="Noto Serif"/>
-          <w:sz w:val="24"/>
-          <w:szCs w:val="24"/>
-          <w:lang w:val="en-US"/>
-        </w:rPr>
-      </w:pPr>
-      <w:r>
-        <w:rPr>
-          <w:rFonts w:ascii="Noto Serif" w:eastAsia="Noto Serif SC" w:hAnsi="Noto Serif" w:cs="Noto Serif" w:hint="eastAsia"/>
-          <w:sz w:val="24"/>
-          <w:szCs w:val="24"/>
-          <w:lang w:val="en-US"/>
-        </w:rPr>
-        <w:t>竖琴</w:t>
-      </w:r>
-      <w:r>
-        <w:rPr>
-          <w:rFonts w:ascii="Noto Serif" w:eastAsia="Noto Serif SC" w:hAnsi="Noto Serif" w:cs="Noto Serif"/>
-          <w:sz w:val="24"/>
-          <w:szCs w:val="24"/>
-          <w:lang w:val="en-US"/>
-        </w:rPr>
-        <w:t xml:space="preserve"> Harp</w:t>
+      <w:proofErr w:type="spellStart"/>
+      <w:r>
+        <w:rPr>
+          <w:rFonts w:ascii="Noto Serif" w:eastAsia="Noto Serif SC" w:hAnsi="Noto Serif" w:cs="Noto Serif"/>
+          <w:sz w:val="21"/>
+          <w:szCs w:val="21"/>
+        </w:rPr>
+        <w:t>Diyin</w:t>
+      </w:r>
+      <w:proofErr w:type="spellEnd"/>
+      <w:r>
+        <w:rPr>
+          <w:rFonts w:ascii="Noto Serif" w:eastAsia="Noto Serif SC" w:hAnsi="Noto Serif" w:cs="Noto Serif"/>
+          <w:sz w:val="21"/>
+          <w:szCs w:val="21"/>
+        </w:rPr>
+        <w:t xml:space="preserve"> Qing</w:t>
+      </w:r>
+      <w:r>
+        <w:rPr>
+          <w:rFonts w:ascii="Noto Serif" w:eastAsia="Noto Serif SC" w:hAnsi="Noto Serif" w:cs="Noto Serif"/>
+          <w:sz w:val="21"/>
+          <w:szCs w:val="21"/>
+        </w:rPr>
+        <w:t xml:space="preserve"> </w:t>
       </w:r>
     </w:p>
     <w:p>

</xml_diff>